<commit_message>
More cleanup. Fix AMT and Small Business calculation.
</commit_message>
<xml_diff>
--- a/Documentation/AboutTaxPlanningTools.docx
+++ b/Documentation/AboutTaxPlanningTools.docx
@@ -39,7 +39,7 @@
           <w:rPr>
             <w:noProof/>
           </w:rPr>
-          <w:t>June 3, 2026</w:t>
+          <w:t>June 5, 2026</w:t>
         </w:r>
       </w:fldSimple>
     </w:p>
@@ -116,7 +116,13 @@
         <w:pStyle w:val="Body-Text-tight025"/>
       </w:pPr>
       <w:r>
-        <w:t>Estimated Tax Calculator (federal)</w:t>
+        <w:t>Estimated Tax Calculator (</w:t>
+      </w:r>
+      <w:r>
+        <w:t>F</w:t>
+      </w:r>
+      <w:r>
+        <w:t>ederal)</w:t>
       </w:r>
     </w:p>
     <w:p>
@@ -167,7 +173,13 @@
         <w:pStyle w:val="Body-Text-tight025"/>
       </w:pPr>
       <w:r>
-        <w:t>Social Security - Taxable Benefits Calculator</w:t>
+        <w:t>So</w:t>
+      </w:r>
+      <w:r>
+        <w:t>cial Security - Taxable Benefit</w:t>
+      </w:r>
+      <w:r>
+        <w:t xml:space="preserve"> Calculator</w:t>
       </w:r>
     </w:p>
     <w:p>
@@ -212,14 +224,23 @@
       <w:r>
         <w:t xml:space="preserve"> </w:t>
       </w:r>
-      <w:hyperlink r:id="rId8" w:history="1">
+      <w:hyperlink r:id="rId8" w:anchor="TaxPlanningTools" w:history="1">
         <w:r>
           <w:rPr>
             <w:rStyle w:val="Hyperlink"/>
             <w:sz w:val="18"/>
           </w:rPr>
-          <w:t>bruceblinn.com/6-OtherStuff/Taxes/index.html</w:t>
+          <w:t>bruceblinn.com/6-OtherStuff/Taxes/</w:t>
         </w:r>
+        <w:proofErr w:type="spellStart"/>
+        <w:r>
+          <w:rPr>
+            <w:rStyle w:val="Hyperlink"/>
+            <w:sz w:val="18"/>
+          </w:rPr>
+          <w:t>index.html#TaxPlanningTools</w:t>
+        </w:r>
+        <w:proofErr w:type="spellEnd"/>
       </w:hyperlink>
     </w:p>
     <w:p>
@@ -240,7 +261,13 @@
         <w:t xml:space="preserve"> or a small set of values</w:t>
       </w:r>
       <w:r>
-        <w:t xml:space="preserve">, the inputs can be kept fairly simple, which also helps you understand </w:t>
+        <w:t>, the in</w:t>
+      </w:r>
+      <w:r>
+        <w:t>puts can be kept fairly simple. This makes the tools easier to use and it</w:t>
+      </w:r>
+      <w:r>
+        <w:t xml:space="preserve"> also helps you understand </w:t>
       </w:r>
       <w:r>
         <w:t>what information is used to m</w:t>
@@ -257,7 +284,13 @@
         <w:t>You can enter as much or as little information as you want. Of course, the more information you enter an</w:t>
       </w:r>
       <w:r>
-        <w:t xml:space="preserve">d the more accurate it is, the more accurate </w:t>
+        <w:t xml:space="preserve">d the more accurate </w:t>
+      </w:r>
+      <w:r>
+        <w:t>the information</w:t>
+      </w:r>
+      <w:r>
+        <w:t xml:space="preserve"> is, the more accurate </w:t>
       </w:r>
       <w:r>
         <w:t>the calculation will be. A typical way to use these tools is to enter the information as accurately as possible</w:t>
@@ -301,7 +334,13 @@
         <w:t>These tools only provide estimates. The tax laws are very complicated and these tools provide a vastly simplified view of the tax laws.</w:t>
       </w:r>
       <w:r>
-        <w:t xml:space="preserve"> They try to provide an accurate estimate for common tax situations. Also, i</w:t>
+        <w:t xml:space="preserve"> They </w:t>
+      </w:r>
+      <w:r>
+        <w:t xml:space="preserve">only </w:t>
+      </w:r>
+      <w:r>
+        <w:t>try to provide an accurate estimate for common tax situations. Also, i</w:t>
       </w:r>
       <w:r>
         <w:t xml:space="preserve">n general, the only checking that is done is to </w:t>
@@ -343,7 +382,13 @@
         <w:t xml:space="preserve">input fields are always </w:t>
       </w:r>
       <w:r>
-        <w:t xml:space="preserve">green, and fields </w:t>
+        <w:t xml:space="preserve">green, and </w:t>
+      </w:r>
+      <w:r>
+        <w:t xml:space="preserve">the </w:t>
+      </w:r>
+      <w:r>
+        <w:t xml:space="preserve">fields </w:t>
       </w:r>
       <w:r>
         <w:t xml:space="preserve">that </w:t>
@@ -355,7 +400,21 @@
         <w:t xml:space="preserve"> are always blue</w:t>
       </w:r>
       <w:r>
-        <w:t>. The tools are intended to be used in a browser (e.g., not on a phone). The display of each tool is restricted to 7.5 inches to make it easier to print the pages.</w:t>
+        <w:t>.</w:t>
+      </w:r>
+    </w:p>
+    <w:p>
+      <w:pPr>
+        <w:pStyle w:val="Body-Text"/>
+      </w:pPr>
+      <w:r>
+        <w:t>The tools are intended to be used in a browser (e.g., not on a phone). The display</w:t>
+      </w:r>
+      <w:r>
+        <w:t xml:space="preserve"> width</w:t>
+      </w:r>
+      <w:r>
+        <w:t xml:space="preserve"> of each tool is restricted to 7.5 inches to make it easier to print the pages.</w:t>
       </w:r>
     </w:p>
     <w:p>
@@ -385,6 +444,7 @@
       </w:pPr>
       <w:bookmarkStart w:id="3" w:name="_Toc231285047"/>
       <w:r>
+        <w:lastRenderedPageBreak/>
         <w:t xml:space="preserve">Numeric </w:t>
       </w:r>
       <w:r>
@@ -409,11 +469,7 @@
         <w:t xml:space="preserve"> </w:t>
       </w:r>
       <w:r>
-        <w:t xml:space="preserve">(,) are ignored. This allows you to enter a number as, for example, "$40,000", "$40000", or "40000". In addition, numeric fields </w:t>
-      </w:r>
-      <w:r>
-        <w:lastRenderedPageBreak/>
-        <w:t xml:space="preserve">can contain simple arithmetic expressions. For example, you can enter "($40,000 + 4,000) * 0.075" to enter 7.5% of 44000. All numeric input will be rounded to the nearest whole number. The expression evaluator supports the following </w:t>
+        <w:t xml:space="preserve">(,) are ignored. This allows you to enter a number as, for example, "$40,000", "$40000", or "40000". In addition, numeric fields can contain simple arithmetic expressions. For example, you can enter "($40,000 + 4,000) * 0.075" to enter 7.5% of 44000. All numeric input will be rounded to the nearest whole number. The expression evaluator supports the following </w:t>
       </w:r>
       <w:r>
         <w:t>operators</w:t>
@@ -508,26 +564,46 @@
       <w:pPr>
         <w:pStyle w:val="List-Bullet-tight025"/>
       </w:pPr>
+      <w:r>
+        <w:t>SE</w:t>
+      </w:r>
+      <w:r>
+        <w:t>HI</w:t>
+      </w:r>
+      <w:r>
+        <w:t xml:space="preserve"> - Show the worksheet results for the self-employment </w:t>
+      </w:r>
+      <w:r>
+        <w:t>health insurance</w:t>
+      </w:r>
+      <w:r>
+        <w:t xml:space="preserve"> calculation.</w:t>
+      </w:r>
+    </w:p>
+    <w:p>
+      <w:pPr>
+        <w:pStyle w:val="List-Bullet-tight025"/>
+      </w:pPr>
       <w:proofErr w:type="spellStart"/>
       <w:r>
+        <w:t>SETax</w:t>
+      </w:r>
+      <w:proofErr w:type="spellEnd"/>
+      <w:r>
+        <w:t xml:space="preserve"> - Show the worksheet results for the self-employment tax calculation.</w:t>
+      </w:r>
+    </w:p>
+    <w:p>
+      <w:pPr>
+        <w:pStyle w:val="List-Bullet-tight025"/>
+      </w:pPr>
+      <w:proofErr w:type="spellStart"/>
+      <w:r>
         <w:t>SSTax</w:t>
       </w:r>
       <w:proofErr w:type="spellEnd"/>
       <w:r>
         <w:t xml:space="preserve"> - Show the worksheet results for the amount of Social Security that is taxable calculation.</w:t>
-      </w:r>
-    </w:p>
-    <w:p>
-      <w:pPr>
-        <w:pStyle w:val="List-Bullet-tight025"/>
-      </w:pPr>
-      <w:proofErr w:type="spellStart"/>
-      <w:r>
-        <w:t>SETax</w:t>
-      </w:r>
-      <w:proofErr w:type="spellEnd"/>
-      <w:r>
-        <w:t xml:space="preserve"> - Show the worksheet results for the self-employment tax calculation.</w:t>
       </w:r>
     </w:p>
     <w:p>
@@ -636,6 +712,9 @@
       </w:r>
       <w:r>
         <w:t xml:space="preserve"> is released. There are always two versions of </w:t>
+      </w:r>
+      <w:r>
+        <w:t xml:space="preserve">the </w:t>
       </w:r>
       <w:r>
         <w:t>t</w:t>
@@ -777,6 +856,7 @@
       </w:pPr>
       <w:bookmarkStart w:id="8" w:name="_Toc231285050"/>
       <w:r>
+        <w:lastRenderedPageBreak/>
         <w:t xml:space="preserve">Changes I'm Thinking </w:t>
       </w:r>
       <w:r>
@@ -798,7 +878,6 @@
         <w:pStyle w:val="List-Bullet-tight050"/>
       </w:pPr>
       <w:r>
-        <w:lastRenderedPageBreak/>
         <w:t xml:space="preserve">CTC, EIC, and </w:t>
       </w:r>
       <w:proofErr w:type="spellStart"/>
@@ -1758,6 +1837,30 @@
   </w:num>
   <w:num w:numId="6">
     <w:abstractNumId w:val="5"/>
+  </w:num>
+  <w:num w:numId="7">
+    <w:abstractNumId w:val="4"/>
+  </w:num>
+  <w:num w:numId="8">
+    <w:abstractNumId w:val="4"/>
+  </w:num>
+  <w:num w:numId="9">
+    <w:abstractNumId w:val="4"/>
+  </w:num>
+  <w:num w:numId="10">
+    <w:abstractNumId w:val="4"/>
+  </w:num>
+  <w:num w:numId="11">
+    <w:abstractNumId w:val="4"/>
+  </w:num>
+  <w:num w:numId="12">
+    <w:abstractNumId w:val="4"/>
+  </w:num>
+  <w:num w:numId="13">
+    <w:abstractNumId w:val="4"/>
+  </w:num>
+  <w:num w:numId="14">
+    <w:abstractNumId w:val="4"/>
   </w:num>
   <w:numIdMacAtCleanup w:val="4"/>
 </w:numbering>
@@ -3130,7 +3233,7 @@
 </file>
 
 <file path=customXml/itemProps1.xml><?xml version="1.0" encoding="utf-8"?>
-<ds:datastoreItem xmlns:ds="http://schemas.openxmlformats.org/officeDocument/2006/customXml" ds:itemID="{EFDF3545-E30F-4493-830B-898E650504DE}">
+<ds:datastoreItem xmlns:ds="http://schemas.openxmlformats.org/officeDocument/2006/customXml" ds:itemID="{CB4CD0B1-918B-4137-96E6-78E4D340448C}">
   <ds:schemaRefs>
     <ds:schemaRef ds:uri="http://schemas.openxmlformats.org/officeDocument/2006/bibliography"/>
   </ds:schemaRefs>

</xml_diff>

<commit_message>
More changes renaming TaxTools to Tax Planning Tools.
</commit_message>
<xml_diff>
--- a/Documentation/AboutTaxPlanningTools.docx
+++ b/Documentation/AboutTaxPlanningTools.docx
@@ -211,7 +211,13 @@
         <w:t xml:space="preserve">You can access the latest version of </w:t>
       </w:r>
       <w:r>
-        <w:t xml:space="preserve">the </w:t>
+        <w:t>the</w:t>
+      </w:r>
+      <w:r>
+        <w:t>se</w:t>
+      </w:r>
+      <w:r>
+        <w:t xml:space="preserve"> </w:t>
       </w:r>
       <w:r>
         <w:t>tools on the web using the following URL.</w:t>
@@ -408,13 +414,13 @@
         <w:pStyle w:val="Body-Text"/>
       </w:pPr>
       <w:r>
-        <w:t>The tools are intended to be used in a browser (e.g., not on a phone). The display</w:t>
-      </w:r>
-      <w:r>
-        <w:t xml:space="preserve"> width</w:t>
-      </w:r>
-      <w:r>
-        <w:t xml:space="preserve"> of each tool is restricted to 7.5 inches to make it easier to print the pages.</w:t>
+        <w:t>The tools are intended to be used in a browser (e.g., not on a phone). The</w:t>
+      </w:r>
+      <w:r>
+        <w:t>y are formatted so they will fit on a printed page</w:t>
+      </w:r>
+      <w:r>
+        <w:t>.</w:t>
       </w:r>
     </w:p>
     <w:p>
@@ -3233,7 +3239,7 @@
 </file>
 
 <file path=customXml/itemProps1.xml><?xml version="1.0" encoding="utf-8"?>
-<ds:datastoreItem xmlns:ds="http://schemas.openxmlformats.org/officeDocument/2006/customXml" ds:itemID="{CB4CD0B1-918B-4137-96E6-78E4D340448C}">
+<ds:datastoreItem xmlns:ds="http://schemas.openxmlformats.org/officeDocument/2006/customXml" ds:itemID="{B482971A-4274-47FC-9B41-D2965A509D03}">
   <ds:schemaRefs>
     <ds:schemaRef ds:uri="http://schemas.openxmlformats.org/officeDocument/2006/bibliography"/>
   </ds:schemaRefs>

</xml_diff>

<commit_message>
Convert to using JavaScript modules.
</commit_message>
<xml_diff>
--- a/Documentation/AboutTaxPlanningTools.docx
+++ b/Documentation/AboutTaxPlanningTools.docx
@@ -39,7 +39,7 @@
           <w:rPr>
             <w:noProof/>
           </w:rPr>
-          <w:t>June 6, 2026</w:t>
+          <w:t>June 12, 2026</w:t>
         </w:r>
       </w:fldSimple>
     </w:p>
@@ -276,7 +276,13 @@
         <w:t xml:space="preserve"> also helps you understand </w:t>
       </w:r>
       <w:r>
-        <w:t>what information is used to m</w:t>
+        <w:t xml:space="preserve">what information is </w:t>
+      </w:r>
+      <w:r>
+        <w:t>needed</w:t>
+      </w:r>
+      <w:r>
+        <w:t xml:space="preserve"> to m</w:t>
       </w:r>
       <w:r>
         <w:t>ake the calculation.</w:t>
@@ -1089,6 +1095,14 @@
     </w:p>
     <w:p>
       <w:pPr>
+        <w:pStyle w:val="List-Bullet-tight050"/>
+      </w:pPr>
+      <w:r>
+        <w:t>Calculate penalty for underpayment of tax</w:t>
+      </w:r>
+    </w:p>
+    <w:p>
+      <w:pPr>
         <w:pStyle w:val="List-Bullet050"/>
       </w:pPr>
       <w:r>
@@ -1122,7 +1136,11 @@
         <w:pStyle w:val="List-Bullet025"/>
       </w:pPr>
       <w:r>
-        <w:t>I could merge the small business tax calculation into the estimated tax calculation, but it would calculate values that are currently entered by the user. If more and more fields are calculated then the tool becomes more of a tax program than a tool for estimating the tax from the numbers that you enter. Where should the dividing line be?</w:t>
+        <w:t xml:space="preserve">I could merge the small business tax calculation into the estimated tax calculation, but it would calculate values that are currently entered by the user. If more and more fields are calculated then </w:t>
+      </w:r>
+      <w:r>
+        <w:lastRenderedPageBreak/>
+        <w:t>the tool becomes more of a tax program than a tool for estimating the tax from the numbers that you enter. Where should the dividing line be?</w:t>
       </w:r>
     </w:p>
     <w:p>
@@ -1130,7 +1148,6 @@
         <w:pStyle w:val="List-Bullet025"/>
       </w:pPr>
       <w:r>
-        <w:lastRenderedPageBreak/>
         <w:t xml:space="preserve">Should the tools be implemented as Excel </w:t>
       </w:r>
       <w:r>
@@ -3424,7 +3441,7 @@
 </file>
 
 <file path=customXml/itemProps1.xml><?xml version="1.0" encoding="utf-8"?>
-<ds:datastoreItem xmlns:ds="http://schemas.openxmlformats.org/officeDocument/2006/customXml" ds:itemID="{12E36954-40F1-4063-AF96-71A0EE6691D2}">
+<ds:datastoreItem xmlns:ds="http://schemas.openxmlformats.org/officeDocument/2006/customXml" ds:itemID="{29E918B1-B8AD-4420-849C-5A285551DFDD}">
   <ds:schemaRefs>
     <ds:schemaRef ds:uri="http://schemas.openxmlformats.org/officeDocument/2006/bibliography"/>
   </ds:schemaRefs>

</xml_diff>

<commit_message>
More OO, rename worksheets.
</commit_message>
<xml_diff>
--- a/Documentation/AboutTaxPlanningTools.docx
+++ b/Documentation/AboutTaxPlanningTools.docx
@@ -39,7 +39,7 @@
           <w:rPr>
             <w:noProof/>
           </w:rPr>
-          <w:t>June 12, 2026</w:t>
+          <w:t>July 11, 2026</w:t>
         </w:r>
       </w:fldSimple>
     </w:p>
@@ -548,7 +548,21 @@
         <w:pStyle w:val="Body-Text"/>
       </w:pPr>
       <w:r>
-        <w:t>Some of the tools can display additional information that shows internal calculations and intermediate results. Enter any of the following keywords in any input field to see this information. The keywords are not case-sensitive and can be entered in any order. Separate the input value and one or more keywords using commas or whitespace.</w:t>
+        <w:t>Some of the tools can display additional information that shows internal calculations</w:t>
+      </w:r>
+      <w:r>
+        <w:t xml:space="preserve">. To see the additional information you can enter one of several keywords </w:t>
+      </w:r>
+      <w:r>
+        <w:t>in any input field. The keywords are not case-sensitive and can be entered in any order. Separate the input value and one or more keywords using commas or whitespace.</w:t>
+      </w:r>
+    </w:p>
+    <w:p>
+      <w:pPr>
+        <w:pStyle w:val="Body-Text"/>
+      </w:pPr>
+      <w:r>
+        <w:t>The keywords are the name of a form, worksheet, or one of the following special keywords.</w:t>
       </w:r>
     </w:p>
     <w:p>
@@ -556,26 +570,411 @@
         <w:pStyle w:val="List-Bullet-tight025"/>
       </w:pPr>
       <w:r>
-        <w:t>Debug - Display intermediate results for the current tool.</w:t>
+        <w:t>Debug</w:t>
+      </w:r>
+      <w:r>
+        <w:tab/>
+      </w:r>
+      <w:r>
+        <w:tab/>
+      </w:r>
+      <w:r>
+        <w:t xml:space="preserve">Display </w:t>
+      </w:r>
+      <w:r>
+        <w:t>debug information</w:t>
+      </w:r>
+      <w:r>
+        <w:t xml:space="preserve"> for</w:t>
+      </w:r>
+      <w:r>
+        <w:t xml:space="preserve"> all forms</w:t>
+      </w:r>
+      <w:r>
+        <w:t>.</w:t>
       </w:r>
     </w:p>
     <w:p>
       <w:pPr>
         <w:pStyle w:val="List-Bullet-tight025"/>
       </w:pPr>
+      <w:r>
+        <w:t>Strict</w:t>
+      </w:r>
+      <w:r>
+        <w:tab/>
+      </w:r>
+      <w:r>
+        <w:tab/>
+      </w:r>
+      <w:r>
+        <w:t>Enable additional error checking.</w:t>
+      </w:r>
+    </w:p>
+    <w:p>
+      <w:pPr>
+        <w:pStyle w:val="List-Bullet-tight025"/>
+      </w:pPr>
+      <w:r>
+        <w:t>Verbose</w:t>
+      </w:r>
+      <w:r>
+        <w:tab/>
+      </w:r>
+      <w:r>
+        <w:tab/>
+      </w:r>
+      <w:r>
+        <w:t>Print more debugging information (e.g., lines with value=0)</w:t>
+      </w:r>
+      <w:r>
+        <w:t>.</w:t>
+      </w:r>
+    </w:p>
+    <w:p>
+      <w:pPr>
+        <w:pStyle w:val="List-Bullet-tight025"/>
+      </w:pPr>
+      <w:r>
+        <w:t>Trace</w:t>
+      </w:r>
+      <w:r>
+        <w:tab/>
+      </w:r>
+      <w:r>
+        <w:tab/>
+      </w:r>
+      <w:r>
+        <w:t xml:space="preserve">Logs </w:t>
+      </w:r>
+      <w:proofErr w:type="gramStart"/>
+      <w:r>
+        <w:t>function</w:t>
+      </w:r>
+      <w:proofErr w:type="gramEnd"/>
+      <w:r>
+        <w:t xml:space="preserve"> entry and exit to the console log.</w:t>
+      </w:r>
+    </w:p>
+    <w:p>
+      <w:pPr>
+        <w:pStyle w:val="BlankLine"/>
+      </w:pPr>
+    </w:p>
+    <w:p>
+      <w:pPr>
+        <w:pStyle w:val="Body-Text"/>
+      </w:pPr>
+      <w:r>
+        <w:t>The strict and trace keywords are not currently used by any of the tools. By default, only the lines in a tax form</w:t>
+      </w:r>
+      <w:r>
+        <w:t xml:space="preserve"> or worksheet</w:t>
+      </w:r>
+      <w:r>
+        <w:t xml:space="preserve"> with non</w:t>
+      </w:r>
+      <w:r>
+        <w:t>-</w:t>
+      </w:r>
+      <w:r>
+        <w:t xml:space="preserve">zero values are printed. The verbose keyword can be used to </w:t>
+      </w:r>
+      <w:r>
+        <w:t>print</w:t>
+      </w:r>
+      <w:r>
+        <w:t xml:space="preserve"> all the lines.</w:t>
+      </w:r>
+    </w:p>
+    <w:p>
+      <w:pPr>
+        <w:pStyle w:val="Body-Text"/>
+      </w:pPr>
+      <w:r>
+        <w:t xml:space="preserve">The </w:t>
+      </w:r>
+      <w:r>
+        <w:t xml:space="preserve">names of the </w:t>
+      </w:r>
+      <w:r>
+        <w:t>following form</w:t>
+      </w:r>
+      <w:r>
+        <w:t>s</w:t>
+      </w:r>
+      <w:r>
+        <w:t xml:space="preserve"> and worksheet can be </w:t>
+      </w:r>
+      <w:r>
+        <w:t>entered</w:t>
+      </w:r>
+      <w:r>
+        <w:t xml:space="preserve"> as keywords</w:t>
+      </w:r>
+      <w:r>
+        <w:t xml:space="preserve">, but </w:t>
+      </w:r>
+      <w:r>
+        <w:t>only forms and worksheets created by the tool will be shown.</w:t>
+      </w:r>
+    </w:p>
+    <w:p>
+      <w:pPr>
+        <w:pStyle w:val="Body-Text"/>
+      </w:pPr>
+      <w:r>
+        <w:t>Forms:</w:t>
+      </w:r>
+    </w:p>
+    <w:p>
+      <w:pPr>
+        <w:pStyle w:val="List-Bullet-tight025"/>
+      </w:pPr>
+      <w:r>
+        <w:t>F1040</w:t>
+      </w:r>
+      <w:r>
+        <w:tab/>
+      </w:r>
+      <w:r>
+        <w:tab/>
+        <w:t>Form 1040</w:t>
+      </w:r>
+      <w:r>
+        <w:t>, Individual Tax Return</w:t>
+      </w:r>
+    </w:p>
+    <w:p>
+      <w:pPr>
+        <w:pStyle w:val="List-Bullet-tight025"/>
+      </w:pPr>
+      <w:r>
+        <w:t>F1040S1</w:t>
+      </w:r>
+      <w:r>
+        <w:tab/>
+        <w:t xml:space="preserve">Form 1040, </w:t>
+      </w:r>
+      <w:r>
+        <w:t>S</w:t>
+      </w:r>
+      <w:r>
+        <w:t>chedule 1</w:t>
+      </w:r>
+      <w:r>
+        <w:t>, Additional Income and Adjustments to Income</w:t>
+      </w:r>
+    </w:p>
+    <w:p>
+      <w:pPr>
+        <w:pStyle w:val="List-Bullet-tight025"/>
+      </w:pPr>
+      <w:r>
+        <w:t>F1040S1A</w:t>
+      </w:r>
+      <w:r>
+        <w:tab/>
+        <w:t xml:space="preserve">Form 1040, </w:t>
+      </w:r>
+      <w:r>
+        <w:t>S</w:t>
+      </w:r>
+      <w:r>
+        <w:t>chedule 1A</w:t>
+      </w:r>
+      <w:r>
+        <w:t>, Additional Deductions</w:t>
+      </w:r>
+    </w:p>
+    <w:p>
+      <w:pPr>
+        <w:pStyle w:val="List-Bullet-tight025"/>
+      </w:pPr>
+      <w:r>
+        <w:t>F1040S2</w:t>
+      </w:r>
+      <w:r>
+        <w:t xml:space="preserve"> </w:t>
+      </w:r>
+      <w:r>
+        <w:tab/>
+        <w:t xml:space="preserve">Form 1040, </w:t>
+      </w:r>
+      <w:r>
+        <w:t>S</w:t>
+      </w:r>
+      <w:r>
+        <w:t>chedule 2</w:t>
+      </w:r>
+      <w:r>
+        <w:t>, Additional Taxes</w:t>
+      </w:r>
+    </w:p>
+    <w:p>
+      <w:pPr>
+        <w:pStyle w:val="List-Bullet-tight025"/>
+      </w:pPr>
+      <w:r>
+        <w:t>F1040S3</w:t>
+      </w:r>
+      <w:r>
+        <w:t xml:space="preserve"> </w:t>
+      </w:r>
+      <w:r>
+        <w:tab/>
+        <w:t xml:space="preserve">Form 1040, </w:t>
+      </w:r>
+      <w:r>
+        <w:t>S</w:t>
+      </w:r>
+      <w:r>
+        <w:t>chedule 3</w:t>
+      </w:r>
+      <w:r>
+        <w:t>, Additional Credits and Payments</w:t>
+      </w:r>
+    </w:p>
+    <w:p>
+      <w:pPr>
+        <w:pStyle w:val="List-Bullet-tight025"/>
+      </w:pPr>
+      <w:r>
+        <w:t>F1040SA</w:t>
+      </w:r>
+      <w:r>
+        <w:t xml:space="preserve"> </w:t>
+      </w:r>
+      <w:r>
+        <w:tab/>
+        <w:t xml:space="preserve">Form 1040, </w:t>
+      </w:r>
+      <w:r>
+        <w:t>S</w:t>
+      </w:r>
+      <w:r>
+        <w:t>chedule A, Itemized D</w:t>
+      </w:r>
+      <w:r>
+        <w:t>eductions</w:t>
+      </w:r>
+    </w:p>
+    <w:p>
+      <w:pPr>
+        <w:pStyle w:val="List-Bullet-tight025"/>
+      </w:pPr>
+      <w:r>
+        <w:t>F540</w:t>
+      </w:r>
+      <w:r>
+        <w:t xml:space="preserve"> </w:t>
+      </w:r>
+      <w:r>
+        <w:tab/>
+      </w:r>
+      <w:r>
+        <w:tab/>
+        <w:t>Form 540, California Resident Income Tax return</w:t>
+      </w:r>
+    </w:p>
+    <w:p>
+      <w:pPr>
+        <w:pStyle w:val="List-Bullet-tight025"/>
+      </w:pPr>
+      <w:r>
+        <w:t>F540CA</w:t>
+      </w:r>
+      <w:r>
+        <w:tab/>
+      </w:r>
+      <w:r>
+        <w:tab/>
+      </w:r>
+      <w:r>
+        <w:t>Form CA</w:t>
+      </w:r>
+      <w:r>
+        <w:t xml:space="preserve"> </w:t>
+      </w:r>
+      <w:r>
+        <w:t>(540), California Adjustments</w:t>
+      </w:r>
+      <w:r>
+        <w:t xml:space="preserve"> - Residents</w:t>
+      </w:r>
+    </w:p>
+    <w:p>
+      <w:pPr>
+        <w:pStyle w:val="List-Bullet-tight025"/>
+      </w:pPr>
+      <w:r>
+        <w:t>F6251</w:t>
+      </w:r>
+      <w:r>
+        <w:tab/>
+      </w:r>
+      <w:r>
+        <w:tab/>
+        <w:t>Alternative Minimum Tax - Individual</w:t>
+      </w:r>
+    </w:p>
+    <w:p>
+      <w:pPr>
+        <w:pStyle w:val="List-Bullet-tight025"/>
+        <w:numPr>
+          <w:ilvl w:val="0"/>
+          <w:numId w:val="0"/>
+        </w:numPr>
+        <w:ind w:left="1440"/>
+      </w:pPr>
+    </w:p>
+    <w:p>
+      <w:pPr>
+        <w:pStyle w:val="Body-Text"/>
+      </w:pPr>
+      <w:r>
+        <w:t>Worksheets:</w:t>
+      </w:r>
+    </w:p>
+    <w:p>
+      <w:pPr>
+        <w:pStyle w:val="List-Bullet-tight025"/>
+      </w:pPr>
       <w:proofErr w:type="spellStart"/>
       <w:r>
-        <w:t>IncTax</w:t>
+        <w:t>WS_IncTax</w:t>
       </w:r>
       <w:proofErr w:type="spellEnd"/>
       <w:r>
-        <w:t xml:space="preserve"> - Show the worksheet results for the federal income tax calculation.</w:t>
+        <w:tab/>
+      </w:r>
+      <w:r>
+        <w:t>Qualified Dividends and Capital Gain Tax Worksheet</w:t>
       </w:r>
     </w:p>
     <w:p>
       <w:pPr>
         <w:pStyle w:val="List-Bullet-tight025"/>
       </w:pPr>
+      <w:proofErr w:type="spellStart"/>
+      <w:r>
+        <w:t>WS_SalesTax</w:t>
+      </w:r>
+      <w:proofErr w:type="spellEnd"/>
+      <w:r>
+        <w:tab/>
+      </w:r>
+      <w:r>
+        <w:t>State and Local General Sales Tax Deduction Worksheet</w:t>
+      </w:r>
+    </w:p>
+    <w:p>
+      <w:pPr>
+        <w:pStyle w:val="List-Bullet-tight025"/>
+      </w:pPr>
+      <w:r>
+        <w:t>WS_</w:t>
+      </w:r>
       <w:r>
         <w:t>SE</w:t>
       </w:r>
@@ -583,13 +982,26 @@
         <w:t>HI</w:t>
       </w:r>
       <w:r>
-        <w:t xml:space="preserve"> - Show the worksheet results for the self-employment </w:t>
-      </w:r>
-      <w:r>
-        <w:t>health insurance</w:t>
-      </w:r>
-      <w:r>
-        <w:t xml:space="preserve"> calculation.</w:t>
+        <w:tab/>
+        <w:t>S</w:t>
+      </w:r>
+      <w:r>
+        <w:t xml:space="preserve">elf-employment </w:t>
+      </w:r>
+      <w:r>
+        <w:t>Health I</w:t>
+      </w:r>
+      <w:r>
+        <w:t>nsurance</w:t>
+      </w:r>
+      <w:r>
+        <w:t xml:space="preserve"> </w:t>
+      </w:r>
+      <w:r>
+        <w:t>W</w:t>
+      </w:r>
+      <w:r>
+        <w:t>orksheet</w:t>
       </w:r>
     </w:p>
     <w:p>
@@ -598,11 +1010,23 @@
       </w:pPr>
       <w:proofErr w:type="spellStart"/>
       <w:r>
-        <w:t>SETax</w:t>
+        <w:t>WS_SETax</w:t>
       </w:r>
       <w:proofErr w:type="spellEnd"/>
       <w:r>
-        <w:t xml:space="preserve"> - Show the worksheet results for the self-employment tax calculation.</w:t>
+        <w:tab/>
+      </w:r>
+      <w:r>
+        <w:t>Self-employment T</w:t>
+      </w:r>
+      <w:r>
+        <w:t xml:space="preserve">ax </w:t>
+      </w:r>
+      <w:r>
+        <w:t>W</w:t>
+      </w:r>
+      <w:r>
+        <w:t>orksheet</w:t>
       </w:r>
     </w:p>
     <w:p>
@@ -611,19 +1035,30 @@
       </w:pPr>
       <w:proofErr w:type="spellStart"/>
       <w:r>
-        <w:t>SSTax</w:t>
+        <w:t>WS_Simple</w:t>
       </w:r>
       <w:proofErr w:type="spellEnd"/>
       <w:r>
-        <w:t xml:space="preserve"> - Show the worksheet results for the amount of Social Security that is taxable calculation.</w:t>
+        <w:tab/>
+      </w:r>
+      <w:r>
+        <w:t>Simplified Method Worksheet</w:t>
       </w:r>
     </w:p>
     <w:p>
       <w:pPr>
         <w:pStyle w:val="List-Bullet-tight025"/>
       </w:pPr>
-      <w:r>
-        <w:t>Trace - Logs function entry and exit to the console log.</w:t>
+      <w:proofErr w:type="spellStart"/>
+      <w:r>
+        <w:t>WS_SSTax</w:t>
+      </w:r>
+      <w:proofErr w:type="spellEnd"/>
+      <w:r>
+        <w:tab/>
+      </w:r>
+      <w:r>
+        <w:t>Social Security Benefits Worksheet</w:t>
       </w:r>
     </w:p>
     <w:p>
@@ -691,6 +1126,7 @@
         <w:pStyle w:val="Body-Text"/>
       </w:pPr>
       <w:r>
+        <w:lastRenderedPageBreak/>
         <w:t xml:space="preserve">The first part of the version number corresponds to the current tax year. Sometime between April 15 </w:t>
       </w:r>
       <w:r>
@@ -868,143 +1304,143 @@
       </w:pPr>
       <w:bookmarkStart w:id="8" w:name="_Toc231285050"/>
       <w:r>
+        <w:t>Issues, Limitations, and Known Problems</w:t>
+      </w:r>
+    </w:p>
+    <w:p>
+      <w:pPr>
+        <w:pStyle w:val="Heading3"/>
+      </w:pPr>
+      <w:r>
+        <w:t>California Sales Tax Calculator and California Sales Tax Deduction Calculator</w:t>
+      </w:r>
+    </w:p>
+    <w:p>
+      <w:pPr>
+        <w:pStyle w:val="List-Bullet025"/>
+      </w:pPr>
+      <w:r>
+        <w:t>These calculators can only calculate the sales tax for addresses in California.</w:t>
+      </w:r>
+    </w:p>
+    <w:p>
+      <w:pPr>
+        <w:pStyle w:val="Heading3"/>
+      </w:pPr>
+      <w:r>
+        <w:t>Estimated Tax Calculator (Federal)</w:t>
+      </w:r>
+    </w:p>
+    <w:p>
+      <w:pPr>
+        <w:pStyle w:val="List-Bullet025"/>
+      </w:pPr>
+      <w:r>
+        <w:t>Does not support blind taxpayer or spouse.</w:t>
+      </w:r>
+    </w:p>
+    <w:p>
+      <w:pPr>
+        <w:pStyle w:val="List-Bullet025"/>
+      </w:pPr>
+      <w:r>
+        <w:t>Does not support small business (schedule C).</w:t>
+      </w:r>
+    </w:p>
+    <w:p>
+      <w:pPr>
+        <w:pStyle w:val="List-Bullet025"/>
+      </w:pPr>
+      <w:r>
+        <w:t>Does not support dependents.</w:t>
+      </w:r>
+    </w:p>
+    <w:p>
+      <w:pPr>
+        <w:pStyle w:val="List-Bullet025"/>
+      </w:pPr>
+      <w:r>
+        <w:t>Allows you to enter the amount of credits, but does not calculate CTC or EIC or any other credit.</w:t>
+      </w:r>
+    </w:p>
+    <w:p>
+      <w:pPr>
+        <w:pStyle w:val="Heading3"/>
+      </w:pPr>
+      <w:r>
+        <w:t>Small Business Tax Calculator</w:t>
+      </w:r>
+    </w:p>
+    <w:p>
+      <w:pPr>
+        <w:pStyle w:val="List-Bullet025"/>
+      </w:pPr>
+      <w:r>
+        <w:t>The QBI calculation does not agree with TaxSlayer???</w:t>
+      </w:r>
+    </w:p>
+    <w:p>
+      <w:pPr>
+        <w:pStyle w:val="List-Bullet025"/>
+      </w:pPr>
+      <w:r>
+        <w:t>Long Term Care insurance is not separated out from medical insurance. If medical insurance includes premiums for long term care insurance, the amount entered needs to be limited by age.</w:t>
+      </w:r>
+    </w:p>
+    <w:p>
+      <w:pPr>
+        <w:pStyle w:val="List-Bullet025"/>
+      </w:pPr>
+      <w:r>
+        <w:t>This tool does not handle church employees or farm income.</w:t>
+      </w:r>
+    </w:p>
+    <w:p>
+      <w:pPr>
+        <w:pStyle w:val="List-Bullet025"/>
+      </w:pPr>
+      <w:r>
+        <w:t>The calculation will not be correct if the amount of business income plus wages is greater than the maximum amount subject to Social Security taxes.</w:t>
+      </w:r>
+    </w:p>
+    <w:p>
+      <w:pPr>
+        <w:pStyle w:val="List-Bullet025"/>
+      </w:pPr>
+      <w:r>
+        <w:t>The QBI deduction phases out at $201,775, which is not accounted for in the tool.</w:t>
+      </w:r>
+    </w:p>
+    <w:p>
+      <w:pPr>
+        <w:pStyle w:val="Heading3"/>
+      </w:pPr>
+      <w:r>
+        <w:t>Social Security - Taxable Benefits Calculator</w:t>
+      </w:r>
+    </w:p>
+    <w:p>
+      <w:pPr>
+        <w:pStyle w:val="List-Bullet025"/>
+      </w:pPr>
+      <w:r>
+        <w:t>See the description for the Adjustments field in the help file. There are a few adjustments that may not be handled correctly by this tool.</w:t>
+      </w:r>
+    </w:p>
+    <w:p>
+      <w:pPr>
+        <w:pStyle w:val="List-Bullet025"/>
+      </w:pPr>
+      <w:r>
+        <w:t>If you are a non-resident alien, do not use this calculator; the taxable percentage of your Social Security is 85%.</w:t>
+      </w:r>
+    </w:p>
+    <w:p>
+      <w:pPr>
+        <w:pStyle w:val="Heading3"/>
+      </w:pPr>
+      <w:r>
         <w:lastRenderedPageBreak/>
-        <w:t>Issues, Limitations, and Known Problems</w:t>
-      </w:r>
-    </w:p>
-    <w:p>
-      <w:pPr>
-        <w:pStyle w:val="Heading3"/>
-      </w:pPr>
-      <w:r>
-        <w:t>California Sales Tax Calculator and California Sales Tax Deduction Calculator</w:t>
-      </w:r>
-    </w:p>
-    <w:p>
-      <w:pPr>
-        <w:pStyle w:val="List-Bullet025"/>
-      </w:pPr>
-      <w:r>
-        <w:t>These calculators can only calculate the sales tax for addresses in California.</w:t>
-      </w:r>
-    </w:p>
-    <w:p>
-      <w:pPr>
-        <w:pStyle w:val="Heading3"/>
-      </w:pPr>
-      <w:r>
-        <w:t>Estimated Tax Calculator (Federal)</w:t>
-      </w:r>
-    </w:p>
-    <w:p>
-      <w:pPr>
-        <w:pStyle w:val="List-Bullet025"/>
-      </w:pPr>
-      <w:r>
-        <w:t>Does not support blind taxpayer or spouse.</w:t>
-      </w:r>
-    </w:p>
-    <w:p>
-      <w:pPr>
-        <w:pStyle w:val="List-Bullet025"/>
-      </w:pPr>
-      <w:r>
-        <w:t>Does not support small business (schedule C).</w:t>
-      </w:r>
-    </w:p>
-    <w:p>
-      <w:pPr>
-        <w:pStyle w:val="List-Bullet025"/>
-      </w:pPr>
-      <w:r>
-        <w:t>Does not support dependents.</w:t>
-      </w:r>
-    </w:p>
-    <w:p>
-      <w:pPr>
-        <w:pStyle w:val="List-Bullet025"/>
-      </w:pPr>
-      <w:r>
-        <w:t>Allows you to enter the amount of credits, but does not calculate CTC or EIC or any other credit.</w:t>
-      </w:r>
-    </w:p>
-    <w:p>
-      <w:pPr>
-        <w:pStyle w:val="Heading3"/>
-      </w:pPr>
-      <w:r>
-        <w:t>Small Business Tax Calculator</w:t>
-      </w:r>
-    </w:p>
-    <w:p>
-      <w:pPr>
-        <w:pStyle w:val="List-Bullet025"/>
-      </w:pPr>
-      <w:r>
-        <w:t>The QBI calculation does not agree with TaxSlayer???</w:t>
-      </w:r>
-    </w:p>
-    <w:p>
-      <w:pPr>
-        <w:pStyle w:val="List-Bullet025"/>
-      </w:pPr>
-      <w:r>
-        <w:t>Long Term Care insurance is not separated out from medical insurance. If medical insurance includes premiums for long term care insurance, the amount entered needs to be limited by age.</w:t>
-      </w:r>
-    </w:p>
-    <w:p>
-      <w:pPr>
-        <w:pStyle w:val="List-Bullet025"/>
-      </w:pPr>
-      <w:r>
-        <w:t>This tool does not handle church employees or farm income.</w:t>
-      </w:r>
-    </w:p>
-    <w:p>
-      <w:pPr>
-        <w:pStyle w:val="List-Bullet025"/>
-      </w:pPr>
-      <w:r>
-        <w:t>The calculation will not be correct if the amount of business income plus wages is greater than the maximum amount subject to Social Security taxes.</w:t>
-      </w:r>
-    </w:p>
-    <w:p>
-      <w:pPr>
-        <w:pStyle w:val="List-Bullet025"/>
-      </w:pPr>
-      <w:r>
-        <w:t>The QBI deduction phases out at $201,775, which is not accounted for in the tool.</w:t>
-      </w:r>
-    </w:p>
-    <w:p>
-      <w:pPr>
-        <w:pStyle w:val="Heading3"/>
-      </w:pPr>
-      <w:r>
-        <w:t>Social Security - Taxable Benefits Calculator</w:t>
-      </w:r>
-    </w:p>
-    <w:p>
-      <w:pPr>
-        <w:pStyle w:val="List-Bullet025"/>
-      </w:pPr>
-      <w:r>
-        <w:t>See the description for the Adjustments field in the help file. There are a few adjustments that may not be handled correctly by this tool.</w:t>
-      </w:r>
-    </w:p>
-    <w:p>
-      <w:pPr>
-        <w:pStyle w:val="List-Bullet025"/>
-      </w:pPr>
-      <w:r>
-        <w:t>If you are a non-resident alien, do not use this calculator; the taxable percentage of your Social Security is 85%.</w:t>
-      </w:r>
-    </w:p>
-    <w:p>
-      <w:pPr>
-        <w:pStyle w:val="Heading3"/>
-      </w:pPr>
-      <w:r>
         <w:t>Social Security Lump Sum Calculator</w:t>
       </w:r>
     </w:p>
@@ -1129,18 +1565,6 @@
       </w:pPr>
       <w:r>
         <w:t>If an input field is modified internally, should the input field be updated so the user can see the corrected value?</w:t>
-      </w:r>
-    </w:p>
-    <w:p>
-      <w:pPr>
-        <w:pStyle w:val="List-Bullet025"/>
-      </w:pPr>
-      <w:r>
-        <w:t xml:space="preserve">I could merge the small business tax calculation into the estimated tax calculation, but it would calculate values that are currently entered by the user. If more and more fields are calculated then </w:t>
-      </w:r>
-      <w:r>
-        <w:lastRenderedPageBreak/>
-        <w:t>the tool becomes more of a tax program than a tool for estimating the tax from the numbers that you enter. Where should the dividing line be?</w:t>
       </w:r>
     </w:p>
     <w:p>
@@ -3441,7 +3865,7 @@
 </file>
 
 <file path=customXml/itemProps1.xml><?xml version="1.0" encoding="utf-8"?>
-<ds:datastoreItem xmlns:ds="http://schemas.openxmlformats.org/officeDocument/2006/customXml" ds:itemID="{29E918B1-B8AD-4420-849C-5A285551DFDD}">
+<ds:datastoreItem xmlns:ds="http://schemas.openxmlformats.org/officeDocument/2006/customXml" ds:itemID="{D26C3CDA-A365-4326-81B7-929B752365BD}">
   <ds:schemaRefs>
     <ds:schemaRef ds:uri="http://schemas.openxmlformats.org/officeDocument/2006/bibliography"/>
   </ds:schemaRefs>

</xml_diff>

<commit_message>
Save work in progress.
</commit_message>
<xml_diff>
--- a/Documentation/AboutTaxPlanningTools.docx
+++ b/Documentation/AboutTaxPlanningTools.docx
@@ -39,7 +39,7 @@
           <w:rPr>
             <w:noProof/>
           </w:rPr>
-          <w:t>July 11, 2026</w:t>
+          <w:t>July 13, 2026</w:t>
         </w:r>
       </w:fldSimple>
     </w:p>
@@ -394,19 +394,10 @@
         <w:t xml:space="preserve">input fields are always </w:t>
       </w:r>
       <w:r>
-        <w:t xml:space="preserve">green, and </w:t>
-      </w:r>
-      <w:r>
-        <w:t xml:space="preserve">the </w:t>
-      </w:r>
-      <w:r>
-        <w:t xml:space="preserve">fields </w:t>
-      </w:r>
-      <w:r>
-        <w:t xml:space="preserve">that </w:t>
-      </w:r>
-      <w:r>
-        <w:t>display the values that are calculated by the tools</w:t>
+        <w:t>green</w:t>
+      </w:r>
+      <w:r>
+        <w:t xml:space="preserve"> and the values calculated by the tools</w:t>
       </w:r>
       <w:r>
         <w:t xml:space="preserve"> are always blue</w:t>
@@ -447,7 +438,13 @@
         <w:t>Several</w:t>
       </w:r>
       <w:r>
-        <w:t xml:space="preserve"> of the tools provide tooltips. These are small popup displays that show up when you move the mouse over one of the fields. They provide a short explanation of the purpose of the fields. When available, tooltips are provided for input fields to help you enter the correct information and for output fields to explain what the information means.</w:t>
+        <w:t xml:space="preserve"> of the tools provide tooltips. These are small popup displays that show up when you move the mouse over one of the fields. They provide a short explanat</w:t>
+      </w:r>
+      <w:r>
+        <w:t>ion of the purpose of the field</w:t>
+      </w:r>
+      <w:r>
+        <w:t>. When available, tooltips are provided for input fields to help you enter the correct information and for output fields to explain what the information means.</w:t>
       </w:r>
     </w:p>
     <w:p>
@@ -647,13 +644,17 @@
       <w:r>
         <w:t xml:space="preserve">Logs </w:t>
       </w:r>
-      <w:proofErr w:type="gramStart"/>
-      <w:r>
-        <w:t>function</w:t>
-      </w:r>
-      <w:proofErr w:type="gramEnd"/>
-      <w:r>
-        <w:t xml:space="preserve"> entry and exit to the console log.</w:t>
+      <w:r>
+        <w:t xml:space="preserve">the </w:t>
+      </w:r>
+      <w:r>
+        <w:t xml:space="preserve">entry and exit </w:t>
+      </w:r>
+      <w:r>
+        <w:t xml:space="preserve">of procedures </w:t>
+      </w:r>
+      <w:r>
+        <w:t>to the console log.</w:t>
       </w:r>
     </w:p>
     <w:p>
@@ -942,13 +943,16 @@
       </w:pPr>
       <w:proofErr w:type="spellStart"/>
       <w:r>
-        <w:t>WS_IncTax</w:t>
+        <w:t>IncTax</w:t>
       </w:r>
       <w:proofErr w:type="spellEnd"/>
       <w:r>
         <w:tab/>
       </w:r>
       <w:r>
+        <w:tab/>
+      </w:r>
+      <w:r>
         <w:t>Qualified Dividends and Capital Gain Tax Worksheet</w:t>
       </w:r>
     </w:p>
@@ -958,7 +962,7 @@
       </w:pPr>
       <w:proofErr w:type="spellStart"/>
       <w:r>
-        <w:t>WS_SalesTax</w:t>
+        <w:t>SalesTax</w:t>
       </w:r>
       <w:proofErr w:type="spellEnd"/>
       <w:r>
@@ -973,9 +977,6 @@
         <w:pStyle w:val="List-Bullet-tight025"/>
       </w:pPr>
       <w:r>
-        <w:t>WS_</w:t>
-      </w:r>
-      <w:r>
         <w:t>SE</w:t>
       </w:r>
       <w:r>
@@ -983,6 +984,11 @@
       </w:r>
       <w:r>
         <w:tab/>
+      </w:r>
+      <w:r>
+        <w:tab/>
+      </w:r>
+      <w:r>
         <w:t>S</w:t>
       </w:r>
       <w:r>
@@ -1010,13 +1016,16 @@
       </w:pPr>
       <w:proofErr w:type="spellStart"/>
       <w:r>
-        <w:t>WS_SETax</w:t>
+        <w:t>SETax</w:t>
       </w:r>
       <w:proofErr w:type="spellEnd"/>
       <w:r>
         <w:tab/>
       </w:r>
       <w:r>
+        <w:tab/>
+      </w:r>
+      <w:r>
         <w:t>Self-employment T</w:t>
       </w:r>
       <w:r>
@@ -1033,27 +1042,31 @@
       <w:pPr>
         <w:pStyle w:val="List-Bullet-tight025"/>
       </w:pPr>
+      <w:r>
+        <w:t>Simple</w:t>
+      </w:r>
+      <w:r>
+        <w:tab/>
+      </w:r>
+      <w:r>
+        <w:tab/>
+      </w:r>
+      <w:r>
+        <w:t>Simplified Method Worksheet</w:t>
+      </w:r>
+    </w:p>
+    <w:p>
+      <w:pPr>
+        <w:pStyle w:val="List-Bullet-tight025"/>
+      </w:pPr>
       <w:proofErr w:type="spellStart"/>
       <w:r>
-        <w:t>WS_Simple</w:t>
+        <w:t>SSTax</w:t>
       </w:r>
       <w:proofErr w:type="spellEnd"/>
       <w:r>
         <w:tab/>
       </w:r>
-      <w:r>
-        <w:t>Simplified Method Worksheet</w:t>
-      </w:r>
-    </w:p>
-    <w:p>
-      <w:pPr>
-        <w:pStyle w:val="List-Bullet-tight025"/>
-      </w:pPr>
-      <w:proofErr w:type="spellStart"/>
-      <w:r>
-        <w:t>WS_SSTax</w:t>
-      </w:r>
-      <w:proofErr w:type="spellEnd"/>
       <w:r>
         <w:tab/>
       </w:r>
@@ -1106,16 +1119,7 @@
         <w:t xml:space="preserve">the </w:t>
       </w:r>
       <w:r>
-        <w:t>T</w:t>
-      </w:r>
-      <w:r>
-        <w:t>ax</w:t>
-      </w:r>
-      <w:r>
-        <w:t xml:space="preserve"> Planning </w:t>
-      </w:r>
-      <w:r>
-        <w:t>T</w:t>
+        <w:t>t</w:t>
       </w:r>
       <w:r>
         <w:t>ools.</w:t>
@@ -1156,15 +1160,18 @@
         <w:t xml:space="preserve">The second part of the version number is the incremented each time a new version of </w:t>
       </w:r>
       <w:r>
-        <w:t>the Tax Planning Tools</w:t>
-      </w:r>
-      <w:r>
-        <w:t xml:space="preserve"> is released. There are always two versions of </w:t>
-      </w:r>
-      <w:r>
         <w:t xml:space="preserve">the </w:t>
       </w:r>
       <w:r>
+        <w:t>tools are</w:t>
+      </w:r>
+      <w:r>
+        <w:t xml:space="preserve"> released. There are always two versions of </w:t>
+      </w:r>
+      <w:r>
+        <w:t xml:space="preserve">the </w:t>
+      </w:r>
+      <w:r>
         <w:t>t</w:t>
       </w:r>
       <w:r>
@@ -1191,7 +1198,13 @@
         <w:t xml:space="preserve"> used in the released version of </w:t>
       </w:r>
       <w:r>
-        <w:t>the Tax Planning Tools</w:t>
+        <w:t xml:space="preserve">the </w:t>
+      </w:r>
+      <w:r>
+        <w:t>t</w:t>
+      </w:r>
+      <w:r>
+        <w:t>ools</w:t>
       </w:r>
       <w:r>
         <w:t>.</w:t>
@@ -1601,7 +1614,13 @@
         <w:t xml:space="preserve">If you have any feedback on </w:t>
       </w:r>
       <w:r>
-        <w:t>the Tax Planning Tools</w:t>
+        <w:t xml:space="preserve">the </w:t>
+      </w:r>
+      <w:r>
+        <w:t>t</w:t>
+      </w:r>
+      <w:r>
+        <w:t>ools</w:t>
       </w:r>
       <w:r>
         <w:t>, send it to bruce_blinn@yahoo.com. I would welcome any information about problems with the tools or suggestion on how to improve them.</w:t>
@@ -3865,7 +3884,7 @@
 </file>
 
 <file path=customXml/itemProps1.xml><?xml version="1.0" encoding="utf-8"?>
-<ds:datastoreItem xmlns:ds="http://schemas.openxmlformats.org/officeDocument/2006/customXml" ds:itemID="{D26C3CDA-A365-4326-81B7-929B752365BD}">
+<ds:datastoreItem xmlns:ds="http://schemas.openxmlformats.org/officeDocument/2006/customXml" ds:itemID="{2CD4F80F-AD28-446F-9B9C-40A7138470FE}">
   <ds:schemaRefs>
     <ds:schemaRef ds:uri="http://schemas.openxmlformats.org/officeDocument/2006/bibliography"/>
   </ds:schemaRefs>

</xml_diff>

<commit_message>
Save the current changes.
</commit_message>
<xml_diff>
--- a/Documentation/AboutTaxPlanningTools.docx
+++ b/Documentation/AboutTaxPlanningTools.docx
@@ -39,7 +39,7 @@
           <w:rPr>
             <w:noProof/>
           </w:rPr>
-          <w:t>July 13, 2026</w:t>
+          <w:t>July 16, 2026</w:t>
         </w:r>
       </w:fldSimple>
     </w:p>
@@ -667,7 +667,7 @@
         <w:pStyle w:val="Body-Text"/>
       </w:pPr>
       <w:r>
-        <w:t>The strict and trace keywords are not currently used by any of the tools. By default, only the lines in a tax form</w:t>
+        <w:t>By default, only the lines in a tax form</w:t>
       </w:r>
       <w:r>
         <w:t xml:space="preserve"> or worksheet</w:t>
@@ -3884,7 +3884,7 @@
 </file>
 
 <file path=customXml/itemProps1.xml><?xml version="1.0" encoding="utf-8"?>
-<ds:datastoreItem xmlns:ds="http://schemas.openxmlformats.org/officeDocument/2006/customXml" ds:itemID="{2CD4F80F-AD28-446F-9B9C-40A7138470FE}">
+<ds:datastoreItem xmlns:ds="http://schemas.openxmlformats.org/officeDocument/2006/customXml" ds:itemID="{5D9F807B-8D19-46EC-A720-3A44A8D63CE1}">
   <ds:schemaRefs>
     <ds:schemaRef ds:uri="http://schemas.openxmlformats.org/officeDocument/2006/bibliography"/>
   </ds:schemaRefs>

</xml_diff>

<commit_message>
Save work in progress; almost done
</commit_message>
<xml_diff>
--- a/Documentation/AboutTaxPlanningTools.docx
+++ b/Documentation/AboutTaxPlanningTools.docx
@@ -945,6 +945,23 @@
     <w:p>
       <w:pPr>
         <w:pStyle w:val="List-Bullet-tight025"/>
+      </w:pPr>
+      <w:r>
+        <w:t>W2</w:t>
+      </w:r>
+      <w:r>
+        <w:tab/>
+      </w:r>
+      <w:r>
+        <w:tab/>
+      </w:r>
+      <w:r>
+        <w:t>Wage and Tax Statement</w:t>
+      </w:r>
+    </w:p>
+    <w:p>
+      <w:pPr>
+        <w:pStyle w:val="List-Bullet-tight025"/>
         <w:numPr>
           <w:ilvl w:val="0"/>
           <w:numId w:val="0"/>
@@ -1837,7 +1854,7 @@
         <w:szCs w:val="24"/>
         <w:lang w:eastAsia="en-US"/>
       </w:rPr>
-      <w:t>4</w:t>
+      <w:t>2</w:t>
     </w:r>
     <w:r>
       <w:rPr>
@@ -3973,7 +3990,7 @@
 </file>
 
 <file path=customXml/itemProps1.xml><?xml version="1.0" encoding="utf-8"?>
-<ds:datastoreItem xmlns:ds="http://schemas.openxmlformats.org/officeDocument/2006/customXml" ds:itemID="{2A852E35-35EC-43F8-914F-8DA40AC59970}">
+<ds:datastoreItem xmlns:ds="http://schemas.openxmlformats.org/officeDocument/2006/customXml" ds:itemID="{CA086EC9-F7EE-490B-9393-78975AEE9A3A}">
   <ds:schemaRefs>
     <ds:schemaRef ds:uri="http://schemas.openxmlformats.org/officeDocument/2006/bibliography"/>
   </ds:schemaRefs>

</xml_diff>

<commit_message>
Conversion to OO seems to be working, ready to merge.
</commit_message>
<xml_diff>
--- a/Documentation/AboutTaxPlanningTools.docx
+++ b/Documentation/AboutTaxPlanningTools.docx
@@ -39,7 +39,7 @@
           <w:rPr>
             <w:noProof/>
           </w:rPr>
-          <w:t>July 17, 2026</w:t>
+          <w:t>July 21, 2026</w:t>
         </w:r>
       </w:fldSimple>
     </w:p>
@@ -871,6 +871,33 @@
         <w:pStyle w:val="List-Bullet-tight025"/>
       </w:pPr>
       <w:r>
+        <w:t>F1040SC</w:t>
+      </w:r>
+      <w:r>
+        <w:tab/>
+        <w:t>Schedule C, Profit and Loss from Business</w:t>
+      </w:r>
+    </w:p>
+    <w:p>
+      <w:pPr>
+        <w:pStyle w:val="List-Bullet-tight025"/>
+      </w:pPr>
+      <w:r>
+        <w:t>F1040SSE</w:t>
+      </w:r>
+      <w:r>
+        <w:tab/>
+        <w:t xml:space="preserve">Schedule SE, </w:t>
+      </w:r>
+      <w:r>
+        <w:t>Self-employment Tax</w:t>
+      </w:r>
+    </w:p>
+    <w:p>
+      <w:pPr>
+        <w:pStyle w:val="List-Bullet-tight025"/>
+      </w:pPr>
+      <w:r>
         <w:t>F540</w:t>
       </w:r>
       <w:r>
@@ -1042,34 +1069,6 @@
       </w:r>
       <w:r>
         <w:t xml:space="preserve"> </w:t>
-      </w:r>
-      <w:r>
-        <w:t>W</w:t>
-      </w:r>
-      <w:r>
-        <w:t>orksheet</w:t>
-      </w:r>
-    </w:p>
-    <w:p>
-      <w:pPr>
-        <w:pStyle w:val="List-Bullet-tight025"/>
-      </w:pPr>
-      <w:proofErr w:type="spellStart"/>
-      <w:r>
-        <w:t>SETax</w:t>
-      </w:r>
-      <w:proofErr w:type="spellEnd"/>
-      <w:r>
-        <w:tab/>
-      </w:r>
-      <w:r>
-        <w:tab/>
-      </w:r>
-      <w:r>
-        <w:t>Self-employment T</w:t>
-      </w:r>
-      <w:r>
-        <w:t xml:space="preserve">ax </w:t>
       </w:r>
       <w:r>
         <w:t>W</w:t>
@@ -1854,7 +1853,7 @@
         <w:szCs w:val="24"/>
         <w:lang w:eastAsia="en-US"/>
       </w:rPr>
-      <w:t>2</w:t>
+      <w:t>4</w:t>
     </w:r>
     <w:r>
       <w:rPr>
@@ -3990,7 +3989,7 @@
 </file>
 
 <file path=customXml/itemProps1.xml><?xml version="1.0" encoding="utf-8"?>
-<ds:datastoreItem xmlns:ds="http://schemas.openxmlformats.org/officeDocument/2006/customXml" ds:itemID="{CA086EC9-F7EE-490B-9393-78975AEE9A3A}">
+<ds:datastoreItem xmlns:ds="http://schemas.openxmlformats.org/officeDocument/2006/customXml" ds:itemID="{77F7840A-DE88-4A46-9E48-68D933245D49}">
   <ds:schemaRefs>
     <ds:schemaRef ds:uri="http://schemas.openxmlformats.org/officeDocument/2006/bibliography"/>
   </ds:schemaRefs>

</xml_diff>

<commit_message>
Added prototypes for common forms. Improved selectivity calculating forms.
</commit_message>
<xml_diff>
--- a/Documentation/AboutTaxPlanningTools.docx
+++ b/Documentation/AboutTaxPlanningTools.docx
@@ -679,6 +679,72 @@
         <w:pStyle w:val="Body-Text"/>
       </w:pPr>
       <w:r>
+        <w:t>Form Names:</w:t>
+      </w:r>
+    </w:p>
+    <w:p>
+      <w:pPr>
+        <w:pStyle w:val="Body-Text025"/>
+      </w:pPr>
+      <w:r>
+        <w:t>F1040 F1040S1 F1040S1A F1040S2 F1040S3 F1040SA F1040SB F1040SC F1040SD F1040SE F1040SSE F1041 F1065B F1098 F1098E F1098T F1099C F1099DIV F1099G F1099INT F1099K F1099LTC F1099MISC F1099NEC F1099OID F1099R F1099S F1120S F2441 F540 F540CA F6251 F7206 W2</w:t>
+      </w:r>
+    </w:p>
+    <w:p>
+      <w:pPr>
+        <w:pStyle w:val="Body-Text"/>
+      </w:pPr>
+      <w:r>
+        <w:t>Worksheet names:</w:t>
+      </w:r>
+    </w:p>
+    <w:p>
+      <w:pPr>
+        <w:pStyle w:val="Body-Text025"/>
+      </w:pPr>
+      <w:proofErr w:type="spellStart"/>
+      <w:r>
+        <w:t>IncTax</w:t>
+      </w:r>
+      <w:proofErr w:type="spellEnd"/>
+      <w:r>
+        <w:t xml:space="preserve"> </w:t>
+      </w:r>
+      <w:proofErr w:type="spellStart"/>
+      <w:r>
+        <w:t>SalesTax</w:t>
+      </w:r>
+      <w:proofErr w:type="spellEnd"/>
+      <w:r>
+        <w:t xml:space="preserve"> SEHI Simple </w:t>
+      </w:r>
+      <w:proofErr w:type="spellStart"/>
+      <w:r>
+        <w:t>SSTax</w:t>
+      </w:r>
+      <w:proofErr w:type="spellEnd"/>
+      <w:r>
+        <w:t xml:space="preserve"> </w:t>
+      </w:r>
+      <w:proofErr w:type="spellStart"/>
+      <w:r>
+        <w:t>CA_HiIncDeductions</w:t>
+      </w:r>
+      <w:proofErr w:type="spellEnd"/>
+      <w:r>
+        <w:t xml:space="preserve"> </w:t>
+      </w:r>
+      <w:proofErr w:type="spellStart"/>
+      <w:r>
+        <w:t>CA_HiIncExemptions</w:t>
+      </w:r>
+      <w:proofErr w:type="spellEnd"/>
+    </w:p>
+    <w:p>
+      <w:pPr>
+        <w:pStyle w:val="Body-Text"/>
+      </w:pPr>
+      <w:r>
         <w:t>By default, only the lines in a tax form</w:t>
       </w:r>
       <w:r>
@@ -698,493 +764,6 @@
       </w:r>
       <w:r>
         <w:t xml:space="preserve"> all the lines.</w:t>
-      </w:r>
-    </w:p>
-    <w:p>
-      <w:pPr>
-        <w:pStyle w:val="Body-Text"/>
-      </w:pPr>
-      <w:r>
-        <w:t xml:space="preserve">The </w:t>
-      </w:r>
-      <w:r>
-        <w:t xml:space="preserve">names of the </w:t>
-      </w:r>
-      <w:r>
-        <w:t>following form</w:t>
-      </w:r>
-      <w:r>
-        <w:t>s</w:t>
-      </w:r>
-      <w:r>
-        <w:t xml:space="preserve"> and worksheet can be </w:t>
-      </w:r>
-      <w:r>
-        <w:t>entered</w:t>
-      </w:r>
-      <w:r>
-        <w:t xml:space="preserve"> as keywords</w:t>
-      </w:r>
-      <w:r>
-        <w:t xml:space="preserve">, but </w:t>
-      </w:r>
-      <w:r>
-        <w:t>only forms and worksheets created by the tool will be shown.</w:t>
-      </w:r>
-    </w:p>
-    <w:p>
-      <w:pPr>
-        <w:pStyle w:val="Body-Text"/>
-      </w:pPr>
-      <w:r>
-        <w:t>Forms:</w:t>
-      </w:r>
-    </w:p>
-    <w:p>
-      <w:pPr>
-        <w:pStyle w:val="List-Bullet-tight025"/>
-      </w:pPr>
-      <w:r>
-        <w:t>F1040</w:t>
-      </w:r>
-      <w:r>
-        <w:tab/>
-      </w:r>
-      <w:r>
-        <w:tab/>
-      </w:r>
-      <w:r>
-        <w:t>Individual Tax Return</w:t>
-      </w:r>
-    </w:p>
-    <w:p>
-      <w:pPr>
-        <w:pStyle w:val="List-Bullet-tight025"/>
-      </w:pPr>
-      <w:r>
-        <w:t>F1040S1</w:t>
-      </w:r>
-      <w:r>
-        <w:tab/>
-      </w:r>
-      <w:r>
-        <w:t>S</w:t>
-      </w:r>
-      <w:r>
-        <w:t>chedule 1</w:t>
-      </w:r>
-      <w:r>
-        <w:t>, Additional Income and Adjustments to Income</w:t>
-      </w:r>
-    </w:p>
-    <w:p>
-      <w:pPr>
-        <w:pStyle w:val="List-Bullet-tight025"/>
-      </w:pPr>
-      <w:r>
-        <w:t>F1040S1A</w:t>
-      </w:r>
-      <w:r>
-        <w:tab/>
-      </w:r>
-      <w:r>
-        <w:t>S</w:t>
-      </w:r>
-      <w:r>
-        <w:t>chedule 1A</w:t>
-      </w:r>
-      <w:r>
-        <w:t>, Additional Deductions</w:t>
-      </w:r>
-    </w:p>
-    <w:p>
-      <w:pPr>
-        <w:pStyle w:val="List-Bullet-tight025"/>
-      </w:pPr>
-      <w:r>
-        <w:t>F1040S2</w:t>
-      </w:r>
-      <w:r>
-        <w:t xml:space="preserve"> </w:t>
-      </w:r>
-      <w:r>
-        <w:tab/>
-      </w:r>
-      <w:r>
-        <w:t>S</w:t>
-      </w:r>
-      <w:r>
-        <w:t>chedule 2</w:t>
-      </w:r>
-      <w:r>
-        <w:t>, Additional Taxes</w:t>
-      </w:r>
-    </w:p>
-    <w:p>
-      <w:pPr>
-        <w:pStyle w:val="List-Bullet-tight025"/>
-      </w:pPr>
-      <w:r>
-        <w:t>F1040S3</w:t>
-      </w:r>
-      <w:r>
-        <w:t xml:space="preserve"> </w:t>
-      </w:r>
-      <w:r>
-        <w:tab/>
-      </w:r>
-      <w:r>
-        <w:t>S</w:t>
-      </w:r>
-      <w:r>
-        <w:t>chedule 3</w:t>
-      </w:r>
-      <w:r>
-        <w:t>, Additional Credits and Payments</w:t>
-      </w:r>
-    </w:p>
-    <w:p>
-      <w:pPr>
-        <w:pStyle w:val="List-Bullet-tight025"/>
-      </w:pPr>
-      <w:r>
-        <w:t>F1040SA</w:t>
-      </w:r>
-      <w:r>
-        <w:t xml:space="preserve"> </w:t>
-      </w:r>
-      <w:r>
-        <w:tab/>
-      </w:r>
-      <w:r>
-        <w:t>S</w:t>
-      </w:r>
-      <w:r>
-        <w:t>chedule A, Itemized D</w:t>
-      </w:r>
-      <w:r>
-        <w:t>eductions</w:t>
-      </w:r>
-    </w:p>
-    <w:p>
-      <w:pPr>
-        <w:pStyle w:val="List-Bullet-tight025"/>
-      </w:pPr>
-      <w:r>
-        <w:t>F1040SC</w:t>
-      </w:r>
-      <w:r>
-        <w:tab/>
-        <w:t>Schedule C, Profit and Loss from Business</w:t>
-      </w:r>
-    </w:p>
-    <w:p>
-      <w:pPr>
-        <w:pStyle w:val="List-Bullet-tight025"/>
-      </w:pPr>
-      <w:r>
-        <w:t>F1040SSE</w:t>
-      </w:r>
-      <w:r>
-        <w:tab/>
-        <w:t xml:space="preserve">Schedule SE, </w:t>
-      </w:r>
-      <w:r>
-        <w:t>Self-employment Tax</w:t>
-      </w:r>
-    </w:p>
-    <w:p>
-      <w:pPr>
-        <w:pStyle w:val="List-Bullet-tight025"/>
-      </w:pPr>
-      <w:r>
-        <w:t>F1099G</w:t>
-      </w:r>
-    </w:p>
-    <w:p>
-      <w:pPr>
-        <w:pStyle w:val="List-Bullet-tight025"/>
-      </w:pPr>
-      <w:r>
-        <w:t>F540</w:t>
-      </w:r>
-      <w:r>
-        <w:t xml:space="preserve"> </w:t>
-      </w:r>
-      <w:r>
-        <w:tab/>
-      </w:r>
-      <w:r>
-        <w:tab/>
-        <w:t>California Resident Income Tax return</w:t>
-      </w:r>
-    </w:p>
-    <w:p>
-      <w:pPr>
-        <w:pStyle w:val="List-Bullet-tight025"/>
-      </w:pPr>
-      <w:r>
-        <w:t>F540CA</w:t>
-      </w:r>
-      <w:r>
-        <w:tab/>
-      </w:r>
-      <w:r>
-        <w:tab/>
-      </w:r>
-      <w:r>
-        <w:t>California Adjustments</w:t>
-      </w:r>
-      <w:r>
-        <w:t xml:space="preserve"> - Residents</w:t>
-      </w:r>
-    </w:p>
-    <w:p>
-      <w:pPr>
-        <w:pStyle w:val="List-Bullet-tight025"/>
-      </w:pPr>
-      <w:r>
-        <w:t>F6251</w:t>
-      </w:r>
-      <w:r>
-        <w:tab/>
-      </w:r>
-      <w:r>
-        <w:tab/>
-        <w:t xml:space="preserve">Alternative Minimum Tax </w:t>
-      </w:r>
-      <w:r>
-        <w:t>–</w:t>
-      </w:r>
-      <w:r>
-        <w:t xml:space="preserve"> Individual</w:t>
-      </w:r>
-    </w:p>
-    <w:p>
-      <w:pPr>
-        <w:pStyle w:val="List-Bullet-tight025"/>
-      </w:pPr>
-      <w:r>
-        <w:t>F7206</w:t>
-      </w:r>
-      <w:r>
-        <w:tab/>
-      </w:r>
-      <w:r>
-        <w:tab/>
-      </w:r>
-      <w:r>
-        <w:t>Self-employment Health Insurance Deduction</w:t>
-      </w:r>
-    </w:p>
-    <w:p>
-      <w:pPr>
-        <w:pStyle w:val="List-Bullet-tight025"/>
-      </w:pPr>
-      <w:r>
-        <w:t>W2</w:t>
-      </w:r>
-      <w:r>
-        <w:tab/>
-      </w:r>
-      <w:r>
-        <w:tab/>
-      </w:r>
-      <w:r>
-        <w:t>Wage and Tax Statement</w:t>
-      </w:r>
-    </w:p>
-    <w:p>
-      <w:pPr>
-        <w:pStyle w:val="List-Bullet-tight025"/>
-        <w:numPr>
-          <w:ilvl w:val="0"/>
-          <w:numId w:val="0"/>
-        </w:numPr>
-        <w:ind w:left="1440"/>
-      </w:pPr>
-    </w:p>
-    <w:p>
-      <w:pPr>
-        <w:pStyle w:val="Body-Text"/>
-      </w:pPr>
-      <w:r>
-        <w:t>Worksheets:</w:t>
-      </w:r>
-    </w:p>
-    <w:p>
-      <w:pPr>
-        <w:pStyle w:val="List-Bullet-tight025"/>
-      </w:pPr>
-      <w:proofErr w:type="spellStart"/>
-      <w:r>
-        <w:t>IncTax</w:t>
-      </w:r>
-      <w:proofErr w:type="spellEnd"/>
-      <w:r>
-        <w:tab/>
-      </w:r>
-      <w:r>
-        <w:tab/>
-      </w:r>
-      <w:r>
-        <w:t>Qualified Dividends and Capital Gain Tax Worksheet</w:t>
-      </w:r>
-    </w:p>
-    <w:p>
-      <w:pPr>
-        <w:pStyle w:val="List-Bullet-tight025"/>
-      </w:pPr>
-      <w:proofErr w:type="spellStart"/>
-      <w:r>
-        <w:t>SalesTax</w:t>
-      </w:r>
-      <w:proofErr w:type="spellEnd"/>
-      <w:r>
-        <w:tab/>
-      </w:r>
-      <w:r>
-        <w:t>State and Local General Sales Tax Deduction Worksheet</w:t>
-      </w:r>
-    </w:p>
-    <w:p>
-      <w:pPr>
-        <w:pStyle w:val="List-Bullet-tight025"/>
-      </w:pPr>
-      <w:r>
-        <w:t>SE</w:t>
-      </w:r>
-      <w:r>
-        <w:t>HI</w:t>
-      </w:r>
-      <w:r>
-        <w:tab/>
-      </w:r>
-      <w:r>
-        <w:tab/>
-      </w:r>
-      <w:r>
-        <w:t>S</w:t>
-      </w:r>
-      <w:r>
-        <w:t xml:space="preserve">elf-employment </w:t>
-      </w:r>
-      <w:r>
-        <w:t>Health I</w:t>
-      </w:r>
-      <w:r>
-        <w:t>nsurance</w:t>
-      </w:r>
-      <w:r>
-        <w:t xml:space="preserve"> </w:t>
-      </w:r>
-      <w:r>
-        <w:t>W</w:t>
-      </w:r>
-      <w:r>
-        <w:t>orksheet</w:t>
-      </w:r>
-    </w:p>
-    <w:p>
-      <w:pPr>
-        <w:pStyle w:val="List-Bullet-tight025"/>
-      </w:pPr>
-      <w:r>
-        <w:t>Simple</w:t>
-      </w:r>
-      <w:r>
-        <w:tab/>
-      </w:r>
-      <w:r>
-        <w:tab/>
-      </w:r>
-      <w:r>
-        <w:t>Simplified Method Worksheet</w:t>
-      </w:r>
-    </w:p>
-    <w:p>
-      <w:pPr>
-        <w:pStyle w:val="List-Bullet-tight025"/>
-      </w:pPr>
-      <w:proofErr w:type="spellStart"/>
-      <w:r>
-        <w:t>SSTax</w:t>
-      </w:r>
-      <w:proofErr w:type="spellEnd"/>
-      <w:r>
-        <w:tab/>
-      </w:r>
-      <w:r>
-        <w:tab/>
-      </w:r>
-      <w:r>
-        <w:t>Social Security Benefits Worksheet</w:t>
-      </w:r>
-    </w:p>
-    <w:p>
-      <w:pPr>
-        <w:pStyle w:val="List-Bullet-tight025"/>
-      </w:pPr>
-      <w:proofErr w:type="spellStart"/>
-      <w:r>
-        <w:t>StateRefund</w:t>
-      </w:r>
-      <w:proofErr w:type="spellEnd"/>
-      <w:r>
-        <w:tab/>
-      </w:r>
-      <w:r>
-        <w:t>State and Local Income Tax Refund Worksheet</w:t>
-      </w:r>
-    </w:p>
-    <w:p>
-      <w:pPr>
-        <w:pStyle w:val="List-Bullet-tight025"/>
-      </w:pPr>
-      <w:proofErr w:type="spellStart"/>
-      <w:r>
-        <w:t>CA_HiIncDeductions</w:t>
-      </w:r>
-      <w:proofErr w:type="spellEnd"/>
-      <w:r>
-        <w:tab/>
-      </w:r>
-      <w:r>
-        <w:t xml:space="preserve">California Itemized Deductions Worksheet for </w:t>
-      </w:r>
-      <w:r>
-        <w:t>High I</w:t>
-      </w:r>
-      <w:r>
-        <w:t>ncomes</w:t>
-      </w:r>
-    </w:p>
-    <w:p>
-      <w:pPr>
-        <w:pStyle w:val="List-Bullet-tight025"/>
-      </w:pPr>
-      <w:proofErr w:type="spellStart"/>
-      <w:r>
-        <w:t>CA_HiIncExemptions</w:t>
-      </w:r>
-      <w:proofErr w:type="spellEnd"/>
-      <w:r>
-        <w:tab/>
-      </w:r>
-      <w:r>
-        <w:t xml:space="preserve">California </w:t>
-      </w:r>
-      <w:r>
-        <w:t>Exemptions</w:t>
-      </w:r>
-      <w:r>
-        <w:t xml:space="preserve"> Worksheet for </w:t>
-      </w:r>
-      <w:r>
-        <w:t>High I</w:t>
-      </w:r>
-      <w:r>
-        <w:t>ncomes</w:t>
       </w:r>
     </w:p>
     <w:p>
@@ -1195,7 +774,6 @@
       <w:bookmarkStart w:id="6" w:name="_Toc231285049"/>
       <w:bookmarkStart w:id="7" w:name="_Toc228630161"/>
       <w:r>
-        <w:lastRenderedPageBreak/>
         <w:t>Version Numbers</w:t>
       </w:r>
       <w:bookmarkEnd w:id="5"/>
@@ -1328,91 +906,80 @@
         <w:pStyle w:val="Body-Text"/>
       </w:pPr>
       <w:r>
+        <w:lastRenderedPageBreak/>
         <w:t>In summary:</w:t>
       </w:r>
     </w:p>
     <w:p>
       <w:pPr>
+        <w:pStyle w:val="List-Bullet025"/>
+      </w:pPr>
+      <w:r>
+        <w:t>The first part of the version number is incremented each tax year.</w:t>
+      </w:r>
+    </w:p>
+    <w:p>
+      <w:pPr>
+        <w:pStyle w:val="List-Bullet025"/>
+      </w:pPr>
+      <w:r>
+        <w:t>The second part of the version number is incremented whenever the development version is merged into the released version.</w:t>
+      </w:r>
+    </w:p>
+    <w:p>
+      <w:pPr>
+        <w:pStyle w:val="List-Bullet025"/>
+      </w:pPr>
+      <w:r>
+        <w:t>And, the third part is incremented whenever the source code is changed.</w:t>
+      </w:r>
+    </w:p>
+    <w:p>
+      <w:pPr>
         <w:pStyle w:val="Body-Text"/>
-        <w:numPr>
-          <w:ilvl w:val="0"/>
-          <w:numId w:val="6"/>
-        </w:numPr>
-      </w:pPr>
-      <w:r>
-        <w:t>The first part of the version number is incremented each tax year.</w:t>
+      </w:pPr>
+      <w:r>
+        <w:t>T</w:t>
+      </w:r>
+      <w:r>
+        <w:t xml:space="preserve">he version number </w:t>
+      </w:r>
+      <w:r>
+        <w:t xml:space="preserve">of the development version is always appended with </w:t>
+      </w:r>
+      <w:proofErr w:type="gramStart"/>
+      <w:r>
+        <w:t xml:space="preserve">an </w:t>
+      </w:r>
+      <w:r>
+        <w:t>at</w:t>
+      </w:r>
+      <w:proofErr w:type="gramEnd"/>
+      <w:r>
+        <w:t xml:space="preserve"> sign (@) </w:t>
+      </w:r>
+      <w:r>
+        <w:t xml:space="preserve">to call attention to the </w:t>
+      </w:r>
+      <w:r>
+        <w:t>fact that that version</w:t>
+      </w:r>
+      <w:r>
+        <w:t xml:space="preserve"> </w:t>
+      </w:r>
+      <w:r>
+        <w:t>is under development</w:t>
+      </w:r>
+      <w:r>
+        <w:t xml:space="preserve"> and </w:t>
+      </w:r>
+      <w:r>
+        <w:t>not ready to be used.</w:t>
       </w:r>
     </w:p>
     <w:p>
       <w:pPr>
         <w:pStyle w:val="Body-Text"/>
-        <w:numPr>
-          <w:ilvl w:val="0"/>
-          <w:numId w:val="6"/>
-        </w:numPr>
-      </w:pPr>
-      <w:r>
-        <w:t>The second part of the version number is incremented whenever the development version is merged into the released version.</w:t>
-      </w:r>
-    </w:p>
-    <w:p>
-      <w:pPr>
-        <w:pStyle w:val="Body-Text"/>
-        <w:numPr>
-          <w:ilvl w:val="0"/>
-          <w:numId w:val="6"/>
-        </w:numPr>
-      </w:pPr>
-      <w:r>
-        <w:t>And, the third part is incremented whenever the source code is changed.</w:t>
-      </w:r>
-    </w:p>
-    <w:p>
-      <w:pPr>
-        <w:pStyle w:val="Body-Text"/>
-      </w:pPr>
-      <w:r>
-        <w:t>T</w:t>
-      </w:r>
-      <w:r>
-        <w:t xml:space="preserve">he version number </w:t>
-      </w:r>
-      <w:r>
-        <w:t xml:space="preserve">of the development version is always appended with </w:t>
-      </w:r>
-      <w:proofErr w:type="gramStart"/>
-      <w:r>
-        <w:t xml:space="preserve">an </w:t>
-      </w:r>
-      <w:r>
-        <w:t>at</w:t>
-      </w:r>
-      <w:proofErr w:type="gramEnd"/>
-      <w:r>
-        <w:t xml:space="preserve"> sign (@) </w:t>
-      </w:r>
-      <w:r>
-        <w:t xml:space="preserve">to call attention to the </w:t>
-      </w:r>
-      <w:r>
-        <w:t>fact that that version</w:t>
-      </w:r>
-      <w:r>
-        <w:t xml:space="preserve"> </w:t>
-      </w:r>
-      <w:r>
-        <w:t>is under development</w:t>
-      </w:r>
-      <w:r>
-        <w:t xml:space="preserve"> and </w:t>
-      </w:r>
-      <w:r>
-        <w:t>not ready to be used.</w:t>
-      </w:r>
-    </w:p>
-    <w:p>
-      <w:pPr>
-        <w:pStyle w:val="Body-Text"/>
       </w:pPr>
       <w:r>
         <w:t>Whenever the version number is shown in one of the tools, it is a link that you can click</w:t>
@@ -1542,79 +1109,79 @@
         <w:pStyle w:val="Heading3"/>
       </w:pPr>
       <w:r>
+        <w:t>Social Security - Taxable Benefits Calculator</w:t>
+      </w:r>
+    </w:p>
+    <w:p>
+      <w:pPr>
+        <w:pStyle w:val="List-Bullet025"/>
+      </w:pPr>
+      <w:r>
+        <w:t>See the description for the Adjustments field in the help file. There are a few adjustments that may not be handled correctly by this tool.</w:t>
+      </w:r>
+    </w:p>
+    <w:p>
+      <w:pPr>
+        <w:pStyle w:val="List-Bullet025"/>
+      </w:pPr>
+      <w:r>
+        <w:t>If you are a non-resident alien, do not use this calculator; the taxable percentage of your Social Security is 85%.</w:t>
+      </w:r>
+    </w:p>
+    <w:p>
+      <w:pPr>
+        <w:pStyle w:val="Heading3"/>
+      </w:pPr>
+      <w:r>
+        <w:t>Social Security Lump Sum Calculator</w:t>
+      </w:r>
+    </w:p>
+    <w:p>
+      <w:pPr>
+        <w:pStyle w:val="List-Bullet025"/>
+      </w:pPr>
+      <w:r>
+        <w:t>See the description for the Adjustments field. There are several adjustments that may not be handled correctly by this tool.</w:t>
+      </w:r>
+    </w:p>
+    <w:p>
+      <w:pPr>
+        <w:pStyle w:val="List-Bullet025"/>
+      </w:pPr>
+      <w:r>
+        <w:t>If you are a non-resident alien, do not use this tool; the taxable percentage of your Social Security is 85%.</w:t>
+      </w:r>
+    </w:p>
+    <w:p>
+      <w:pPr>
+        <w:pStyle w:val="List-Bullet025"/>
+      </w:pPr>
+      <w:r>
+        <w:t>If you are filing Married Filing Separately and you lived with your spouse at anytime during the tax year, do not use this tool; the taxable percentage of your Social Security is 85%.</w:t>
+      </w:r>
+    </w:p>
+    <w:p>
+      <w:pPr>
+        <w:pStyle w:val="Heading3"/>
+      </w:pPr>
+      <w:r>
+        <w:t>State Tax Refund Calculator</w:t>
+      </w:r>
+    </w:p>
+    <w:p>
+      <w:pPr>
+        <w:pStyle w:val="List-Bullet025"/>
+      </w:pPr>
+      <w:r>
+        <w:t>Does not take into account that MFS may be required to itemize deductions.</w:t>
+      </w:r>
+    </w:p>
+    <w:p>
+      <w:pPr>
+        <w:pStyle w:val="Heading1"/>
+      </w:pPr>
+      <w:r>
         <w:lastRenderedPageBreak/>
-        <w:t>Social Security - Taxable Benefits Calculator</w:t>
-      </w:r>
-    </w:p>
-    <w:p>
-      <w:pPr>
-        <w:pStyle w:val="List-Bullet025"/>
-      </w:pPr>
-      <w:r>
-        <w:t>See the description for the Adjustments field in the help file. There are a few adjustments that may not be handled correctly by this tool.</w:t>
-      </w:r>
-    </w:p>
-    <w:p>
-      <w:pPr>
-        <w:pStyle w:val="List-Bullet025"/>
-      </w:pPr>
-      <w:r>
-        <w:t>If you are a non-resident alien, do not use this calculator; the taxable percentage of your Social Security is 85%.</w:t>
-      </w:r>
-    </w:p>
-    <w:p>
-      <w:pPr>
-        <w:pStyle w:val="Heading3"/>
-      </w:pPr>
-      <w:r>
-        <w:t>Social Security Lump Sum Calculator</w:t>
-      </w:r>
-    </w:p>
-    <w:p>
-      <w:pPr>
-        <w:pStyle w:val="List-Bullet025"/>
-      </w:pPr>
-      <w:r>
-        <w:t>See the description for the Adjustments field. There are several adjustments that may not be handled correctly by this tool.</w:t>
-      </w:r>
-    </w:p>
-    <w:p>
-      <w:pPr>
-        <w:pStyle w:val="List-Bullet025"/>
-      </w:pPr>
-      <w:r>
-        <w:t>If you are a non-resident alien, do not use this tool; the taxable percentage of your Social Security is 85%.</w:t>
-      </w:r>
-    </w:p>
-    <w:p>
-      <w:pPr>
-        <w:pStyle w:val="List-Bullet025"/>
-      </w:pPr>
-      <w:r>
-        <w:t>If you are filing Married Filing Separately and you lived with your spouse at anytime during the tax year, do not use this tool; the taxable percentage of your Social Security is 85%.</w:t>
-      </w:r>
-    </w:p>
-    <w:p>
-      <w:pPr>
-        <w:pStyle w:val="Heading3"/>
-      </w:pPr>
-      <w:r>
-        <w:t>State Tax Refund Calculator</w:t>
-      </w:r>
-    </w:p>
-    <w:p>
-      <w:pPr>
-        <w:pStyle w:val="List-Bullet025"/>
-      </w:pPr>
-      <w:r>
-        <w:t>Does not take into account that MFS may be required to itemize deductions.</w:t>
-      </w:r>
-    </w:p>
-    <w:p>
-      <w:pPr>
-        <w:pStyle w:val="Heading1"/>
-      </w:pPr>
-      <w:r>
         <w:t xml:space="preserve">Changes I'm Thinking </w:t>
       </w:r>
       <w:r>
@@ -1861,7 +1428,7 @@
         <w:szCs w:val="24"/>
         <w:lang w:eastAsia="en-US"/>
       </w:rPr>
-      <w:t>2</w:t>
+      <w:t>4</w:t>
     </w:r>
     <w:r>
       <w:rPr>
@@ -3997,7 +3564,7 @@
 </file>
 
 <file path=customXml/itemProps1.xml><?xml version="1.0" encoding="utf-8"?>
-<ds:datastoreItem xmlns:ds="http://schemas.openxmlformats.org/officeDocument/2006/customXml" ds:itemID="{50ED884A-D6D0-4F18-9952-C68DC198717C}">
+<ds:datastoreItem xmlns:ds="http://schemas.openxmlformats.org/officeDocument/2006/customXml" ds:itemID="{12A3F4BF-F63F-484F-9F1C-7A2EEB79E4C7}">
   <ds:schemaRefs>
     <ds:schemaRef ds:uri="http://schemas.openxmlformats.org/officeDocument/2006/bibliography"/>
   </ds:schemaRefs>

</xml_diff>

<commit_message>
Changes to get TaxProgram working.
</commit_message>
<xml_diff>
--- a/Documentation/AboutTaxPlanningTools.docx
+++ b/Documentation/AboutTaxPlanningTools.docx
@@ -39,7 +39,7 @@
           <w:rPr>
             <w:noProof/>
           </w:rPr>
-          <w:t>July 21, 2026</w:t>
+          <w:t>August 16, 2026</w:t>
         </w:r>
       </w:fldSimple>
     </w:p>
@@ -197,6 +197,16 @@
       <w:r>
         <w:t>State Income Tax Refund Calculator</w:t>
       </w:r>
+    </w:p>
+    <w:p>
+      <w:pPr>
+        <w:pStyle w:val="Body-Text-tight025"/>
+      </w:pPr>
+      <w:proofErr w:type="spellStart"/>
+      <w:r>
+        <w:t>TaxProgram</w:t>
+      </w:r>
+      <w:proofErr w:type="spellEnd"/>
     </w:p>
     <w:p>
       <w:pPr>
@@ -1174,6 +1184,32 @@
       </w:pPr>
       <w:r>
         <w:t>Does not take into account that MFS may be required to itemize deductions.</w:t>
+      </w:r>
+    </w:p>
+    <w:p>
+      <w:pPr>
+        <w:pStyle w:val="Heading3"/>
+      </w:pPr>
+      <w:proofErr w:type="spellStart"/>
+      <w:r>
+        <w:t>TaxProgram</w:t>
+      </w:r>
+      <w:proofErr w:type="spellEnd"/>
+    </w:p>
+    <w:p>
+      <w:pPr>
+        <w:pStyle w:val="List-Bullet025"/>
+      </w:pPr>
+      <w:r>
+        <w:t xml:space="preserve">Checkboxes in output forms are not </w:t>
+      </w:r>
+      <w:proofErr w:type="spellStart"/>
+      <w:r>
+        <w:t>readonly</w:t>
+      </w:r>
+      <w:proofErr w:type="spellEnd"/>
+      <w:r>
+        <w:t>.</w:t>
       </w:r>
     </w:p>
     <w:p>
@@ -3564,7 +3600,7 @@
 </file>
 
 <file path=customXml/itemProps1.xml><?xml version="1.0" encoding="utf-8"?>
-<ds:datastoreItem xmlns:ds="http://schemas.openxmlformats.org/officeDocument/2006/customXml" ds:itemID="{12A3F4BF-F63F-484F-9F1C-7A2EEB79E4C7}">
+<ds:datastoreItem xmlns:ds="http://schemas.openxmlformats.org/officeDocument/2006/customXml" ds:itemID="{A0260166-49B3-4565-BFBD-52EA0739D7C2}">
   <ds:schemaRefs>
     <ds:schemaRef ds:uri="http://schemas.openxmlformats.org/officeDocument/2006/bibliography"/>
   </ds:schemaRefs>

</xml_diff>

<commit_message>
Git save file working in TaxProgram
</commit_message>
<xml_diff>
--- a/Documentation/AboutTaxPlanningTools.docx
+++ b/Documentation/AboutTaxPlanningTools.docx
@@ -1,6 +1,6 @@
 
 <file path=word/document.xml><?xml version="1.0" encoding="utf-8"?>
-<w:document xmlns:ve="http://schemas.openxmlformats.org/markup-compatibility/2006" xmlns:o="urn:schemas-microsoft-com:office:office" xmlns:r="http://schemas.openxmlformats.org/officeDocument/2006/relationships" xmlns:m="http://schemas.openxmlformats.org/officeDocument/2006/math" xmlns:v="urn:schemas-microsoft-com:vml" xmlns:wp="http://schemas.openxmlformats.org/drawingml/2006/wordprocessingDrawing" xmlns:w10="urn:schemas-microsoft-com:office:word" xmlns:w="http://schemas.openxmlformats.org/wordprocessingml/2006/main" xmlns:wne="http://schemas.microsoft.com/office/word/2006/wordml">
+<w:document xmlns:wpc="http://schemas.microsoft.com/office/word/2010/wordprocessingCanvas" xmlns:cx="http://schemas.microsoft.com/office/drawing/2014/chartex" xmlns:cx1="http://schemas.microsoft.com/office/drawing/2015/9/8/chartex" xmlns:cx2="http://schemas.microsoft.com/office/drawing/2015/10/21/chartex" xmlns:cx3="http://schemas.microsoft.com/office/drawing/2016/5/9/chartex" xmlns:cx4="http://schemas.microsoft.com/office/drawing/2016/5/10/chartex" xmlns:cx5="http://schemas.microsoft.com/office/drawing/2016/5/11/chartex" xmlns:cx6="http://schemas.microsoft.com/office/drawing/2016/5/12/chartex" xmlns:cx7="http://schemas.microsoft.com/office/drawing/2016/5/13/chartex" xmlns:cx8="http://schemas.microsoft.com/office/drawing/2016/5/14/chartex" xmlns:mc="http://schemas.openxmlformats.org/markup-compatibility/2006" xmlns:aink="http://schemas.microsoft.com/office/drawing/2016/ink" xmlns:am3d="http://schemas.microsoft.com/office/drawing/2017/model3d" xmlns:o="urn:schemas-microsoft-com:office:office" xmlns:oel="http://schemas.microsoft.com/office/2019/extlst" xmlns:r="http://schemas.openxmlformats.org/officeDocument/2006/relationships" xmlns:m="http://schemas.openxmlformats.org/officeDocument/2006/math" xmlns:v="urn:schemas-microsoft-com:vml" xmlns:wp14="http://schemas.microsoft.com/office/word/2010/wordprocessingDrawing" xmlns:wp="http://schemas.openxmlformats.org/drawingml/2006/wordprocessingDrawing" xmlns:w10="urn:schemas-microsoft-com:office:word" xmlns:w="http://schemas.openxmlformats.org/wordprocessingml/2006/main" xmlns:w14="http://schemas.microsoft.com/office/word/2010/wordml" xmlns:w15="http://schemas.microsoft.com/office/word/2012/wordml" xmlns:w16cex="http://schemas.microsoft.com/office/word/2018/wordml/cex" xmlns:w16cid="http://schemas.microsoft.com/office/word/2016/wordml/cid" xmlns:w16="http://schemas.microsoft.com/office/word/2018/wordml" xmlns:w16du="http://schemas.microsoft.com/office/word/2023/wordml/word16du" xmlns:w16sdtdh="http://schemas.microsoft.com/office/word/2020/wordml/sdtdatahash" xmlns:w16sdtfl="http://schemas.microsoft.com/office/word/2024/wordml/sdtformatlock" xmlns:w16se="http://schemas.microsoft.com/office/word/2015/wordml/symex" xmlns:wpg="http://schemas.microsoft.com/office/word/2010/wordprocessingGroup" xmlns:wpi="http://schemas.microsoft.com/office/word/2010/wordprocessingInk" xmlns:wne="http://schemas.microsoft.com/office/word/2006/wordml" xmlns:wps="http://schemas.microsoft.com/office/word/2010/wordprocessingShape" mc:Ignorable="w14 w15 w16se w16cid w16 w16cex w16sdtdh w16sdtfl w16du wp14">
   <w:body>
     <w:p>
       <w:pPr>
@@ -34,14 +34,27 @@
       <w:r>
         <w:t xml:space="preserve">: </w:t>
       </w:r>
-      <w:fldSimple w:instr=" SAVEDATE  \@ &quot;MMMM d, yyyy&quot;  \* MERGEFORMAT ">
-        <w:r>
-          <w:rPr>
-            <w:noProof/>
-          </w:rPr>
-          <w:t>August 16, 2026</w:t>
-        </w:r>
-      </w:fldSimple>
+      <w:r>
+        <w:fldChar w:fldCharType="begin"/>
+      </w:r>
+      <w:r>
+        <w:instrText xml:space="preserve"> SAVEDATE  \@ "MMMM d, yyyy"  \* MERGEFORMAT </w:instrText>
+      </w:r>
+      <w:r>
+        <w:fldChar w:fldCharType="separate"/>
+      </w:r>
+      <w:r>
+        <w:rPr>
+          <w:noProof/>
+        </w:rPr>
+        <w:t>August 31, 2026</w:t>
+      </w:r>
+      <w:r>
+        <w:rPr>
+          <w:noProof/>
+        </w:rPr>
+        <w:fldChar w:fldCharType="end"/>
+      </w:r>
     </w:p>
     <w:p>
       <w:pPr>
@@ -202,11 +215,15 @@
       <w:pPr>
         <w:pStyle w:val="Body-Text-tight025"/>
       </w:pPr>
-      <w:proofErr w:type="spellStart"/>
-      <w:r>
-        <w:t>TaxProgram</w:t>
-      </w:r>
-      <w:proofErr w:type="spellEnd"/>
+      <w:r>
+        <w:t>Tax</w:t>
+      </w:r>
+      <w:r>
+        <w:t xml:space="preserve"> </w:t>
+      </w:r>
+      <w:r>
+        <w:t>Program</w:t>
+      </w:r>
     </w:p>
     <w:p>
       <w:pPr>
@@ -543,6 +560,36 @@
       </w:pPr>
       <w:bookmarkStart w:id="4" w:name="_Toc231285048"/>
       <w:r>
+        <w:t>Default Values</w:t>
+      </w:r>
+    </w:p>
+    <w:p>
+      <w:pPr>
+        <w:pStyle w:val="Body-Text"/>
+      </w:pPr>
+      <w:r>
+        <w:t>When a field expecting a numeric value is left blank, its value defaults to zero (0). When you enter a value in a field, that value will be used in any calculation even if the tool calculates a different value for that field. Most of the time, this behavior is what you expect to happen</w:t>
+      </w:r>
+      <w:r>
+        <w:t>; after all, if you enter a value, you expect it to be used.</w:t>
+      </w:r>
+    </w:p>
+    <w:p>
+      <w:pPr>
+        <w:pStyle w:val="Body-Text"/>
+      </w:pPr>
+      <w:r>
+        <w:t>The Tax Program tool created a new problem. In that tool, you can enter just about any value in any field of any form. Any fields that do not have an entry will be calculated according to the rules for that form.</w:t>
+      </w:r>
+      <w:r>
+        <w:t xml:space="preserve"> Now, a field where you enter zero (0) means that you want it to stay zero (0) and not be calculated. Thus, an explicitly entered zero (0) and a default value of zero (0) are treated differently. Therefore, when removing a value from a field, delete the entry rather than replacing the old value with zero (0). A field that does not have an entry will display the default value in gray characters. A field where you have entered a value will display the value in dark characters.</w:t>
+      </w:r>
+    </w:p>
+    <w:p>
+      <w:pPr>
+        <w:pStyle w:val="Heading2"/>
+      </w:pPr>
+      <w:r>
         <w:t xml:space="preserve">Debugging </w:t>
       </w:r>
       <w:r>
@@ -784,6 +831,7 @@
       <w:bookmarkStart w:id="6" w:name="_Toc231285049"/>
       <w:bookmarkStart w:id="7" w:name="_Toc228630161"/>
       <w:r>
+        <w:lastRenderedPageBreak/>
         <w:t>Version Numbers</w:t>
       </w:r>
       <w:bookmarkEnd w:id="5"/>
@@ -916,8 +964,202 @@
         <w:pStyle w:val="Body-Text"/>
       </w:pPr>
       <w:r>
+        <w:t>In summary:</w:t>
+      </w:r>
+    </w:p>
+    <w:p>
+      <w:pPr>
+        <w:pStyle w:val="List-Bullet025"/>
+      </w:pPr>
+      <w:r>
+        <w:t>The first part of the version number is incremented each tax year.</w:t>
+      </w:r>
+    </w:p>
+    <w:p>
+      <w:pPr>
+        <w:pStyle w:val="List-Bullet025"/>
+      </w:pPr>
+      <w:r>
+        <w:t>The second part of the version number is incremented whenever the development version is merged into the released version.</w:t>
+      </w:r>
+    </w:p>
+    <w:p>
+      <w:pPr>
+        <w:pStyle w:val="List-Bullet025"/>
+      </w:pPr>
+      <w:r>
+        <w:t>And, the third part is incremented whenever the source code is changed.</w:t>
+      </w:r>
+    </w:p>
+    <w:p>
+      <w:pPr>
+        <w:pStyle w:val="Body-Text"/>
+      </w:pPr>
+      <w:r>
+        <w:t>T</w:t>
+      </w:r>
+      <w:r>
+        <w:t xml:space="preserve">he version number </w:t>
+      </w:r>
+      <w:r>
+        <w:t xml:space="preserve">of the development version is always appended with an </w:t>
+      </w:r>
+      <w:r>
+        <w:t xml:space="preserve">at sign (@) </w:t>
+      </w:r>
+      <w:r>
+        <w:t xml:space="preserve">to call attention to the </w:t>
+      </w:r>
+      <w:r>
+        <w:t>fact that that version</w:t>
+      </w:r>
+      <w:r>
+        <w:t xml:space="preserve"> </w:t>
+      </w:r>
+      <w:r>
+        <w:t>is under development</w:t>
+      </w:r>
+      <w:r>
+        <w:t xml:space="preserve"> and </w:t>
+      </w:r>
+      <w:r>
+        <w:t>not ready to be used.</w:t>
+      </w:r>
+    </w:p>
+    <w:p>
+      <w:pPr>
+        <w:pStyle w:val="Body-Text"/>
+      </w:pPr>
+      <w:r>
+        <w:t>Whenever the version number is shown in one of the tools, it is a link that you can click</w:t>
+      </w:r>
+      <w:r>
+        <w:t xml:space="preserve"> on</w:t>
+      </w:r>
+      <w:r>
+        <w:t xml:space="preserve"> to show the version history information.</w:t>
+      </w:r>
+    </w:p>
+    <w:p>
+      <w:pPr>
+        <w:pStyle w:val="Heading1"/>
+      </w:pPr>
+      <w:bookmarkStart w:id="8" w:name="_Toc231285050"/>
+      <w:r>
+        <w:t>Issues, Limitations, and Known Problems</w:t>
+      </w:r>
+    </w:p>
+    <w:p>
+      <w:pPr>
+        <w:pStyle w:val="Heading3"/>
+      </w:pPr>
+      <w:r>
+        <w:t>California Sales Tax Calculator and California Sales Tax Deduction Calculator</w:t>
+      </w:r>
+    </w:p>
+    <w:p>
+      <w:pPr>
+        <w:pStyle w:val="List-Bullet025"/>
+      </w:pPr>
+      <w:r>
+        <w:t>These calculators can only calculate the sales tax for addresses in California.</w:t>
+      </w:r>
+    </w:p>
+    <w:p>
+      <w:pPr>
+        <w:pStyle w:val="Heading3"/>
+      </w:pPr>
+      <w:r>
+        <w:t>Estimated Tax Calculator (Federal)</w:t>
+      </w:r>
+    </w:p>
+    <w:p>
+      <w:pPr>
+        <w:pStyle w:val="List-Bullet025"/>
+      </w:pPr>
+      <w:r>
+        <w:t>Does not support blind taxpayer or spouse.</w:t>
+      </w:r>
+    </w:p>
+    <w:p>
+      <w:pPr>
+        <w:pStyle w:val="List-Bullet025"/>
+      </w:pPr>
+      <w:r>
+        <w:t>Does not support small business (schedule C).</w:t>
+      </w:r>
+    </w:p>
+    <w:p>
+      <w:pPr>
+        <w:pStyle w:val="List-Bullet025"/>
+      </w:pPr>
+      <w:r>
+        <w:t>Does not support dependents.</w:t>
+      </w:r>
+    </w:p>
+    <w:p>
+      <w:pPr>
+        <w:pStyle w:val="List-Bullet025"/>
+      </w:pPr>
+      <w:r>
+        <w:t>Allows you to enter the amount of credits, but does not calculate CTC or EIC or any other credit.</w:t>
+      </w:r>
+    </w:p>
+    <w:p>
+      <w:pPr>
+        <w:pStyle w:val="Heading3"/>
+      </w:pPr>
+      <w:r>
+        <w:t>Small Business Tax Calculator</w:t>
+      </w:r>
+    </w:p>
+    <w:p>
+      <w:pPr>
+        <w:pStyle w:val="List-Bullet025"/>
+      </w:pPr>
+      <w:r>
+        <w:t>The QBI calculation does not agree with TaxSlayer???</w:t>
+      </w:r>
+    </w:p>
+    <w:p>
+      <w:pPr>
+        <w:pStyle w:val="List-Bullet025"/>
+      </w:pPr>
+      <w:r>
+        <w:t>Long Term Care insurance is not separated out from medical insurance. If medical insurance includes premiums for long term care insurance, the amount entered needs to be limited by age.</w:t>
+      </w:r>
+    </w:p>
+    <w:p>
+      <w:pPr>
+        <w:pStyle w:val="List-Bullet025"/>
+      </w:pPr>
+      <w:r>
+        <w:t>This tool does not handle church employees or farm income.</w:t>
+      </w:r>
+    </w:p>
+    <w:p>
+      <w:pPr>
+        <w:pStyle w:val="List-Bullet025"/>
+      </w:pPr>
+      <w:r>
+        <w:t>The calculation will not be correct if the amount of business income plus wages is greater than the maximum amount subject to Social Security taxes.</w:t>
+      </w:r>
+    </w:p>
+    <w:p>
+      <w:pPr>
+        <w:pStyle w:val="List-Bullet025"/>
+      </w:pPr>
+      <w:r>
+        <w:t>The QBI deduction phases out at $201,775, which is not accounted for in the tool.</w:t>
+      </w:r>
+    </w:p>
+    <w:p>
+      <w:pPr>
+        <w:pStyle w:val="Heading3"/>
+      </w:pPr>
+      <w:r>
         <w:lastRenderedPageBreak/>
-        <w:t>In summary:</w:t>
+        <w:t>Social Security - Taxable Benefits Calculator</w:t>
       </w:r>
     </w:p>
     <w:p>
@@ -925,7 +1167,7 @@
         <w:pStyle w:val="List-Bullet025"/>
       </w:pPr>
       <w:r>
-        <w:t>The first part of the version number is incremented each tax year.</w:t>
+        <w:t>See the description for the Adjustments field in the help file. There are a few adjustments that may not be handled correctly by this tool.</w:t>
       </w:r>
     </w:p>
     <w:p>
@@ -933,7 +1175,15 @@
         <w:pStyle w:val="List-Bullet025"/>
       </w:pPr>
       <w:r>
-        <w:t>The second part of the version number is incremented whenever the development version is merged into the released version.</w:t>
+        <w:t>If you are a non-resident alien, do not use this calculator; the taxable percentage of your Social Security is 85%.</w:t>
+      </w:r>
+    </w:p>
+    <w:p>
+      <w:pPr>
+        <w:pStyle w:val="Heading3"/>
+      </w:pPr>
+      <w:r>
+        <w:t>Social Security Lump Sum Calculator</w:t>
       </w:r>
     </w:p>
     <w:p>
@@ -941,283 +1191,72 @@
         <w:pStyle w:val="List-Bullet025"/>
       </w:pPr>
       <w:r>
-        <w:t>And, the third part is incremented whenever the source code is changed.</w:t>
-      </w:r>
-    </w:p>
-    <w:p>
-      <w:pPr>
-        <w:pStyle w:val="Body-Text"/>
-      </w:pPr>
-      <w:r>
-        <w:t>T</w:t>
-      </w:r>
-      <w:r>
-        <w:t xml:space="preserve">he version number </w:t>
-      </w:r>
-      <w:r>
-        <w:t xml:space="preserve">of the development version is always appended with </w:t>
-      </w:r>
-      <w:proofErr w:type="gramStart"/>
-      <w:r>
-        <w:t xml:space="preserve">an </w:t>
-      </w:r>
-      <w:r>
-        <w:t>at</w:t>
-      </w:r>
-      <w:proofErr w:type="gramEnd"/>
-      <w:r>
-        <w:t xml:space="preserve"> sign (@) </w:t>
-      </w:r>
-      <w:r>
-        <w:t xml:space="preserve">to call attention to the </w:t>
-      </w:r>
-      <w:r>
-        <w:t>fact that that version</w:t>
-      </w:r>
-      <w:r>
-        <w:t xml:space="preserve"> </w:t>
-      </w:r>
-      <w:r>
-        <w:t>is under development</w:t>
-      </w:r>
-      <w:r>
-        <w:t xml:space="preserve"> and </w:t>
-      </w:r>
-      <w:r>
-        <w:t>not ready to be used.</w:t>
-      </w:r>
-    </w:p>
-    <w:p>
-      <w:pPr>
-        <w:pStyle w:val="Body-Text"/>
-      </w:pPr>
-      <w:r>
-        <w:t>Whenever the version number is shown in one of the tools, it is a link that you can click</w:t>
-      </w:r>
-      <w:r>
-        <w:t xml:space="preserve"> on</w:t>
-      </w:r>
-      <w:r>
-        <w:t xml:space="preserve"> to show the version history information.</w:t>
+        <w:t>See the description for the Adjustments field. There are several adjustments that may not be handled correctly by this tool.</w:t>
+      </w:r>
+    </w:p>
+    <w:p>
+      <w:pPr>
+        <w:pStyle w:val="List-Bullet025"/>
+      </w:pPr>
+      <w:r>
+        <w:t>If you are a non-resident alien, do not use this tool; the taxable percentage of your Social Security is 85%.</w:t>
+      </w:r>
+    </w:p>
+    <w:p>
+      <w:pPr>
+        <w:pStyle w:val="List-Bullet025"/>
+      </w:pPr>
+      <w:r>
+        <w:t>If you are filing Married Filing Separately and you lived with your spouse at anytime during the tax year, do not use this tool; the taxable percentage of your Social Security is 85%.</w:t>
+      </w:r>
+    </w:p>
+    <w:p>
+      <w:pPr>
+        <w:pStyle w:val="Heading3"/>
+      </w:pPr>
+      <w:r>
+        <w:t>State Tax Refund Calculator</w:t>
+      </w:r>
+    </w:p>
+    <w:p>
+      <w:pPr>
+        <w:pStyle w:val="List-Bullet025"/>
+      </w:pPr>
+      <w:r>
+        <w:t>Does not take into account that MFS may be required to itemize deductions.</w:t>
+      </w:r>
+    </w:p>
+    <w:p>
+      <w:pPr>
+        <w:pStyle w:val="Heading3"/>
+      </w:pPr>
+      <w:proofErr w:type="spellStart"/>
+      <w:r>
+        <w:t>TaxProgram</w:t>
+      </w:r>
+      <w:proofErr w:type="spellEnd"/>
+    </w:p>
+    <w:p>
+      <w:pPr>
+        <w:pStyle w:val="List-Bullet025"/>
+      </w:pPr>
+      <w:r>
+        <w:t xml:space="preserve">Checkboxes in output forms are not </w:t>
+      </w:r>
+      <w:proofErr w:type="spellStart"/>
+      <w:r>
+        <w:t>readonly</w:t>
+      </w:r>
+      <w:proofErr w:type="spellEnd"/>
+      <w:r>
+        <w:t>.</w:t>
       </w:r>
     </w:p>
     <w:p>
       <w:pPr>
         <w:pStyle w:val="Heading1"/>
       </w:pPr>
-      <w:bookmarkStart w:id="8" w:name="_Toc231285050"/>
-      <w:r>
-        <w:t>Issues, Limitations, and Known Problems</w:t>
-      </w:r>
-    </w:p>
-    <w:p>
-      <w:pPr>
-        <w:pStyle w:val="Heading3"/>
-      </w:pPr>
-      <w:r>
-        <w:t>California Sales Tax Calculator and California Sales Tax Deduction Calculator</w:t>
-      </w:r>
-    </w:p>
-    <w:p>
-      <w:pPr>
-        <w:pStyle w:val="List-Bullet025"/>
-      </w:pPr>
-      <w:r>
-        <w:t>These calculators can only calculate the sales tax for addresses in California.</w:t>
-      </w:r>
-    </w:p>
-    <w:p>
-      <w:pPr>
-        <w:pStyle w:val="Heading3"/>
-      </w:pPr>
-      <w:r>
-        <w:t>Estimated Tax Calculator (Federal)</w:t>
-      </w:r>
-    </w:p>
-    <w:p>
-      <w:pPr>
-        <w:pStyle w:val="List-Bullet025"/>
-      </w:pPr>
-      <w:r>
-        <w:t>Does not support blind taxpayer or spouse.</w:t>
-      </w:r>
-    </w:p>
-    <w:p>
-      <w:pPr>
-        <w:pStyle w:val="List-Bullet025"/>
-      </w:pPr>
-      <w:r>
-        <w:t>Does not support small business (schedule C).</w:t>
-      </w:r>
-    </w:p>
-    <w:p>
-      <w:pPr>
-        <w:pStyle w:val="List-Bullet025"/>
-      </w:pPr>
-      <w:r>
-        <w:t>Does not support dependents.</w:t>
-      </w:r>
-    </w:p>
-    <w:p>
-      <w:pPr>
-        <w:pStyle w:val="List-Bullet025"/>
-      </w:pPr>
-      <w:r>
-        <w:t>Allows you to enter the amount of credits, but does not calculate CTC or EIC or any other credit.</w:t>
-      </w:r>
-    </w:p>
-    <w:p>
-      <w:pPr>
-        <w:pStyle w:val="Heading3"/>
-      </w:pPr>
-      <w:r>
-        <w:t>Small Business Tax Calculator</w:t>
-      </w:r>
-    </w:p>
-    <w:p>
-      <w:pPr>
-        <w:pStyle w:val="List-Bullet025"/>
-      </w:pPr>
-      <w:r>
-        <w:t>The QBI calculation does not agree with TaxSlayer???</w:t>
-      </w:r>
-    </w:p>
-    <w:p>
-      <w:pPr>
-        <w:pStyle w:val="List-Bullet025"/>
-      </w:pPr>
-      <w:r>
-        <w:t>Long Term Care insurance is not separated out from medical insurance. If medical insurance includes premiums for long term care insurance, the amount entered needs to be limited by age.</w:t>
-      </w:r>
-    </w:p>
-    <w:p>
-      <w:pPr>
-        <w:pStyle w:val="List-Bullet025"/>
-      </w:pPr>
-      <w:r>
-        <w:t>This tool does not handle church employees or farm income.</w:t>
-      </w:r>
-    </w:p>
-    <w:p>
-      <w:pPr>
-        <w:pStyle w:val="List-Bullet025"/>
-      </w:pPr>
-      <w:r>
-        <w:t>The calculation will not be correct if the amount of business income plus wages is greater than the maximum amount subject to Social Security taxes.</w:t>
-      </w:r>
-    </w:p>
-    <w:p>
-      <w:pPr>
-        <w:pStyle w:val="List-Bullet025"/>
-      </w:pPr>
-      <w:r>
-        <w:t>The QBI deduction phases out at $201,775, which is not accounted for in the tool.</w:t>
-      </w:r>
-    </w:p>
-    <w:p>
-      <w:pPr>
-        <w:pStyle w:val="Heading3"/>
-      </w:pPr>
-      <w:r>
-        <w:t>Social Security - Taxable Benefits Calculator</w:t>
-      </w:r>
-    </w:p>
-    <w:p>
-      <w:pPr>
-        <w:pStyle w:val="List-Bullet025"/>
-      </w:pPr>
-      <w:r>
-        <w:t>See the description for the Adjustments field in the help file. There are a few adjustments that may not be handled correctly by this tool.</w:t>
-      </w:r>
-    </w:p>
-    <w:p>
-      <w:pPr>
-        <w:pStyle w:val="List-Bullet025"/>
-      </w:pPr>
-      <w:r>
-        <w:t>If you are a non-resident alien, do not use this calculator; the taxable percentage of your Social Security is 85%.</w:t>
-      </w:r>
-    </w:p>
-    <w:p>
-      <w:pPr>
-        <w:pStyle w:val="Heading3"/>
-      </w:pPr>
-      <w:r>
-        <w:t>Social Security Lump Sum Calculator</w:t>
-      </w:r>
-    </w:p>
-    <w:p>
-      <w:pPr>
-        <w:pStyle w:val="List-Bullet025"/>
-      </w:pPr>
-      <w:r>
-        <w:t>See the description for the Adjustments field. There are several adjustments that may not be handled correctly by this tool.</w:t>
-      </w:r>
-    </w:p>
-    <w:p>
-      <w:pPr>
-        <w:pStyle w:val="List-Bullet025"/>
-      </w:pPr>
-      <w:r>
-        <w:t>If you are a non-resident alien, do not use this tool; the taxable percentage of your Social Security is 85%.</w:t>
-      </w:r>
-    </w:p>
-    <w:p>
-      <w:pPr>
-        <w:pStyle w:val="List-Bullet025"/>
-      </w:pPr>
-      <w:r>
-        <w:t>If you are filing Married Filing Separately and you lived with your spouse at anytime during the tax year, do not use this tool; the taxable percentage of your Social Security is 85%.</w:t>
-      </w:r>
-    </w:p>
-    <w:p>
-      <w:pPr>
-        <w:pStyle w:val="Heading3"/>
-      </w:pPr>
-      <w:r>
-        <w:t>State Tax Refund Calculator</w:t>
-      </w:r>
-    </w:p>
-    <w:p>
-      <w:pPr>
-        <w:pStyle w:val="List-Bullet025"/>
-      </w:pPr>
-      <w:r>
-        <w:t>Does not take into account that MFS may be required to itemize deductions.</w:t>
-      </w:r>
-    </w:p>
-    <w:p>
-      <w:pPr>
-        <w:pStyle w:val="Heading3"/>
-      </w:pPr>
-      <w:proofErr w:type="spellStart"/>
-      <w:r>
-        <w:t>TaxProgram</w:t>
-      </w:r>
-      <w:proofErr w:type="spellEnd"/>
-    </w:p>
-    <w:p>
-      <w:pPr>
-        <w:pStyle w:val="List-Bullet025"/>
-      </w:pPr>
-      <w:r>
-        <w:t xml:space="preserve">Checkboxes in output forms are not </w:t>
-      </w:r>
-      <w:proofErr w:type="spellStart"/>
-      <w:r>
-        <w:t>readonly</w:t>
-      </w:r>
-      <w:proofErr w:type="spellEnd"/>
-      <w:r>
-        <w:t>.</w:t>
-      </w:r>
-    </w:p>
-    <w:p>
-      <w:pPr>
-        <w:pStyle w:val="Heading1"/>
-      </w:pPr>
-      <w:r>
-        <w:lastRenderedPageBreak/>
+      <w:r>
         <w:t xml:space="preserve">Changes I'm Thinking </w:t>
       </w:r>
       <w:r>
@@ -1354,7 +1393,7 @@
 </file>
 
 <file path=word/endnotes.xml><?xml version="1.0" encoding="utf-8"?>
-<w:endnotes xmlns:ve="http://schemas.openxmlformats.org/markup-compatibility/2006" xmlns:o="urn:schemas-microsoft-com:office:office" xmlns:r="http://schemas.openxmlformats.org/officeDocument/2006/relationships" xmlns:m="http://schemas.openxmlformats.org/officeDocument/2006/math" xmlns:v="urn:schemas-microsoft-com:vml" xmlns:wp="http://schemas.openxmlformats.org/drawingml/2006/wordprocessingDrawing" xmlns:w10="urn:schemas-microsoft-com:office:word" xmlns:w="http://schemas.openxmlformats.org/wordprocessingml/2006/main" xmlns:wne="http://schemas.microsoft.com/office/word/2006/wordml">
+<w:endnotes xmlns:wpc="http://schemas.microsoft.com/office/word/2010/wordprocessingCanvas" xmlns:cx="http://schemas.microsoft.com/office/drawing/2014/chartex" xmlns:cx1="http://schemas.microsoft.com/office/drawing/2015/9/8/chartex" xmlns:cx2="http://schemas.microsoft.com/office/drawing/2015/10/21/chartex" xmlns:cx3="http://schemas.microsoft.com/office/drawing/2016/5/9/chartex" xmlns:cx4="http://schemas.microsoft.com/office/drawing/2016/5/10/chartex" xmlns:cx5="http://schemas.microsoft.com/office/drawing/2016/5/11/chartex" xmlns:cx6="http://schemas.microsoft.com/office/drawing/2016/5/12/chartex" xmlns:cx7="http://schemas.microsoft.com/office/drawing/2016/5/13/chartex" xmlns:cx8="http://schemas.microsoft.com/office/drawing/2016/5/14/chartex" xmlns:mc="http://schemas.openxmlformats.org/markup-compatibility/2006" xmlns:aink="http://schemas.microsoft.com/office/drawing/2016/ink" xmlns:am3d="http://schemas.microsoft.com/office/drawing/2017/model3d" xmlns:o="urn:schemas-microsoft-com:office:office" xmlns:oel="http://schemas.microsoft.com/office/2019/extlst" xmlns:r="http://schemas.openxmlformats.org/officeDocument/2006/relationships" xmlns:m="http://schemas.openxmlformats.org/officeDocument/2006/math" xmlns:v="urn:schemas-microsoft-com:vml" xmlns:wp14="http://schemas.microsoft.com/office/word/2010/wordprocessingDrawing" xmlns:wp="http://schemas.openxmlformats.org/drawingml/2006/wordprocessingDrawing" xmlns:w10="urn:schemas-microsoft-com:office:word" xmlns:w="http://schemas.openxmlformats.org/wordprocessingml/2006/main" xmlns:w14="http://schemas.microsoft.com/office/word/2010/wordml" xmlns:w15="http://schemas.microsoft.com/office/word/2012/wordml" xmlns:w16cex="http://schemas.microsoft.com/office/word/2018/wordml/cex" xmlns:w16cid="http://schemas.microsoft.com/office/word/2016/wordml/cid" xmlns:w16="http://schemas.microsoft.com/office/word/2018/wordml" xmlns:w16du="http://schemas.microsoft.com/office/word/2023/wordml/word16du" xmlns:w16sdtdh="http://schemas.microsoft.com/office/word/2020/wordml/sdtdatahash" xmlns:w16sdtfl="http://schemas.microsoft.com/office/word/2024/wordml/sdtformatlock" xmlns:w16se="http://schemas.microsoft.com/office/word/2015/wordml/symex" xmlns:wpg="http://schemas.microsoft.com/office/word/2010/wordprocessingGroup" xmlns:wpi="http://schemas.microsoft.com/office/word/2010/wordprocessingInk" xmlns:wne="http://schemas.microsoft.com/office/word/2006/wordml" xmlns:wps="http://schemas.microsoft.com/office/word/2010/wordprocessingShape" mc:Ignorable="w14 w15 w16se w16cid w16 w16cex w16sdtdh w16sdtfl w16du wp14">
   <w:endnote w:type="separator" w:id="-1">
     <w:p>
       <w:r>
@@ -1373,7 +1412,7 @@
 </file>
 
 <file path=word/footer1.xml><?xml version="1.0" encoding="utf-8"?>
-<w:ftr xmlns:ve="http://schemas.openxmlformats.org/markup-compatibility/2006" xmlns:o="urn:schemas-microsoft-com:office:office" xmlns:r="http://schemas.openxmlformats.org/officeDocument/2006/relationships" xmlns:m="http://schemas.openxmlformats.org/officeDocument/2006/math" xmlns:v="urn:schemas-microsoft-com:vml" xmlns:wp="http://schemas.openxmlformats.org/drawingml/2006/wordprocessingDrawing" xmlns:w10="urn:schemas-microsoft-com:office:word" xmlns:w="http://schemas.openxmlformats.org/wordprocessingml/2006/main" xmlns:wne="http://schemas.microsoft.com/office/word/2006/wordml">
+<w:ftr xmlns:wpc="http://schemas.microsoft.com/office/word/2010/wordprocessingCanvas" xmlns:cx="http://schemas.microsoft.com/office/drawing/2014/chartex" xmlns:cx1="http://schemas.microsoft.com/office/drawing/2015/9/8/chartex" xmlns:cx2="http://schemas.microsoft.com/office/drawing/2015/10/21/chartex" xmlns:cx3="http://schemas.microsoft.com/office/drawing/2016/5/9/chartex" xmlns:cx4="http://schemas.microsoft.com/office/drawing/2016/5/10/chartex" xmlns:cx5="http://schemas.microsoft.com/office/drawing/2016/5/11/chartex" xmlns:cx6="http://schemas.microsoft.com/office/drawing/2016/5/12/chartex" xmlns:cx7="http://schemas.microsoft.com/office/drawing/2016/5/13/chartex" xmlns:cx8="http://schemas.microsoft.com/office/drawing/2016/5/14/chartex" xmlns:mc="http://schemas.openxmlformats.org/markup-compatibility/2006" xmlns:aink="http://schemas.microsoft.com/office/drawing/2016/ink" xmlns:am3d="http://schemas.microsoft.com/office/drawing/2017/model3d" xmlns:o="urn:schemas-microsoft-com:office:office" xmlns:oel="http://schemas.microsoft.com/office/2019/extlst" xmlns:r="http://schemas.openxmlformats.org/officeDocument/2006/relationships" xmlns:m="http://schemas.openxmlformats.org/officeDocument/2006/math" xmlns:v="urn:schemas-microsoft-com:vml" xmlns:wp14="http://schemas.microsoft.com/office/word/2010/wordprocessingDrawing" xmlns:wp="http://schemas.openxmlformats.org/drawingml/2006/wordprocessingDrawing" xmlns:w10="urn:schemas-microsoft-com:office:word" xmlns:w="http://schemas.openxmlformats.org/wordprocessingml/2006/main" xmlns:w14="http://schemas.microsoft.com/office/word/2010/wordml" xmlns:w15="http://schemas.microsoft.com/office/word/2012/wordml" xmlns:w16cex="http://schemas.microsoft.com/office/word/2018/wordml/cex" xmlns:w16cid="http://schemas.microsoft.com/office/word/2016/wordml/cid" xmlns:w16="http://schemas.microsoft.com/office/word/2018/wordml" xmlns:w16du="http://schemas.microsoft.com/office/word/2023/wordml/word16du" xmlns:w16sdtdh="http://schemas.microsoft.com/office/word/2020/wordml/sdtdatahash" xmlns:w16sdtfl="http://schemas.microsoft.com/office/word/2024/wordml/sdtformatlock" xmlns:w16se="http://schemas.microsoft.com/office/word/2015/wordml/symex" xmlns:wpg="http://schemas.microsoft.com/office/word/2010/wordprocessingGroup" xmlns:wpi="http://schemas.microsoft.com/office/word/2010/wordprocessingInk" xmlns:wne="http://schemas.microsoft.com/office/word/2006/wordml" xmlns:wps="http://schemas.microsoft.com/office/word/2010/wordprocessingShape" mc:Ignorable="w14 w15 w16se w16cid w16 w16cex w16sdtdh w16sdtfl w16du wp14">
   <w:p>
     <w:pPr>
       <w:pStyle w:val="Footer"/>
@@ -1485,7 +1524,7 @@
 </file>
 
 <file path=word/footnotes.xml><?xml version="1.0" encoding="utf-8"?>
-<w:footnotes xmlns:ve="http://schemas.openxmlformats.org/markup-compatibility/2006" xmlns:o="urn:schemas-microsoft-com:office:office" xmlns:r="http://schemas.openxmlformats.org/officeDocument/2006/relationships" xmlns:m="http://schemas.openxmlformats.org/officeDocument/2006/math" xmlns:v="urn:schemas-microsoft-com:vml" xmlns:wp="http://schemas.openxmlformats.org/drawingml/2006/wordprocessingDrawing" xmlns:w10="urn:schemas-microsoft-com:office:word" xmlns:w="http://schemas.openxmlformats.org/wordprocessingml/2006/main" xmlns:wne="http://schemas.microsoft.com/office/word/2006/wordml">
+<w:footnotes xmlns:wpc="http://schemas.microsoft.com/office/word/2010/wordprocessingCanvas" xmlns:cx="http://schemas.microsoft.com/office/drawing/2014/chartex" xmlns:cx1="http://schemas.microsoft.com/office/drawing/2015/9/8/chartex" xmlns:cx2="http://schemas.microsoft.com/office/drawing/2015/10/21/chartex" xmlns:cx3="http://schemas.microsoft.com/office/drawing/2016/5/9/chartex" xmlns:cx4="http://schemas.microsoft.com/office/drawing/2016/5/10/chartex" xmlns:cx5="http://schemas.microsoft.com/office/drawing/2016/5/11/chartex" xmlns:cx6="http://schemas.microsoft.com/office/drawing/2016/5/12/chartex" xmlns:cx7="http://schemas.microsoft.com/office/drawing/2016/5/13/chartex" xmlns:cx8="http://schemas.microsoft.com/office/drawing/2016/5/14/chartex" xmlns:mc="http://schemas.openxmlformats.org/markup-compatibility/2006" xmlns:aink="http://schemas.microsoft.com/office/drawing/2016/ink" xmlns:am3d="http://schemas.microsoft.com/office/drawing/2017/model3d" xmlns:o="urn:schemas-microsoft-com:office:office" xmlns:oel="http://schemas.microsoft.com/office/2019/extlst" xmlns:r="http://schemas.openxmlformats.org/officeDocument/2006/relationships" xmlns:m="http://schemas.openxmlformats.org/officeDocument/2006/math" xmlns:v="urn:schemas-microsoft-com:vml" xmlns:wp14="http://schemas.microsoft.com/office/word/2010/wordprocessingDrawing" xmlns:wp="http://schemas.openxmlformats.org/drawingml/2006/wordprocessingDrawing" xmlns:w10="urn:schemas-microsoft-com:office:word" xmlns:w="http://schemas.openxmlformats.org/wordprocessingml/2006/main" xmlns:w14="http://schemas.microsoft.com/office/word/2010/wordml" xmlns:w15="http://schemas.microsoft.com/office/word/2012/wordml" xmlns:w16cex="http://schemas.microsoft.com/office/word/2018/wordml/cex" xmlns:w16cid="http://schemas.microsoft.com/office/word/2016/wordml/cid" xmlns:w16="http://schemas.microsoft.com/office/word/2018/wordml" xmlns:w16du="http://schemas.microsoft.com/office/word/2023/wordml/word16du" xmlns:w16sdtdh="http://schemas.microsoft.com/office/word/2020/wordml/sdtdatahash" xmlns:w16sdtfl="http://schemas.microsoft.com/office/word/2024/wordml/sdtformatlock" xmlns:w16se="http://schemas.microsoft.com/office/word/2015/wordml/symex" xmlns:wpg="http://schemas.microsoft.com/office/word/2010/wordprocessingGroup" xmlns:wpi="http://schemas.microsoft.com/office/word/2010/wordprocessingInk" xmlns:wne="http://schemas.microsoft.com/office/word/2006/wordml" xmlns:wps="http://schemas.microsoft.com/office/word/2010/wordprocessingShape" mc:Ignorable="w14 w15 w16se w16cid w16 w16cex w16sdtdh w16sdtfl w16du wp14">
   <w:footnote w:type="separator" w:id="-1">
     <w:p>
       <w:r>
@@ -1504,8 +1543,8 @@
 </file>
 
 <file path=word/numbering.xml><?xml version="1.0" encoding="utf-8"?>
-<w:numbering xmlns:ve="http://schemas.openxmlformats.org/markup-compatibility/2006" xmlns:o="urn:schemas-microsoft-com:office:office" xmlns:r="http://schemas.openxmlformats.org/officeDocument/2006/relationships" xmlns:m="http://schemas.openxmlformats.org/officeDocument/2006/math" xmlns:v="urn:schemas-microsoft-com:vml" xmlns:wp="http://schemas.openxmlformats.org/drawingml/2006/wordprocessingDrawing" xmlns:w10="urn:schemas-microsoft-com:office:word" xmlns:w="http://schemas.openxmlformats.org/wordprocessingml/2006/main" xmlns:wne="http://schemas.microsoft.com/office/word/2006/wordml">
-  <w:abstractNum w:abstractNumId="0">
+<w:numbering xmlns:wpc="http://schemas.microsoft.com/office/word/2010/wordprocessingCanvas" xmlns:cx="http://schemas.microsoft.com/office/drawing/2014/chartex" xmlns:cx1="http://schemas.microsoft.com/office/drawing/2015/9/8/chartex" xmlns:cx2="http://schemas.microsoft.com/office/drawing/2015/10/21/chartex" xmlns:cx3="http://schemas.microsoft.com/office/drawing/2016/5/9/chartex" xmlns:cx4="http://schemas.microsoft.com/office/drawing/2016/5/10/chartex" xmlns:cx5="http://schemas.microsoft.com/office/drawing/2016/5/11/chartex" xmlns:cx6="http://schemas.microsoft.com/office/drawing/2016/5/12/chartex" xmlns:cx7="http://schemas.microsoft.com/office/drawing/2016/5/13/chartex" xmlns:cx8="http://schemas.microsoft.com/office/drawing/2016/5/14/chartex" xmlns:mc="http://schemas.openxmlformats.org/markup-compatibility/2006" xmlns:aink="http://schemas.microsoft.com/office/drawing/2016/ink" xmlns:am3d="http://schemas.microsoft.com/office/drawing/2017/model3d" xmlns:o="urn:schemas-microsoft-com:office:office" xmlns:oel="http://schemas.microsoft.com/office/2019/extlst" xmlns:r="http://schemas.openxmlformats.org/officeDocument/2006/relationships" xmlns:m="http://schemas.openxmlformats.org/officeDocument/2006/math" xmlns:v="urn:schemas-microsoft-com:vml" xmlns:wp14="http://schemas.microsoft.com/office/word/2010/wordprocessingDrawing" xmlns:wp="http://schemas.openxmlformats.org/drawingml/2006/wordprocessingDrawing" xmlns:w10="urn:schemas-microsoft-com:office:word" xmlns:w="http://schemas.openxmlformats.org/wordprocessingml/2006/main" xmlns:w14="http://schemas.microsoft.com/office/word/2010/wordml" xmlns:w15="http://schemas.microsoft.com/office/word/2012/wordml" xmlns:w16cex="http://schemas.microsoft.com/office/word/2018/wordml/cex" xmlns:w16cid="http://schemas.microsoft.com/office/word/2016/wordml/cid" xmlns:w16="http://schemas.microsoft.com/office/word/2018/wordml" xmlns:w16du="http://schemas.microsoft.com/office/word/2023/wordml/word16du" xmlns:w16sdtdh="http://schemas.microsoft.com/office/word/2020/wordml/sdtdatahash" xmlns:w16sdtfl="http://schemas.microsoft.com/office/word/2024/wordml/sdtformatlock" xmlns:w16se="http://schemas.microsoft.com/office/word/2015/wordml/symex" xmlns:wpg="http://schemas.microsoft.com/office/word/2010/wordprocessingGroup" xmlns:wpi="http://schemas.microsoft.com/office/word/2010/wordprocessingInk" xmlns:wne="http://schemas.microsoft.com/office/word/2006/wordml" xmlns:wps="http://schemas.microsoft.com/office/word/2010/wordprocessingShape" mc:Ignorable="w14 w15 w16se w16cid w16 w16cex w16sdtdh w16sdtfl w16du wp14">
+  <w:abstractNum w:abstractNumId="0" w15:restartNumberingAfterBreak="0">
     <w:nsid w:val="02F34891"/>
     <w:multiLevelType w:val="hybridMultilevel"/>
     <w:tmpl w:val="32A0A55A"/>
@@ -1618,7 +1657,7 @@
       </w:pPr>
     </w:lvl>
   </w:abstractNum>
-  <w:abstractNum w:abstractNumId="1">
+  <w:abstractNum w:abstractNumId="1" w15:restartNumberingAfterBreak="0">
     <w:nsid w:val="163115D9"/>
     <w:multiLevelType w:val="hybridMultilevel"/>
     <w:tmpl w:val="97DAFCAE"/>
@@ -1732,7 +1771,7 @@
       </w:rPr>
     </w:lvl>
   </w:abstractNum>
-  <w:abstractNum w:abstractNumId="2">
+  <w:abstractNum w:abstractNumId="2" w15:restartNumberingAfterBreak="0">
     <w:nsid w:val="3D3B424D"/>
     <w:multiLevelType w:val="hybridMultilevel"/>
     <w:tmpl w:val="11DA1700"/>
@@ -1846,7 +1885,7 @@
       </w:rPr>
     </w:lvl>
   </w:abstractNum>
-  <w:abstractNum w:abstractNumId="3">
+  <w:abstractNum w:abstractNumId="3" w15:restartNumberingAfterBreak="0">
     <w:nsid w:val="41936094"/>
     <w:multiLevelType w:val="hybridMultilevel"/>
     <w:tmpl w:val="D0107CD2"/>
@@ -1960,7 +1999,7 @@
       </w:rPr>
     </w:lvl>
   </w:abstractNum>
-  <w:abstractNum w:abstractNumId="4">
+  <w:abstractNum w:abstractNumId="4" w15:restartNumberingAfterBreak="0">
     <w:nsid w:val="45145E4D"/>
     <w:multiLevelType w:val="hybridMultilevel"/>
     <w:tmpl w:val="7696BC50"/>
@@ -2074,7 +2113,7 @@
       </w:rPr>
     </w:lvl>
   </w:abstractNum>
-  <w:abstractNum w:abstractNumId="5">
+  <w:abstractNum w:abstractNumId="5" w15:restartNumberingAfterBreak="0">
     <w:nsid w:val="521C37A8"/>
     <w:multiLevelType w:val="hybridMultilevel"/>
     <w:tmpl w:val="AB9275FC"/>
@@ -2187,46 +2226,46 @@
       </w:rPr>
     </w:lvl>
   </w:abstractNum>
-  <w:num w:numId="1">
+  <w:num w:numId="1" w16cid:durableId="1188913131">
     <w:abstractNumId w:val="2"/>
   </w:num>
-  <w:num w:numId="2">
+  <w:num w:numId="2" w16cid:durableId="34044557">
     <w:abstractNumId w:val="3"/>
   </w:num>
-  <w:num w:numId="3">
+  <w:num w:numId="3" w16cid:durableId="1339114485">
     <w:abstractNumId w:val="1"/>
   </w:num>
-  <w:num w:numId="4">
+  <w:num w:numId="4" w16cid:durableId="1055466031">
     <w:abstractNumId w:val="4"/>
   </w:num>
-  <w:num w:numId="5">
+  <w:num w:numId="5" w16cid:durableId="1428232661">
     <w:abstractNumId w:val="0"/>
   </w:num>
-  <w:num w:numId="6">
+  <w:num w:numId="6" w16cid:durableId="900402759">
     <w:abstractNumId w:val="5"/>
   </w:num>
-  <w:num w:numId="7">
+  <w:num w:numId="7" w16cid:durableId="1816097281">
     <w:abstractNumId w:val="4"/>
   </w:num>
-  <w:num w:numId="8">
+  <w:num w:numId="8" w16cid:durableId="105538264">
     <w:abstractNumId w:val="4"/>
   </w:num>
-  <w:num w:numId="9">
+  <w:num w:numId="9" w16cid:durableId="1562593600">
     <w:abstractNumId w:val="4"/>
   </w:num>
-  <w:num w:numId="10">
+  <w:num w:numId="10" w16cid:durableId="2078281763">
     <w:abstractNumId w:val="4"/>
   </w:num>
-  <w:num w:numId="11">
+  <w:num w:numId="11" w16cid:durableId="1600481121">
     <w:abstractNumId w:val="4"/>
   </w:num>
-  <w:num w:numId="12">
+  <w:num w:numId="12" w16cid:durableId="74741741">
     <w:abstractNumId w:val="4"/>
   </w:num>
-  <w:num w:numId="13">
+  <w:num w:numId="13" w16cid:durableId="2094155503">
     <w:abstractNumId w:val="4"/>
   </w:num>
-  <w:num w:numId="14">
+  <w:num w:numId="14" w16cid:durableId="1109275776">
     <w:abstractNumId w:val="4"/>
   </w:num>
   <w:numIdMacAtCleanup w:val="4"/>
@@ -2234,7 +2273,7 @@
 </file>
 
 <file path=word/styles.xml><?xml version="1.0" encoding="utf-8"?>
-<w:styles xmlns:r="http://schemas.openxmlformats.org/officeDocument/2006/relationships" xmlns:w="http://schemas.openxmlformats.org/wordprocessingml/2006/main">
+<w:styles xmlns:mc="http://schemas.openxmlformats.org/markup-compatibility/2006" xmlns:r="http://schemas.openxmlformats.org/officeDocument/2006/relationships" xmlns:w="http://schemas.openxmlformats.org/wordprocessingml/2006/main" xmlns:w14="http://schemas.microsoft.com/office/word/2010/wordml" xmlns:w15="http://schemas.microsoft.com/office/word/2012/wordml" xmlns:w16cex="http://schemas.microsoft.com/office/word/2018/wordml/cex" xmlns:w16cid="http://schemas.microsoft.com/office/word/2016/wordml/cid" xmlns:w16="http://schemas.microsoft.com/office/word/2018/wordml" xmlns:w16du="http://schemas.microsoft.com/office/word/2023/wordml/word16du" xmlns:w16sdtdh="http://schemas.microsoft.com/office/word/2020/wordml/sdtdatahash" xmlns:w16sdtfl="http://schemas.microsoft.com/office/word/2024/wordml/sdtformatlock" xmlns:w16se="http://schemas.microsoft.com/office/word/2015/wordml/symex" mc:Ignorable="w14 w15 w16se w16cid w16 w16cex w16sdtdh w16sdtfl w16du">
   <w:docDefaults>
     <w:rPrDefault>
       <w:rPr>
@@ -2248,145 +2287,383 @@
       </w:pPr>
     </w:pPrDefault>
   </w:docDefaults>
-  <w:latentStyles w:defLockedState="0" w:defUIPriority="99" w:defSemiHidden="1" w:defUnhideWhenUsed="1" w:defQFormat="0" w:count="267">
-    <w:lsdException w:name="Normal" w:semiHidden="0" w:uiPriority="0" w:unhideWhenUsed="0" w:qFormat="1"/>
-    <w:lsdException w:name="heading 1" w:semiHidden="0" w:uiPriority="0" w:unhideWhenUsed="0" w:qFormat="1"/>
-    <w:lsdException w:name="heading 2" w:uiPriority="0" w:qFormat="1"/>
-    <w:lsdException w:name="heading 3" w:uiPriority="0" w:qFormat="1"/>
-    <w:lsdException w:name="heading 4" w:uiPriority="9" w:qFormat="1"/>
-    <w:lsdException w:name="heading 5" w:uiPriority="9" w:qFormat="1"/>
-    <w:lsdException w:name="heading 6" w:uiPriority="9" w:qFormat="1"/>
-    <w:lsdException w:name="heading 7" w:uiPriority="9" w:qFormat="1"/>
-    <w:lsdException w:name="heading 8" w:uiPriority="9" w:qFormat="1"/>
-    <w:lsdException w:name="heading 9" w:uiPriority="9" w:qFormat="1"/>
-    <w:lsdException w:name="toc 1" w:uiPriority="39" w:qFormat="1"/>
-    <w:lsdException w:name="toc 2" w:uiPriority="39" w:qFormat="1"/>
-    <w:lsdException w:name="toc 3" w:uiPriority="39" w:qFormat="1"/>
-    <w:lsdException w:name="toc 4" w:uiPriority="39"/>
-    <w:lsdException w:name="toc 5" w:uiPriority="39"/>
-    <w:lsdException w:name="toc 6" w:uiPriority="39"/>
-    <w:lsdException w:name="toc 7" w:uiPriority="39"/>
-    <w:lsdException w:name="toc 8" w:uiPriority="39"/>
-    <w:lsdException w:name="toc 9" w:uiPriority="39"/>
-    <w:lsdException w:name="footer" w:uiPriority="0"/>
-    <w:lsdException w:name="caption" w:uiPriority="0" w:qFormat="1"/>
-    <w:lsdException w:name="Title" w:semiHidden="0" w:uiPriority="10" w:unhideWhenUsed="0" w:qFormat="1"/>
-    <w:lsdException w:name="Default Paragraph Font" w:uiPriority="1"/>
-    <w:lsdException w:name="Subtitle" w:semiHidden="0" w:uiPriority="11" w:unhideWhenUsed="0" w:qFormat="1"/>
-    <w:lsdException w:name="Strong" w:semiHidden="0" w:uiPriority="22" w:unhideWhenUsed="0" w:qFormat="1"/>
-    <w:lsdException w:name="Emphasis" w:semiHidden="0" w:uiPriority="20" w:unhideWhenUsed="0" w:qFormat="1"/>
-    <w:lsdException w:name="Table Grid" w:semiHidden="0" w:uiPriority="59" w:unhideWhenUsed="0"/>
-    <w:lsdException w:name="Placeholder Text" w:unhideWhenUsed="0"/>
-    <w:lsdException w:name="No Spacing" w:semiHidden="0" w:uiPriority="1" w:unhideWhenUsed="0" w:qFormat="1"/>
-    <w:lsdException w:name="Light Shading" w:semiHidden="0" w:uiPriority="60" w:unhideWhenUsed="0"/>
-    <w:lsdException w:name="Light List" w:semiHidden="0" w:uiPriority="61" w:unhideWhenUsed="0"/>
-    <w:lsdException w:name="Light Grid" w:semiHidden="0" w:uiPriority="62" w:unhideWhenUsed="0"/>
-    <w:lsdException w:name="Medium Shading 1" w:semiHidden="0" w:uiPriority="63" w:unhideWhenUsed="0"/>
-    <w:lsdException w:name="Medium Shading 2" w:semiHidden="0" w:uiPriority="64" w:unhideWhenUsed="0"/>
-    <w:lsdException w:name="Medium List 1" w:semiHidden="0" w:uiPriority="65" w:unhideWhenUsed="0"/>
-    <w:lsdException w:name="Medium List 2" w:semiHidden="0" w:uiPriority="66" w:unhideWhenUsed="0"/>
-    <w:lsdException w:name="Medium Grid 1" w:semiHidden="0" w:uiPriority="67" w:unhideWhenUsed="0"/>
-    <w:lsdException w:name="Medium Grid 2" w:semiHidden="0" w:uiPriority="68" w:unhideWhenUsed="0"/>
-    <w:lsdException w:name="Medium Grid 3" w:semiHidden="0" w:uiPriority="69" w:unhideWhenUsed="0"/>
-    <w:lsdException w:name="Dark List" w:semiHidden="0" w:uiPriority="70" w:unhideWhenUsed="0"/>
-    <w:lsdException w:name="Colorful Shading" w:semiHidden="0" w:uiPriority="71" w:unhideWhenUsed="0"/>
-    <w:lsdException w:name="Colorful List" w:semiHidden="0" w:uiPriority="72" w:unhideWhenUsed="0"/>
-    <w:lsdException w:name="Colorful Grid" w:semiHidden="0" w:uiPriority="73" w:unhideWhenUsed="0"/>
-    <w:lsdException w:name="Light Shading Accent 1" w:semiHidden="0" w:uiPriority="60" w:unhideWhenUsed="0"/>
-    <w:lsdException w:name="Light List Accent 1" w:semiHidden="0" w:uiPriority="61" w:unhideWhenUsed="0"/>
-    <w:lsdException w:name="Light Grid Accent 1" w:semiHidden="0" w:uiPriority="62" w:unhideWhenUsed="0"/>
-    <w:lsdException w:name="Medium Shading 1 Accent 1" w:semiHidden="0" w:uiPriority="63" w:unhideWhenUsed="0"/>
-    <w:lsdException w:name="Medium Shading 2 Accent 1" w:semiHidden="0" w:uiPriority="64" w:unhideWhenUsed="0"/>
-    <w:lsdException w:name="Medium List 1 Accent 1" w:semiHidden="0" w:uiPriority="65" w:unhideWhenUsed="0"/>
-    <w:lsdException w:name="Revision" w:unhideWhenUsed="0"/>
-    <w:lsdException w:name="List Paragraph" w:semiHidden="0" w:uiPriority="34" w:unhideWhenUsed="0" w:qFormat="1"/>
-    <w:lsdException w:name="Quote" w:semiHidden="0" w:uiPriority="29" w:unhideWhenUsed="0" w:qFormat="1"/>
-    <w:lsdException w:name="Intense Quote" w:semiHidden="0" w:uiPriority="30" w:unhideWhenUsed="0" w:qFormat="1"/>
-    <w:lsdException w:name="Medium List 2 Accent 1" w:semiHidden="0" w:uiPriority="66" w:unhideWhenUsed="0"/>
-    <w:lsdException w:name="Medium Grid 1 Accent 1" w:semiHidden="0" w:uiPriority="67" w:unhideWhenUsed="0"/>
-    <w:lsdException w:name="Medium Grid 2 Accent 1" w:semiHidden="0" w:uiPriority="68" w:unhideWhenUsed="0"/>
-    <w:lsdException w:name="Medium Grid 3 Accent 1" w:semiHidden="0" w:uiPriority="69" w:unhideWhenUsed="0"/>
-    <w:lsdException w:name="Dark List Accent 1" w:semiHidden="0" w:uiPriority="70" w:unhideWhenUsed="0"/>
-    <w:lsdException w:name="Colorful Shading Accent 1" w:semiHidden="0" w:uiPriority="71" w:unhideWhenUsed="0"/>
-    <w:lsdException w:name="Colorful List Accent 1" w:semiHidden="0" w:uiPriority="72" w:unhideWhenUsed="0"/>
-    <w:lsdException w:name="Colorful Grid Accent 1" w:semiHidden="0" w:uiPriority="73" w:unhideWhenUsed="0"/>
-    <w:lsdException w:name="Light Shading Accent 2" w:semiHidden="0" w:uiPriority="60" w:unhideWhenUsed="0"/>
-    <w:lsdException w:name="Light List Accent 2" w:semiHidden="0" w:uiPriority="61" w:unhideWhenUsed="0"/>
-    <w:lsdException w:name="Light Grid Accent 2" w:semiHidden="0" w:uiPriority="62" w:unhideWhenUsed="0"/>
-    <w:lsdException w:name="Medium Shading 1 Accent 2" w:semiHidden="0" w:uiPriority="63" w:unhideWhenUsed="0"/>
-    <w:lsdException w:name="Medium Shading 2 Accent 2" w:semiHidden="0" w:uiPriority="64" w:unhideWhenUsed="0"/>
-    <w:lsdException w:name="Medium List 1 Accent 2" w:semiHidden="0" w:uiPriority="65" w:unhideWhenUsed="0"/>
-    <w:lsdException w:name="Medium List 2 Accent 2" w:semiHidden="0" w:uiPriority="66" w:unhideWhenUsed="0"/>
-    <w:lsdException w:name="Medium Grid 1 Accent 2" w:semiHidden="0" w:uiPriority="67" w:unhideWhenUsed="0"/>
-    <w:lsdException w:name="Medium Grid 2 Accent 2" w:semiHidden="0" w:uiPriority="68" w:unhideWhenUsed="0"/>
-    <w:lsdException w:name="Medium Grid 3 Accent 2" w:semiHidden="0" w:uiPriority="69" w:unhideWhenUsed="0"/>
-    <w:lsdException w:name="Dark List Accent 2" w:semiHidden="0" w:uiPriority="70" w:unhideWhenUsed="0"/>
-    <w:lsdException w:name="Colorful Shading Accent 2" w:semiHidden="0" w:uiPriority="71" w:unhideWhenUsed="0"/>
-    <w:lsdException w:name="Colorful List Accent 2" w:semiHidden="0" w:uiPriority="72" w:unhideWhenUsed="0"/>
-    <w:lsdException w:name="Colorful Grid Accent 2" w:semiHidden="0" w:uiPriority="73" w:unhideWhenUsed="0"/>
-    <w:lsdException w:name="Light Shading Accent 3" w:semiHidden="0" w:uiPriority="60" w:unhideWhenUsed="0"/>
-    <w:lsdException w:name="Light List Accent 3" w:semiHidden="0" w:uiPriority="61" w:unhideWhenUsed="0"/>
-    <w:lsdException w:name="Light Grid Accent 3" w:semiHidden="0" w:uiPriority="62" w:unhideWhenUsed="0"/>
-    <w:lsdException w:name="Medium Shading 1 Accent 3" w:semiHidden="0" w:uiPriority="63" w:unhideWhenUsed="0"/>
-    <w:lsdException w:name="Medium Shading 2 Accent 3" w:semiHidden="0" w:uiPriority="64" w:unhideWhenUsed="0"/>
-    <w:lsdException w:name="Medium List 1 Accent 3" w:semiHidden="0" w:uiPriority="65" w:unhideWhenUsed="0"/>
-    <w:lsdException w:name="Medium List 2 Accent 3" w:semiHidden="0" w:uiPriority="66" w:unhideWhenUsed="0"/>
-    <w:lsdException w:name="Medium Grid 1 Accent 3" w:semiHidden="0" w:uiPriority="67" w:unhideWhenUsed="0"/>
-    <w:lsdException w:name="Medium Grid 2 Accent 3" w:semiHidden="0" w:uiPriority="68" w:unhideWhenUsed="0"/>
-    <w:lsdException w:name="Medium Grid 3 Accent 3" w:semiHidden="0" w:uiPriority="69" w:unhideWhenUsed="0"/>
-    <w:lsdException w:name="Dark List Accent 3" w:semiHidden="0" w:uiPriority="70" w:unhideWhenUsed="0"/>
-    <w:lsdException w:name="Colorful Shading Accent 3" w:semiHidden="0" w:uiPriority="71" w:unhideWhenUsed="0"/>
-    <w:lsdException w:name="Colorful List Accent 3" w:semiHidden="0" w:uiPriority="72" w:unhideWhenUsed="0"/>
-    <w:lsdException w:name="Colorful Grid Accent 3" w:semiHidden="0" w:uiPriority="73" w:unhideWhenUsed="0"/>
-    <w:lsdException w:name="Light Shading Accent 4" w:semiHidden="0" w:uiPriority="60" w:unhideWhenUsed="0"/>
-    <w:lsdException w:name="Light List Accent 4" w:semiHidden="0" w:uiPriority="61" w:unhideWhenUsed="0"/>
-    <w:lsdException w:name="Light Grid Accent 4" w:semiHidden="0" w:uiPriority="62" w:unhideWhenUsed="0"/>
-    <w:lsdException w:name="Medium Shading 1 Accent 4" w:semiHidden="0" w:uiPriority="63" w:unhideWhenUsed="0"/>
-    <w:lsdException w:name="Medium Shading 2 Accent 4" w:semiHidden="0" w:uiPriority="64" w:unhideWhenUsed="0"/>
-    <w:lsdException w:name="Medium List 1 Accent 4" w:semiHidden="0" w:uiPriority="65" w:unhideWhenUsed="0"/>
-    <w:lsdException w:name="Medium List 2 Accent 4" w:semiHidden="0" w:uiPriority="66" w:unhideWhenUsed="0"/>
-    <w:lsdException w:name="Medium Grid 1 Accent 4" w:semiHidden="0" w:uiPriority="67" w:unhideWhenUsed="0"/>
-    <w:lsdException w:name="Medium Grid 2 Accent 4" w:semiHidden="0" w:uiPriority="68" w:unhideWhenUsed="0"/>
-    <w:lsdException w:name="Medium Grid 3 Accent 4" w:semiHidden="0" w:uiPriority="69" w:unhideWhenUsed="0"/>
-    <w:lsdException w:name="Dark List Accent 4" w:semiHidden="0" w:uiPriority="70" w:unhideWhenUsed="0"/>
-    <w:lsdException w:name="Colorful Shading Accent 4" w:semiHidden="0" w:uiPriority="71" w:unhideWhenUsed="0"/>
-    <w:lsdException w:name="Colorful List Accent 4" w:semiHidden="0" w:uiPriority="72" w:unhideWhenUsed="0"/>
-    <w:lsdException w:name="Colorful Grid Accent 4" w:semiHidden="0" w:uiPriority="73" w:unhideWhenUsed="0"/>
-    <w:lsdException w:name="Light Shading Accent 5" w:semiHidden="0" w:uiPriority="60" w:unhideWhenUsed="0"/>
-    <w:lsdException w:name="Light List Accent 5" w:semiHidden="0" w:uiPriority="61" w:unhideWhenUsed="0"/>
-    <w:lsdException w:name="Light Grid Accent 5" w:semiHidden="0" w:uiPriority="62" w:unhideWhenUsed="0"/>
-    <w:lsdException w:name="Medium Shading 1 Accent 5" w:semiHidden="0" w:uiPriority="63" w:unhideWhenUsed="0"/>
-    <w:lsdException w:name="Medium Shading 2 Accent 5" w:semiHidden="0" w:uiPriority="64" w:unhideWhenUsed="0"/>
-    <w:lsdException w:name="Medium List 1 Accent 5" w:semiHidden="0" w:uiPriority="65" w:unhideWhenUsed="0"/>
-    <w:lsdException w:name="Medium List 2 Accent 5" w:semiHidden="0" w:uiPriority="66" w:unhideWhenUsed="0"/>
-    <w:lsdException w:name="Medium Grid 1 Accent 5" w:semiHidden="0" w:uiPriority="67" w:unhideWhenUsed="0"/>
-    <w:lsdException w:name="Medium Grid 2 Accent 5" w:semiHidden="0" w:uiPriority="68" w:unhideWhenUsed="0"/>
-    <w:lsdException w:name="Medium Grid 3 Accent 5" w:semiHidden="0" w:uiPriority="69" w:unhideWhenUsed="0"/>
-    <w:lsdException w:name="Dark List Accent 5" w:semiHidden="0" w:uiPriority="70" w:unhideWhenUsed="0"/>
-    <w:lsdException w:name="Colorful Shading Accent 5" w:semiHidden="0" w:uiPriority="71" w:unhideWhenUsed="0"/>
-    <w:lsdException w:name="Colorful List Accent 5" w:semiHidden="0" w:uiPriority="72" w:unhideWhenUsed="0"/>
-    <w:lsdException w:name="Colorful Grid Accent 5" w:semiHidden="0" w:uiPriority="73" w:unhideWhenUsed="0"/>
-    <w:lsdException w:name="Light Shading Accent 6" w:semiHidden="0" w:uiPriority="60" w:unhideWhenUsed="0"/>
-    <w:lsdException w:name="Light List Accent 6" w:semiHidden="0" w:uiPriority="61" w:unhideWhenUsed="0"/>
-    <w:lsdException w:name="Light Grid Accent 6" w:semiHidden="0" w:uiPriority="62" w:unhideWhenUsed="0"/>
-    <w:lsdException w:name="Medium Shading 1 Accent 6" w:semiHidden="0" w:uiPriority="63" w:unhideWhenUsed="0"/>
-    <w:lsdException w:name="Medium Shading 2 Accent 6" w:semiHidden="0" w:uiPriority="64" w:unhideWhenUsed="0"/>
-    <w:lsdException w:name="Medium List 1 Accent 6" w:semiHidden="0" w:uiPriority="65" w:unhideWhenUsed="0"/>
-    <w:lsdException w:name="Medium List 2 Accent 6" w:semiHidden="0" w:uiPriority="66" w:unhideWhenUsed="0"/>
-    <w:lsdException w:name="Medium Grid 1 Accent 6" w:semiHidden="0" w:uiPriority="67" w:unhideWhenUsed="0"/>
-    <w:lsdException w:name="Medium Grid 2 Accent 6" w:semiHidden="0" w:uiPriority="68" w:unhideWhenUsed="0"/>
-    <w:lsdException w:name="Medium Grid 3 Accent 6" w:semiHidden="0" w:uiPriority="69" w:unhideWhenUsed="0"/>
-    <w:lsdException w:name="Dark List Accent 6" w:semiHidden="0" w:uiPriority="70" w:unhideWhenUsed="0"/>
-    <w:lsdException w:name="Colorful Shading Accent 6" w:semiHidden="0" w:uiPriority="71" w:unhideWhenUsed="0"/>
-    <w:lsdException w:name="Colorful List Accent 6" w:semiHidden="0" w:uiPriority="72" w:unhideWhenUsed="0"/>
-    <w:lsdException w:name="Colorful Grid Accent 6" w:semiHidden="0" w:uiPriority="73" w:unhideWhenUsed="0"/>
-    <w:lsdException w:name="Subtle Emphasis" w:semiHidden="0" w:uiPriority="19" w:unhideWhenUsed="0" w:qFormat="1"/>
-    <w:lsdException w:name="Intense Emphasis" w:semiHidden="0" w:uiPriority="21" w:unhideWhenUsed="0" w:qFormat="1"/>
-    <w:lsdException w:name="Subtle Reference" w:semiHidden="0" w:uiPriority="31" w:unhideWhenUsed="0" w:qFormat="1"/>
-    <w:lsdException w:name="Intense Reference" w:semiHidden="0" w:uiPriority="32" w:unhideWhenUsed="0" w:qFormat="1"/>
-    <w:lsdException w:name="Book Title" w:semiHidden="0" w:uiPriority="33" w:unhideWhenUsed="0" w:qFormat="1"/>
-    <w:lsdException w:name="Bibliography" w:uiPriority="37"/>
-    <w:lsdException w:name="TOC Heading" w:uiPriority="39" w:qFormat="1"/>
+  <w:latentStyles w:defLockedState="0" w:defUIPriority="99" w:defSemiHidden="0" w:defUnhideWhenUsed="0" w:defQFormat="0" w:count="376">
+    <w:lsdException w:name="Normal" w:uiPriority="0" w:qFormat="1"/>
+    <w:lsdException w:name="heading 1" w:uiPriority="0" w:qFormat="1"/>
+    <w:lsdException w:name="heading 2" w:semiHidden="1" w:uiPriority="0" w:unhideWhenUsed="1" w:qFormat="1"/>
+    <w:lsdException w:name="heading 3" w:semiHidden="1" w:uiPriority="0" w:unhideWhenUsed="1" w:qFormat="1"/>
+    <w:lsdException w:name="heading 4" w:semiHidden="1" w:uiPriority="9" w:unhideWhenUsed="1" w:qFormat="1"/>
+    <w:lsdException w:name="heading 5" w:semiHidden="1" w:uiPriority="9" w:unhideWhenUsed="1" w:qFormat="1"/>
+    <w:lsdException w:name="heading 6" w:semiHidden="1" w:uiPriority="9" w:unhideWhenUsed="1" w:qFormat="1"/>
+    <w:lsdException w:name="heading 7" w:semiHidden="1" w:uiPriority="9" w:unhideWhenUsed="1" w:qFormat="1"/>
+    <w:lsdException w:name="heading 8" w:semiHidden="1" w:uiPriority="9" w:unhideWhenUsed="1" w:qFormat="1"/>
+    <w:lsdException w:name="heading 9" w:semiHidden="1" w:uiPriority="9" w:unhideWhenUsed="1" w:qFormat="1"/>
+    <w:lsdException w:name="index 1" w:semiHidden="1" w:unhideWhenUsed="1"/>
+    <w:lsdException w:name="index 2" w:semiHidden="1" w:unhideWhenUsed="1"/>
+    <w:lsdException w:name="index 3" w:semiHidden="1" w:unhideWhenUsed="1"/>
+    <w:lsdException w:name="index 4" w:semiHidden="1" w:unhideWhenUsed="1"/>
+    <w:lsdException w:name="index 5" w:semiHidden="1" w:unhideWhenUsed="1"/>
+    <w:lsdException w:name="index 6" w:semiHidden="1" w:unhideWhenUsed="1"/>
+    <w:lsdException w:name="index 7" w:semiHidden="1" w:unhideWhenUsed="1"/>
+    <w:lsdException w:name="index 8" w:semiHidden="1" w:unhideWhenUsed="1"/>
+    <w:lsdException w:name="index 9" w:semiHidden="1" w:unhideWhenUsed="1"/>
+    <w:lsdException w:name="toc 1" w:semiHidden="1" w:uiPriority="39" w:unhideWhenUsed="1" w:qFormat="1"/>
+    <w:lsdException w:name="toc 2" w:semiHidden="1" w:uiPriority="39" w:unhideWhenUsed="1" w:qFormat="1"/>
+    <w:lsdException w:name="toc 3" w:semiHidden="1" w:uiPriority="39" w:unhideWhenUsed="1" w:qFormat="1"/>
+    <w:lsdException w:name="toc 4" w:semiHidden="1" w:uiPriority="39" w:unhideWhenUsed="1"/>
+    <w:lsdException w:name="toc 5" w:semiHidden="1" w:uiPriority="39" w:unhideWhenUsed="1"/>
+    <w:lsdException w:name="toc 6" w:semiHidden="1" w:uiPriority="39" w:unhideWhenUsed="1"/>
+    <w:lsdException w:name="toc 7" w:semiHidden="1" w:uiPriority="39" w:unhideWhenUsed="1"/>
+    <w:lsdException w:name="toc 8" w:semiHidden="1" w:uiPriority="39" w:unhideWhenUsed="1"/>
+    <w:lsdException w:name="toc 9" w:semiHidden="1" w:uiPriority="39" w:unhideWhenUsed="1"/>
+    <w:lsdException w:name="Normal Indent" w:semiHidden="1" w:unhideWhenUsed="1"/>
+    <w:lsdException w:name="footnote text" w:semiHidden="1" w:unhideWhenUsed="1"/>
+    <w:lsdException w:name="annotation text" w:semiHidden="1" w:unhideWhenUsed="1"/>
+    <w:lsdException w:name="header" w:semiHidden="1" w:unhideWhenUsed="1"/>
+    <w:lsdException w:name="footer" w:semiHidden="1" w:uiPriority="0" w:unhideWhenUsed="1"/>
+    <w:lsdException w:name="index heading" w:semiHidden="1" w:unhideWhenUsed="1"/>
+    <w:lsdException w:name="caption" w:semiHidden="1" w:uiPriority="0" w:unhideWhenUsed="1" w:qFormat="1"/>
+    <w:lsdException w:name="table of figures" w:semiHidden="1" w:unhideWhenUsed="1"/>
+    <w:lsdException w:name="envelope address" w:semiHidden="1" w:unhideWhenUsed="1"/>
+    <w:lsdException w:name="envelope return" w:semiHidden="1" w:unhideWhenUsed="1"/>
+    <w:lsdException w:name="footnote reference" w:semiHidden="1" w:unhideWhenUsed="1"/>
+    <w:lsdException w:name="annotation reference" w:semiHidden="1" w:unhideWhenUsed="1"/>
+    <w:lsdException w:name="line number" w:semiHidden="1" w:unhideWhenUsed="1"/>
+    <w:lsdException w:name="page number" w:semiHidden="1" w:unhideWhenUsed="1"/>
+    <w:lsdException w:name="endnote reference" w:semiHidden="1" w:unhideWhenUsed="1"/>
+    <w:lsdException w:name="endnote text" w:semiHidden="1" w:unhideWhenUsed="1"/>
+    <w:lsdException w:name="table of authorities" w:semiHidden="1" w:unhideWhenUsed="1"/>
+    <w:lsdException w:name="macro" w:semiHidden="1" w:unhideWhenUsed="1"/>
+    <w:lsdException w:name="toa heading" w:semiHidden="1" w:unhideWhenUsed="1"/>
+    <w:lsdException w:name="List" w:semiHidden="1" w:unhideWhenUsed="1"/>
+    <w:lsdException w:name="List Bullet" w:semiHidden="1" w:unhideWhenUsed="1"/>
+    <w:lsdException w:name="List Number" w:semiHidden="1" w:unhideWhenUsed="1"/>
+    <w:lsdException w:name="List 2" w:semiHidden="1" w:unhideWhenUsed="1"/>
+    <w:lsdException w:name="List 3" w:semiHidden="1" w:unhideWhenUsed="1"/>
+    <w:lsdException w:name="List 4" w:semiHidden="1" w:unhideWhenUsed="1"/>
+    <w:lsdException w:name="List 5" w:semiHidden="1" w:unhideWhenUsed="1"/>
+    <w:lsdException w:name="List Bullet 2" w:semiHidden="1" w:unhideWhenUsed="1"/>
+    <w:lsdException w:name="List Bullet 3" w:semiHidden="1" w:unhideWhenUsed="1"/>
+    <w:lsdException w:name="List Bullet 4" w:semiHidden="1" w:unhideWhenUsed="1"/>
+    <w:lsdException w:name="List Bullet 5" w:semiHidden="1" w:unhideWhenUsed="1"/>
+    <w:lsdException w:name="List Number 2" w:semiHidden="1" w:unhideWhenUsed="1"/>
+    <w:lsdException w:name="List Number 3" w:semiHidden="1" w:unhideWhenUsed="1"/>
+    <w:lsdException w:name="List Number 4" w:semiHidden="1" w:unhideWhenUsed="1"/>
+    <w:lsdException w:name="List Number 5" w:semiHidden="1" w:unhideWhenUsed="1"/>
+    <w:lsdException w:name="Title" w:uiPriority="10" w:qFormat="1"/>
+    <w:lsdException w:name="Closing" w:semiHidden="1" w:unhideWhenUsed="1"/>
+    <w:lsdException w:name="Signature" w:semiHidden="1" w:unhideWhenUsed="1"/>
+    <w:lsdException w:name="Default Paragraph Font" w:semiHidden="1" w:uiPriority="1" w:unhideWhenUsed="1"/>
+    <w:lsdException w:name="Body Text" w:semiHidden="1" w:unhideWhenUsed="1"/>
+    <w:lsdException w:name="Body Text Indent" w:semiHidden="1" w:unhideWhenUsed="1"/>
+    <w:lsdException w:name="List Continue" w:semiHidden="1" w:unhideWhenUsed="1"/>
+    <w:lsdException w:name="List Continue 2" w:semiHidden="1" w:unhideWhenUsed="1"/>
+    <w:lsdException w:name="List Continue 3" w:semiHidden="1" w:unhideWhenUsed="1"/>
+    <w:lsdException w:name="List Continue 4" w:semiHidden="1" w:unhideWhenUsed="1"/>
+    <w:lsdException w:name="List Continue 5" w:semiHidden="1" w:unhideWhenUsed="1"/>
+    <w:lsdException w:name="Message Header" w:semiHidden="1" w:unhideWhenUsed="1"/>
+    <w:lsdException w:name="Subtitle" w:uiPriority="11" w:qFormat="1"/>
+    <w:lsdException w:name="Salutation" w:semiHidden="1" w:unhideWhenUsed="1"/>
+    <w:lsdException w:name="Date" w:semiHidden="1" w:unhideWhenUsed="1"/>
+    <w:lsdException w:name="Body Text First Indent" w:semiHidden="1" w:unhideWhenUsed="1"/>
+    <w:lsdException w:name="Body Text First Indent 2" w:semiHidden="1" w:unhideWhenUsed="1"/>
+    <w:lsdException w:name="Note Heading" w:semiHidden="1" w:unhideWhenUsed="1"/>
+    <w:lsdException w:name="Body Text 2" w:semiHidden="1" w:unhideWhenUsed="1"/>
+    <w:lsdException w:name="Body Text 3" w:semiHidden="1" w:unhideWhenUsed="1"/>
+    <w:lsdException w:name="Body Text Indent 2" w:semiHidden="1" w:unhideWhenUsed="1"/>
+    <w:lsdException w:name="Body Text Indent 3" w:semiHidden="1" w:unhideWhenUsed="1"/>
+    <w:lsdException w:name="Block Text" w:semiHidden="1" w:unhideWhenUsed="1"/>
+    <w:lsdException w:name="Hyperlink" w:semiHidden="1" w:unhideWhenUsed="1"/>
+    <w:lsdException w:name="FollowedHyperlink" w:semiHidden="1" w:unhideWhenUsed="1"/>
+    <w:lsdException w:name="Strong" w:uiPriority="22" w:qFormat="1"/>
+    <w:lsdException w:name="Emphasis" w:uiPriority="20" w:qFormat="1"/>
+    <w:lsdException w:name="Document Map" w:semiHidden="1" w:unhideWhenUsed="1"/>
+    <w:lsdException w:name="Plain Text" w:semiHidden="1" w:unhideWhenUsed="1"/>
+    <w:lsdException w:name="E-mail Signature" w:semiHidden="1" w:unhideWhenUsed="1"/>
+    <w:lsdException w:name="HTML Top of Form" w:semiHidden="1" w:unhideWhenUsed="1"/>
+    <w:lsdException w:name="HTML Bottom of Form" w:semiHidden="1" w:unhideWhenUsed="1"/>
+    <w:lsdException w:name="Normal (Web)" w:semiHidden="1" w:unhideWhenUsed="1"/>
+    <w:lsdException w:name="HTML Acronym" w:semiHidden="1" w:unhideWhenUsed="1"/>
+    <w:lsdException w:name="HTML Address" w:semiHidden="1" w:unhideWhenUsed="1"/>
+    <w:lsdException w:name="HTML Cite" w:semiHidden="1" w:unhideWhenUsed="1"/>
+    <w:lsdException w:name="HTML Code" w:semiHidden="1" w:unhideWhenUsed="1"/>
+    <w:lsdException w:name="HTML Definition" w:semiHidden="1" w:unhideWhenUsed="1"/>
+    <w:lsdException w:name="HTML Keyboard" w:semiHidden="1" w:unhideWhenUsed="1"/>
+    <w:lsdException w:name="HTML Preformatted" w:semiHidden="1" w:unhideWhenUsed="1"/>
+    <w:lsdException w:name="HTML Sample" w:semiHidden="1" w:unhideWhenUsed="1"/>
+    <w:lsdException w:name="HTML Typewriter" w:semiHidden="1" w:unhideWhenUsed="1"/>
+    <w:lsdException w:name="HTML Variable" w:semiHidden="1" w:unhideWhenUsed="1"/>
+    <w:lsdException w:name="Normal Table" w:semiHidden="1" w:unhideWhenUsed="1"/>
+    <w:lsdException w:name="annotation subject" w:semiHidden="1" w:unhideWhenUsed="1"/>
+    <w:lsdException w:name="No List" w:semiHidden="1" w:unhideWhenUsed="1"/>
+    <w:lsdException w:name="Outline List 1" w:semiHidden="1" w:unhideWhenUsed="1"/>
+    <w:lsdException w:name="Outline List 2" w:semiHidden="1" w:unhideWhenUsed="1"/>
+    <w:lsdException w:name="Outline List 3" w:semiHidden="1" w:unhideWhenUsed="1"/>
+    <w:lsdException w:name="Table Simple 1" w:semiHidden="1" w:unhideWhenUsed="1"/>
+    <w:lsdException w:name="Table Simple 2" w:semiHidden="1" w:unhideWhenUsed="1"/>
+    <w:lsdException w:name="Table Simple 3" w:semiHidden="1" w:unhideWhenUsed="1"/>
+    <w:lsdException w:name="Table Classic 1" w:semiHidden="1" w:unhideWhenUsed="1"/>
+    <w:lsdException w:name="Table Classic 2" w:semiHidden="1" w:unhideWhenUsed="1"/>
+    <w:lsdException w:name="Table Classic 3" w:semiHidden="1" w:unhideWhenUsed="1"/>
+    <w:lsdException w:name="Table Classic 4" w:semiHidden="1" w:unhideWhenUsed="1"/>
+    <w:lsdException w:name="Table Colorful 1" w:semiHidden="1" w:unhideWhenUsed="1"/>
+    <w:lsdException w:name="Table Colorful 2" w:semiHidden="1" w:unhideWhenUsed="1"/>
+    <w:lsdException w:name="Table Colorful 3" w:semiHidden="1" w:unhideWhenUsed="1"/>
+    <w:lsdException w:name="Table Columns 1" w:semiHidden="1" w:unhideWhenUsed="1"/>
+    <w:lsdException w:name="Table Columns 2" w:semiHidden="1" w:unhideWhenUsed="1"/>
+    <w:lsdException w:name="Table Columns 3" w:semiHidden="1" w:unhideWhenUsed="1"/>
+    <w:lsdException w:name="Table Columns 4" w:semiHidden="1" w:unhideWhenUsed="1"/>
+    <w:lsdException w:name="Table Columns 5" w:semiHidden="1" w:unhideWhenUsed="1"/>
+    <w:lsdException w:name="Table Grid 1" w:semiHidden="1" w:unhideWhenUsed="1"/>
+    <w:lsdException w:name="Table Grid 2" w:semiHidden="1" w:unhideWhenUsed="1"/>
+    <w:lsdException w:name="Table Grid 3" w:semiHidden="1" w:unhideWhenUsed="1"/>
+    <w:lsdException w:name="Table Grid 4" w:semiHidden="1" w:unhideWhenUsed="1"/>
+    <w:lsdException w:name="Table Grid 5" w:semiHidden="1" w:unhideWhenUsed="1"/>
+    <w:lsdException w:name="Table Grid 6" w:semiHidden="1" w:unhideWhenUsed="1"/>
+    <w:lsdException w:name="Table Grid 7" w:semiHidden="1" w:unhideWhenUsed="1"/>
+    <w:lsdException w:name="Table Grid 8" w:semiHidden="1" w:unhideWhenUsed="1"/>
+    <w:lsdException w:name="Table List 1" w:semiHidden="1" w:unhideWhenUsed="1"/>
+    <w:lsdException w:name="Table List 2" w:semiHidden="1" w:unhideWhenUsed="1"/>
+    <w:lsdException w:name="Table List 3" w:semiHidden="1" w:unhideWhenUsed="1"/>
+    <w:lsdException w:name="Table List 4" w:semiHidden="1" w:unhideWhenUsed="1"/>
+    <w:lsdException w:name="Table List 5" w:semiHidden="1" w:unhideWhenUsed="1"/>
+    <w:lsdException w:name="Table List 6" w:semiHidden="1" w:unhideWhenUsed="1"/>
+    <w:lsdException w:name="Table List 7" w:semiHidden="1" w:unhideWhenUsed="1"/>
+    <w:lsdException w:name="Table List 8" w:semiHidden="1" w:unhideWhenUsed="1"/>
+    <w:lsdException w:name="Table 3D effects 1" w:semiHidden="1" w:unhideWhenUsed="1"/>
+    <w:lsdException w:name="Table 3D effects 2" w:semiHidden="1" w:unhideWhenUsed="1"/>
+    <w:lsdException w:name="Table 3D effects 3" w:semiHidden="1" w:unhideWhenUsed="1"/>
+    <w:lsdException w:name="Table Contemporary" w:semiHidden="1" w:unhideWhenUsed="1"/>
+    <w:lsdException w:name="Table Elegant" w:semiHidden="1" w:unhideWhenUsed="1"/>
+    <w:lsdException w:name="Table Professional" w:semiHidden="1" w:unhideWhenUsed="1"/>
+    <w:lsdException w:name="Table Subtle 1" w:semiHidden="1" w:unhideWhenUsed="1"/>
+    <w:lsdException w:name="Table Subtle 2" w:semiHidden="1" w:unhideWhenUsed="1"/>
+    <w:lsdException w:name="Table Web 1" w:semiHidden="1" w:unhideWhenUsed="1"/>
+    <w:lsdException w:name="Table Web 2" w:semiHidden="1" w:unhideWhenUsed="1"/>
+    <w:lsdException w:name="Table Web 3" w:semiHidden="1" w:unhideWhenUsed="1"/>
+    <w:lsdException w:name="Balloon Text" w:semiHidden="1" w:unhideWhenUsed="1"/>
+    <w:lsdException w:name="Table Grid" w:uiPriority="59"/>
+    <w:lsdException w:name="Table Theme" w:semiHidden="1" w:unhideWhenUsed="1"/>
+    <w:lsdException w:name="Placeholder Text" w:semiHidden="1"/>
+    <w:lsdException w:name="No Spacing" w:uiPriority="1" w:qFormat="1"/>
+    <w:lsdException w:name="Light Shading" w:uiPriority="60"/>
+    <w:lsdException w:name="Light List" w:uiPriority="61"/>
+    <w:lsdException w:name="Light Grid" w:uiPriority="62"/>
+    <w:lsdException w:name="Medium Shading 1" w:uiPriority="63"/>
+    <w:lsdException w:name="Medium Shading 2" w:uiPriority="64"/>
+    <w:lsdException w:name="Medium List 1" w:uiPriority="65"/>
+    <w:lsdException w:name="Medium List 2" w:uiPriority="66"/>
+    <w:lsdException w:name="Medium Grid 1" w:uiPriority="67"/>
+    <w:lsdException w:name="Medium Grid 2" w:uiPriority="68"/>
+    <w:lsdException w:name="Medium Grid 3" w:uiPriority="69"/>
+    <w:lsdException w:name="Dark List" w:uiPriority="70"/>
+    <w:lsdException w:name="Colorful Shading" w:uiPriority="71"/>
+    <w:lsdException w:name="Colorful List" w:uiPriority="72"/>
+    <w:lsdException w:name="Colorful Grid" w:uiPriority="73"/>
+    <w:lsdException w:name="Light Shading Accent 1" w:uiPriority="60"/>
+    <w:lsdException w:name="Light List Accent 1" w:uiPriority="61"/>
+    <w:lsdException w:name="Light Grid Accent 1" w:uiPriority="62"/>
+    <w:lsdException w:name="Medium Shading 1 Accent 1" w:uiPriority="63"/>
+    <w:lsdException w:name="Medium Shading 2 Accent 1" w:uiPriority="64"/>
+    <w:lsdException w:name="Medium List 1 Accent 1" w:uiPriority="65"/>
+    <w:lsdException w:name="Revision" w:semiHidden="1"/>
+    <w:lsdException w:name="List Paragraph" w:uiPriority="34" w:qFormat="1"/>
+    <w:lsdException w:name="Quote" w:uiPriority="29" w:qFormat="1"/>
+    <w:lsdException w:name="Intense Quote" w:uiPriority="30" w:qFormat="1"/>
+    <w:lsdException w:name="Medium List 2 Accent 1" w:uiPriority="66"/>
+    <w:lsdException w:name="Medium Grid 1 Accent 1" w:uiPriority="67"/>
+    <w:lsdException w:name="Medium Grid 2 Accent 1" w:uiPriority="68"/>
+    <w:lsdException w:name="Medium Grid 3 Accent 1" w:uiPriority="69"/>
+    <w:lsdException w:name="Dark List Accent 1" w:uiPriority="70"/>
+    <w:lsdException w:name="Colorful Shading Accent 1" w:uiPriority="71"/>
+    <w:lsdException w:name="Colorful List Accent 1" w:uiPriority="72"/>
+    <w:lsdException w:name="Colorful Grid Accent 1" w:uiPriority="73"/>
+    <w:lsdException w:name="Light Shading Accent 2" w:uiPriority="60"/>
+    <w:lsdException w:name="Light List Accent 2" w:uiPriority="61"/>
+    <w:lsdException w:name="Light Grid Accent 2" w:uiPriority="62"/>
+    <w:lsdException w:name="Medium Shading 1 Accent 2" w:uiPriority="63"/>
+    <w:lsdException w:name="Medium Shading 2 Accent 2" w:uiPriority="64"/>
+    <w:lsdException w:name="Medium List 1 Accent 2" w:uiPriority="65"/>
+    <w:lsdException w:name="Medium List 2 Accent 2" w:uiPriority="66"/>
+    <w:lsdException w:name="Medium Grid 1 Accent 2" w:uiPriority="67"/>
+    <w:lsdException w:name="Medium Grid 2 Accent 2" w:uiPriority="68"/>
+    <w:lsdException w:name="Medium Grid 3 Accent 2" w:uiPriority="69"/>
+    <w:lsdException w:name="Dark List Accent 2" w:uiPriority="70"/>
+    <w:lsdException w:name="Colorful Shading Accent 2" w:uiPriority="71"/>
+    <w:lsdException w:name="Colorful List Accent 2" w:uiPriority="72"/>
+    <w:lsdException w:name="Colorful Grid Accent 2" w:uiPriority="73"/>
+    <w:lsdException w:name="Light Shading Accent 3" w:uiPriority="60"/>
+    <w:lsdException w:name="Light List Accent 3" w:uiPriority="61"/>
+    <w:lsdException w:name="Light Grid Accent 3" w:uiPriority="62"/>
+    <w:lsdException w:name="Medium Shading 1 Accent 3" w:uiPriority="63"/>
+    <w:lsdException w:name="Medium Shading 2 Accent 3" w:uiPriority="64"/>
+    <w:lsdException w:name="Medium List 1 Accent 3" w:uiPriority="65"/>
+    <w:lsdException w:name="Medium List 2 Accent 3" w:uiPriority="66"/>
+    <w:lsdException w:name="Medium Grid 1 Accent 3" w:uiPriority="67"/>
+    <w:lsdException w:name="Medium Grid 2 Accent 3" w:uiPriority="68"/>
+    <w:lsdException w:name="Medium Grid 3 Accent 3" w:uiPriority="69"/>
+    <w:lsdException w:name="Dark List Accent 3" w:uiPriority="70"/>
+    <w:lsdException w:name="Colorful Shading Accent 3" w:uiPriority="71"/>
+    <w:lsdException w:name="Colorful List Accent 3" w:uiPriority="72"/>
+    <w:lsdException w:name="Colorful Grid Accent 3" w:uiPriority="73"/>
+    <w:lsdException w:name="Light Shading Accent 4" w:uiPriority="60"/>
+    <w:lsdException w:name="Light List Accent 4" w:uiPriority="61"/>
+    <w:lsdException w:name="Light Grid Accent 4" w:uiPriority="62"/>
+    <w:lsdException w:name="Medium Shading 1 Accent 4" w:uiPriority="63"/>
+    <w:lsdException w:name="Medium Shading 2 Accent 4" w:uiPriority="64"/>
+    <w:lsdException w:name="Medium List 1 Accent 4" w:uiPriority="65"/>
+    <w:lsdException w:name="Medium List 2 Accent 4" w:uiPriority="66"/>
+    <w:lsdException w:name="Medium Grid 1 Accent 4" w:uiPriority="67"/>
+    <w:lsdException w:name="Medium Grid 2 Accent 4" w:uiPriority="68"/>
+    <w:lsdException w:name="Medium Grid 3 Accent 4" w:uiPriority="69"/>
+    <w:lsdException w:name="Dark List Accent 4" w:uiPriority="70"/>
+    <w:lsdException w:name="Colorful Shading Accent 4" w:uiPriority="71"/>
+    <w:lsdException w:name="Colorful List Accent 4" w:uiPriority="72"/>
+    <w:lsdException w:name="Colorful Grid Accent 4" w:uiPriority="73"/>
+    <w:lsdException w:name="Light Shading Accent 5" w:uiPriority="60"/>
+    <w:lsdException w:name="Light List Accent 5" w:uiPriority="61"/>
+    <w:lsdException w:name="Light Grid Accent 5" w:uiPriority="62"/>
+    <w:lsdException w:name="Medium Shading 1 Accent 5" w:uiPriority="63"/>
+    <w:lsdException w:name="Medium Shading 2 Accent 5" w:uiPriority="64"/>
+    <w:lsdException w:name="Medium List 1 Accent 5" w:uiPriority="65"/>
+    <w:lsdException w:name="Medium List 2 Accent 5" w:uiPriority="66"/>
+    <w:lsdException w:name="Medium Grid 1 Accent 5" w:uiPriority="67"/>
+    <w:lsdException w:name="Medium Grid 2 Accent 5" w:uiPriority="68"/>
+    <w:lsdException w:name="Medium Grid 3 Accent 5" w:uiPriority="69"/>
+    <w:lsdException w:name="Dark List Accent 5" w:uiPriority="70"/>
+    <w:lsdException w:name="Colorful Shading Accent 5" w:uiPriority="71"/>
+    <w:lsdException w:name="Colorful List Accent 5" w:uiPriority="72"/>
+    <w:lsdException w:name="Colorful Grid Accent 5" w:uiPriority="73"/>
+    <w:lsdException w:name="Light Shading Accent 6" w:uiPriority="60"/>
+    <w:lsdException w:name="Light List Accent 6" w:uiPriority="61"/>
+    <w:lsdException w:name="Light Grid Accent 6" w:uiPriority="62"/>
+    <w:lsdException w:name="Medium Shading 1 Accent 6" w:uiPriority="63"/>
+    <w:lsdException w:name="Medium Shading 2 Accent 6" w:uiPriority="64"/>
+    <w:lsdException w:name="Medium List 1 Accent 6" w:uiPriority="65"/>
+    <w:lsdException w:name="Medium List 2 Accent 6" w:uiPriority="66"/>
+    <w:lsdException w:name="Medium Grid 1 Accent 6" w:uiPriority="67"/>
+    <w:lsdException w:name="Medium Grid 2 Accent 6" w:uiPriority="68"/>
+    <w:lsdException w:name="Medium Grid 3 Accent 6" w:uiPriority="69"/>
+    <w:lsdException w:name="Dark List Accent 6" w:uiPriority="70"/>
+    <w:lsdException w:name="Colorful Shading Accent 6" w:uiPriority="71"/>
+    <w:lsdException w:name="Colorful List Accent 6" w:uiPriority="72"/>
+    <w:lsdException w:name="Colorful Grid Accent 6" w:uiPriority="73"/>
+    <w:lsdException w:name="Subtle Emphasis" w:uiPriority="19" w:qFormat="1"/>
+    <w:lsdException w:name="Intense Emphasis" w:uiPriority="21" w:qFormat="1"/>
+    <w:lsdException w:name="Subtle Reference" w:uiPriority="31" w:qFormat="1"/>
+    <w:lsdException w:name="Intense Reference" w:uiPriority="32" w:qFormat="1"/>
+    <w:lsdException w:name="Book Title" w:uiPriority="33" w:qFormat="1"/>
+    <w:lsdException w:name="Bibliography" w:semiHidden="1" w:uiPriority="37" w:unhideWhenUsed="1"/>
+    <w:lsdException w:name="TOC Heading" w:semiHidden="1" w:uiPriority="39" w:unhideWhenUsed="1" w:qFormat="1"/>
+    <w:lsdException w:name="Plain Table 1" w:uiPriority="41"/>
+    <w:lsdException w:name="Plain Table 2" w:uiPriority="42"/>
+    <w:lsdException w:name="Plain Table 3" w:uiPriority="43"/>
+    <w:lsdException w:name="Plain Table 4" w:uiPriority="44"/>
+    <w:lsdException w:name="Plain Table 5" w:uiPriority="45"/>
+    <w:lsdException w:name="Grid Table Light" w:uiPriority="40"/>
+    <w:lsdException w:name="Grid Table 1 Light" w:uiPriority="46"/>
+    <w:lsdException w:name="Grid Table 2" w:uiPriority="47"/>
+    <w:lsdException w:name="Grid Table 3" w:uiPriority="48"/>
+    <w:lsdException w:name="Grid Table 4" w:uiPriority="49"/>
+    <w:lsdException w:name="Grid Table 5 Dark" w:uiPriority="50"/>
+    <w:lsdException w:name="Grid Table 6 Colorful" w:uiPriority="51"/>
+    <w:lsdException w:name="Grid Table 7 Colorful" w:uiPriority="52"/>
+    <w:lsdException w:name="Grid Table 1 Light Accent 1" w:uiPriority="46"/>
+    <w:lsdException w:name="Grid Table 2 Accent 1" w:uiPriority="47"/>
+    <w:lsdException w:name="Grid Table 3 Accent 1" w:uiPriority="48"/>
+    <w:lsdException w:name="Grid Table 4 Accent 1" w:uiPriority="49"/>
+    <w:lsdException w:name="Grid Table 5 Dark Accent 1" w:uiPriority="50"/>
+    <w:lsdException w:name="Grid Table 6 Colorful Accent 1" w:uiPriority="51"/>
+    <w:lsdException w:name="Grid Table 7 Colorful Accent 1" w:uiPriority="52"/>
+    <w:lsdException w:name="Grid Table 1 Light Accent 2" w:uiPriority="46"/>
+    <w:lsdException w:name="Grid Table 2 Accent 2" w:uiPriority="47"/>
+    <w:lsdException w:name="Grid Table 3 Accent 2" w:uiPriority="48"/>
+    <w:lsdException w:name="Grid Table 4 Accent 2" w:uiPriority="49"/>
+    <w:lsdException w:name="Grid Table 5 Dark Accent 2" w:uiPriority="50"/>
+    <w:lsdException w:name="Grid Table 6 Colorful Accent 2" w:uiPriority="51"/>
+    <w:lsdException w:name="Grid Table 7 Colorful Accent 2" w:uiPriority="52"/>
+    <w:lsdException w:name="Grid Table 1 Light Accent 3" w:uiPriority="46"/>
+    <w:lsdException w:name="Grid Table 2 Accent 3" w:uiPriority="47"/>
+    <w:lsdException w:name="Grid Table 3 Accent 3" w:uiPriority="48"/>
+    <w:lsdException w:name="Grid Table 4 Accent 3" w:uiPriority="49"/>
+    <w:lsdException w:name="Grid Table 5 Dark Accent 3" w:uiPriority="50"/>
+    <w:lsdException w:name="Grid Table 6 Colorful Accent 3" w:uiPriority="51"/>
+    <w:lsdException w:name="Grid Table 7 Colorful Accent 3" w:uiPriority="52"/>
+    <w:lsdException w:name="Grid Table 1 Light Accent 4" w:uiPriority="46"/>
+    <w:lsdException w:name="Grid Table 2 Accent 4" w:uiPriority="47"/>
+    <w:lsdException w:name="Grid Table 3 Accent 4" w:uiPriority="48"/>
+    <w:lsdException w:name="Grid Table 4 Accent 4" w:uiPriority="49"/>
+    <w:lsdException w:name="Grid Table 5 Dark Accent 4" w:uiPriority="50"/>
+    <w:lsdException w:name="Grid Table 6 Colorful Accent 4" w:uiPriority="51"/>
+    <w:lsdException w:name="Grid Table 7 Colorful Accent 4" w:uiPriority="52"/>
+    <w:lsdException w:name="Grid Table 1 Light Accent 5" w:uiPriority="46"/>
+    <w:lsdException w:name="Grid Table 2 Accent 5" w:uiPriority="47"/>
+    <w:lsdException w:name="Grid Table 3 Accent 5" w:uiPriority="48"/>
+    <w:lsdException w:name="Grid Table 4 Accent 5" w:uiPriority="49"/>
+    <w:lsdException w:name="Grid Table 5 Dark Accent 5" w:uiPriority="50"/>
+    <w:lsdException w:name="Grid Table 6 Colorful Accent 5" w:uiPriority="51"/>
+    <w:lsdException w:name="Grid Table 7 Colorful Accent 5" w:uiPriority="52"/>
+    <w:lsdException w:name="Grid Table 1 Light Accent 6" w:uiPriority="46"/>
+    <w:lsdException w:name="Grid Table 2 Accent 6" w:uiPriority="47"/>
+    <w:lsdException w:name="Grid Table 3 Accent 6" w:uiPriority="48"/>
+    <w:lsdException w:name="Grid Table 4 Accent 6" w:uiPriority="49"/>
+    <w:lsdException w:name="Grid Table 5 Dark Accent 6" w:uiPriority="50"/>
+    <w:lsdException w:name="Grid Table 6 Colorful Accent 6" w:uiPriority="51"/>
+    <w:lsdException w:name="Grid Table 7 Colorful Accent 6" w:uiPriority="52"/>
+    <w:lsdException w:name="List Table 1 Light" w:uiPriority="46"/>
+    <w:lsdException w:name="List Table 2" w:uiPriority="47"/>
+    <w:lsdException w:name="List Table 3" w:uiPriority="48"/>
+    <w:lsdException w:name="List Table 4" w:uiPriority="49"/>
+    <w:lsdException w:name="List Table 5 Dark" w:uiPriority="50"/>
+    <w:lsdException w:name="List Table 6 Colorful" w:uiPriority="51"/>
+    <w:lsdException w:name="List Table 7 Colorful" w:uiPriority="52"/>
+    <w:lsdException w:name="List Table 1 Light Accent 1" w:uiPriority="46"/>
+    <w:lsdException w:name="List Table 2 Accent 1" w:uiPriority="47"/>
+    <w:lsdException w:name="List Table 3 Accent 1" w:uiPriority="48"/>
+    <w:lsdException w:name="List Table 4 Accent 1" w:uiPriority="49"/>
+    <w:lsdException w:name="List Table 5 Dark Accent 1" w:uiPriority="50"/>
+    <w:lsdException w:name="List Table 6 Colorful Accent 1" w:uiPriority="51"/>
+    <w:lsdException w:name="List Table 7 Colorful Accent 1" w:uiPriority="52"/>
+    <w:lsdException w:name="List Table 1 Light Accent 2" w:uiPriority="46"/>
+    <w:lsdException w:name="List Table 2 Accent 2" w:uiPriority="47"/>
+    <w:lsdException w:name="List Table 3 Accent 2" w:uiPriority="48"/>
+    <w:lsdException w:name="List Table 4 Accent 2" w:uiPriority="49"/>
+    <w:lsdException w:name="List Table 5 Dark Accent 2" w:uiPriority="50"/>
+    <w:lsdException w:name="List Table 6 Colorful Accent 2" w:uiPriority="51"/>
+    <w:lsdException w:name="List Table 7 Colorful Accent 2" w:uiPriority="52"/>
+    <w:lsdException w:name="List Table 1 Light Accent 3" w:uiPriority="46"/>
+    <w:lsdException w:name="List Table 2 Accent 3" w:uiPriority="47"/>
+    <w:lsdException w:name="List Table 3 Accent 3" w:uiPriority="48"/>
+    <w:lsdException w:name="List Table 4 Accent 3" w:uiPriority="49"/>
+    <w:lsdException w:name="List Table 5 Dark Accent 3" w:uiPriority="50"/>
+    <w:lsdException w:name="List Table 6 Colorful Accent 3" w:uiPriority="51"/>
+    <w:lsdException w:name="List Table 7 Colorful Accent 3" w:uiPriority="52"/>
+    <w:lsdException w:name="List Table 1 Light Accent 4" w:uiPriority="46"/>
+    <w:lsdException w:name="List Table 2 Accent 4" w:uiPriority="47"/>
+    <w:lsdException w:name="List Table 3 Accent 4" w:uiPriority="48"/>
+    <w:lsdException w:name="List Table 4 Accent 4" w:uiPriority="49"/>
+    <w:lsdException w:name="List Table 5 Dark Accent 4" w:uiPriority="50"/>
+    <w:lsdException w:name="List Table 6 Colorful Accent 4" w:uiPriority="51"/>
+    <w:lsdException w:name="List Table 7 Colorful Accent 4" w:uiPriority="52"/>
+    <w:lsdException w:name="List Table 1 Light Accent 5" w:uiPriority="46"/>
+    <w:lsdException w:name="List Table 2 Accent 5" w:uiPriority="47"/>
+    <w:lsdException w:name="List Table 3 Accent 5" w:uiPriority="48"/>
+    <w:lsdException w:name="List Table 4 Accent 5" w:uiPriority="49"/>
+    <w:lsdException w:name="List Table 5 Dark Accent 5" w:uiPriority="50"/>
+    <w:lsdException w:name="List Table 6 Colorful Accent 5" w:uiPriority="51"/>
+    <w:lsdException w:name="List Table 7 Colorful Accent 5" w:uiPriority="52"/>
+    <w:lsdException w:name="List Table 1 Light Accent 6" w:uiPriority="46"/>
+    <w:lsdException w:name="List Table 2 Accent 6" w:uiPriority="47"/>
+    <w:lsdException w:name="List Table 3 Accent 6" w:uiPriority="48"/>
+    <w:lsdException w:name="List Table 4 Accent 6" w:uiPriority="49"/>
+    <w:lsdException w:name="List Table 5 Dark Accent 6" w:uiPriority="50"/>
+    <w:lsdException w:name="List Table 6 Colorful Accent 6" w:uiPriority="51"/>
+    <w:lsdException w:name="List Table 7 Colorful Accent 6" w:uiPriority="52"/>
+    <w:lsdException w:name="Mention" w:semiHidden="1" w:unhideWhenUsed="1"/>
+    <w:lsdException w:name="Smart Hyperlink" w:semiHidden="1" w:unhideWhenUsed="1"/>
+    <w:lsdException w:name="Hashtag" w:semiHidden="1" w:unhideWhenUsed="1"/>
+    <w:lsdException w:name="Unresolved Mention" w:semiHidden="1" w:unhideWhenUsed="1"/>
+    <w:lsdException w:name="Smart Link" w:semiHidden="1" w:unhideWhenUsed="1"/>
   </w:latentStyles>
   <w:style w:type="paragraph" w:default="1" w:styleId="Normal">
     <w:name w:val="Normal"/>
@@ -2507,7 +2784,6 @@
     <w:uiPriority w:val="99"/>
     <w:semiHidden/>
     <w:unhideWhenUsed/>
-    <w:qFormat/>
     <w:tblPr>
       <w:tblInd w:w="0" w:type="dxa"/>
       <w:tblCellMar>
@@ -2718,7 +2994,6 @@
     <w:uiPriority w:val="59"/>
     <w:rsid w:val="00085B87"/>
     <w:tblPr>
-      <w:tblInd w:w="0" w:type="dxa"/>
       <w:tblBorders>
         <w:top w:val="single" w:sz="4" w:space="0" w:color="000000" w:themeColor="text1"/>
         <w:left w:val="single" w:sz="4" w:space="0" w:color="000000" w:themeColor="text1"/>
@@ -2727,12 +3002,6 @@
         <w:insideH w:val="single" w:sz="4" w:space="0" w:color="000000" w:themeColor="text1"/>
         <w:insideV w:val="single" w:sz="4" w:space="0" w:color="000000" w:themeColor="text1"/>
       </w:tblBorders>
-      <w:tblCellMar>
-        <w:top w:w="0" w:type="dxa"/>
-        <w:left w:w="108" w:type="dxa"/>
-        <w:bottom w:w="0" w:type="dxa"/>
-        <w:right w:w="108" w:type="dxa"/>
-      </w:tblCellMar>
     </w:tblPr>
   </w:style>
   <w:style w:type="character" w:styleId="FollowedHyperlink">

</xml_diff>